<commit_message>
update report docx with role c section
</commit_message>
<xml_diff>
--- a/REPORT.docx
+++ b/REPORT.docx
@@ -336,6 +336,12 @@
     <w:sdt>
       <w:sdtPr>
         <w:rPr>
+          <w:rFonts w:ascii="Calibri" w:eastAsiaTheme="minorEastAsia" w:hAnsi="Calibri" w:cstheme="minorBidi"/>
+          <w:b w:val="0"/>
+          <w:bCs w:val="0"/>
+          <w:color w:val="auto"/>
+          <w:sz w:val="20"/>
+          <w:szCs w:val="22"/>
           <w:lang w:val="tr-TR"/>
         </w:rPr>
         <w:id w:val="1000166712"/>
@@ -346,10 +352,6 @@
       </w:sdtPr>
       <w:sdtEndPr>
         <w:rPr>
-          <w:rFonts w:ascii="Calibri" w:eastAsiaTheme="minorEastAsia" w:hAnsi="Calibri" w:cstheme="minorBidi"/>
-          <w:color w:val="auto"/>
-          <w:sz w:val="20"/>
-          <w:szCs w:val="22"/>
           <w:lang w:val="en-US"/>
         </w:rPr>
       </w:sdtEndPr>
@@ -7319,6 +7321,9 @@
         <w:spacing w:after="80"/>
         <w:rPr>
           <w:rFonts w:ascii="Times New Roman" w:hAnsi="Times New Roman" w:cs="Times New Roman"/>
+          <w:b/>
+          <w:bCs/>
+          <w:lang w:val="tr-TR"/>
         </w:rPr>
       </w:pPr>
       <w:r>
@@ -7327,6 +7332,2529 @@
         </w:rPr>
         <w:t>This ablation shows that structured action masking is a key component of the final learned policy. The neural network alone learned useful behavior, but teacher-style masking was necessary to convert it into a baseline-beating dispatch policy.</w:t>
       </w:r>
+      <w:r>
+        <w:rPr>
+          <w:rFonts w:ascii="Times New Roman" w:hAnsi="Times New Roman" w:cs="Times New Roman"/>
+        </w:rPr>
+        <w:br/>
+      </w:r>
+    </w:p>
+    <w:p>
+      <w:pPr>
+        <w:spacing w:after="80"/>
+        <w:rPr>
+          <w:rFonts w:ascii="Times New Roman" w:hAnsi="Times New Roman" w:cs="Times New Roman"/>
+          <w:b/>
+          <w:bCs/>
+          <w:lang w:val="tr-TR"/>
+        </w:rPr>
+      </w:pPr>
+      <w:r>
+        <w:rPr>
+          <w:rFonts w:ascii="Times New Roman" w:hAnsi="Times New Roman" w:cs="Times New Roman"/>
+          <w:b/>
+          <w:bCs/>
+          <w:lang w:val="tr-TR"/>
+        </w:rPr>
+        <w:t>9A. Planning-</w:t>
+      </w:r>
+      <w:proofErr w:type="spellStart"/>
+      <w:r>
+        <w:rPr>
+          <w:rFonts w:ascii="Times New Roman" w:hAnsi="Times New Roman" w:cs="Times New Roman"/>
+          <w:b/>
+          <w:bCs/>
+          <w:lang w:val="tr-TR"/>
+        </w:rPr>
+        <w:t>Based</w:t>
+      </w:r>
+      <w:proofErr w:type="spellEnd"/>
+      <w:r>
+        <w:rPr>
+          <w:rFonts w:ascii="Times New Roman" w:hAnsi="Times New Roman" w:cs="Times New Roman"/>
+          <w:b/>
+          <w:bCs/>
+          <w:lang w:val="tr-TR"/>
+        </w:rPr>
+        <w:t xml:space="preserve"> </w:t>
+      </w:r>
+      <w:proofErr w:type="spellStart"/>
+      <w:r>
+        <w:rPr>
+          <w:rFonts w:ascii="Times New Roman" w:hAnsi="Times New Roman" w:cs="Times New Roman"/>
+          <w:b/>
+          <w:bCs/>
+          <w:lang w:val="tr-TR"/>
+        </w:rPr>
+        <w:t>Dispatch</w:t>
+      </w:r>
+      <w:proofErr w:type="spellEnd"/>
+      <w:r>
+        <w:rPr>
+          <w:rFonts w:ascii="Times New Roman" w:hAnsi="Times New Roman" w:cs="Times New Roman"/>
+          <w:b/>
+          <w:bCs/>
+          <w:lang w:val="tr-TR"/>
+        </w:rPr>
+        <w:t xml:space="preserve"> </w:t>
+      </w:r>
+      <w:proofErr w:type="spellStart"/>
+      <w:r>
+        <w:rPr>
+          <w:rFonts w:ascii="Times New Roman" w:hAnsi="Times New Roman" w:cs="Times New Roman"/>
+          <w:b/>
+          <w:bCs/>
+          <w:lang w:val="tr-TR"/>
+        </w:rPr>
+        <w:t>Policy</w:t>
+      </w:r>
+      <w:proofErr w:type="spellEnd"/>
+      <w:r>
+        <w:rPr>
+          <w:rFonts w:ascii="Times New Roman" w:hAnsi="Times New Roman" w:cs="Times New Roman"/>
+          <w:b/>
+          <w:bCs/>
+          <w:lang w:val="tr-TR"/>
+        </w:rPr>
+        <w:t xml:space="preserve"> (Role C)</w:t>
+      </w:r>
+    </w:p>
+    <w:p>
+      <w:pPr>
+        <w:spacing w:after="80"/>
+        <w:rPr>
+          <w:rFonts w:ascii="Times New Roman" w:hAnsi="Times New Roman" w:cs="Times New Roman"/>
+          <w:lang w:val="tr-TR"/>
+        </w:rPr>
+      </w:pPr>
+      <w:r>
+        <w:rPr>
+          <w:rFonts w:ascii="Times New Roman" w:hAnsi="Times New Roman" w:cs="Times New Roman"/>
+          <w:lang w:val="tr-TR"/>
+        </w:rPr>
+        <w:t xml:space="preserve">As </w:t>
+      </w:r>
+      <w:proofErr w:type="spellStart"/>
+      <w:r>
+        <w:rPr>
+          <w:rFonts w:ascii="Times New Roman" w:hAnsi="Times New Roman" w:cs="Times New Roman"/>
+          <w:lang w:val="tr-TR"/>
+        </w:rPr>
+        <w:t>the</w:t>
+      </w:r>
+      <w:proofErr w:type="spellEnd"/>
+      <w:r>
+        <w:rPr>
+          <w:rFonts w:ascii="Times New Roman" w:hAnsi="Times New Roman" w:cs="Times New Roman"/>
+          <w:lang w:val="tr-TR"/>
+        </w:rPr>
+        <w:t xml:space="preserve"> </w:t>
+      </w:r>
+      <w:proofErr w:type="spellStart"/>
+      <w:r>
+        <w:rPr>
+          <w:rFonts w:ascii="Times New Roman" w:hAnsi="Times New Roman" w:cs="Times New Roman"/>
+          <w:lang w:val="tr-TR"/>
+        </w:rPr>
+        <w:t>planning-method</w:t>
+      </w:r>
+      <w:proofErr w:type="spellEnd"/>
+      <w:r>
+        <w:rPr>
+          <w:rFonts w:ascii="Times New Roman" w:hAnsi="Times New Roman" w:cs="Times New Roman"/>
+          <w:lang w:val="tr-TR"/>
+        </w:rPr>
+        <w:t xml:space="preserve"> </w:t>
+      </w:r>
+      <w:proofErr w:type="spellStart"/>
+      <w:r>
+        <w:rPr>
+          <w:rFonts w:ascii="Times New Roman" w:hAnsi="Times New Roman" w:cs="Times New Roman"/>
+          <w:lang w:val="tr-TR"/>
+        </w:rPr>
+        <w:t>contribution</w:t>
+      </w:r>
+      <w:proofErr w:type="spellEnd"/>
+      <w:r>
+        <w:rPr>
+          <w:rFonts w:ascii="Times New Roman" w:hAnsi="Times New Roman" w:cs="Times New Roman"/>
+          <w:lang w:val="tr-TR"/>
+        </w:rPr>
+        <w:t xml:space="preserve">, a </w:t>
+      </w:r>
+      <w:proofErr w:type="spellStart"/>
+      <w:r>
+        <w:rPr>
+          <w:rFonts w:ascii="Times New Roman" w:hAnsi="Times New Roman" w:cs="Times New Roman"/>
+          <w:lang w:val="tr-TR"/>
+        </w:rPr>
+        <w:t>planning-inspired</w:t>
+      </w:r>
+      <w:proofErr w:type="spellEnd"/>
+      <w:r>
+        <w:rPr>
+          <w:rFonts w:ascii="Times New Roman" w:hAnsi="Times New Roman" w:cs="Times New Roman"/>
+          <w:lang w:val="tr-TR"/>
+        </w:rPr>
+        <w:t xml:space="preserve"> </w:t>
+      </w:r>
+      <w:proofErr w:type="spellStart"/>
+      <w:r>
+        <w:rPr>
+          <w:rFonts w:ascii="Times New Roman" w:hAnsi="Times New Roman" w:cs="Times New Roman"/>
+          <w:lang w:val="tr-TR"/>
+        </w:rPr>
+        <w:t>dispatch</w:t>
+      </w:r>
+      <w:proofErr w:type="spellEnd"/>
+      <w:r>
+        <w:rPr>
+          <w:rFonts w:ascii="Times New Roman" w:hAnsi="Times New Roman" w:cs="Times New Roman"/>
+          <w:lang w:val="tr-TR"/>
+        </w:rPr>
+        <w:t xml:space="preserve"> </w:t>
+      </w:r>
+      <w:proofErr w:type="spellStart"/>
+      <w:r>
+        <w:rPr>
+          <w:rFonts w:ascii="Times New Roman" w:hAnsi="Times New Roman" w:cs="Times New Roman"/>
+          <w:lang w:val="tr-TR"/>
+        </w:rPr>
+        <w:t>policy</w:t>
+      </w:r>
+      <w:proofErr w:type="spellEnd"/>
+      <w:r>
+        <w:rPr>
+          <w:rFonts w:ascii="Times New Roman" w:hAnsi="Times New Roman" w:cs="Times New Roman"/>
+          <w:lang w:val="tr-TR"/>
+        </w:rPr>
+        <w:t xml:space="preserve"> </w:t>
+      </w:r>
+      <w:proofErr w:type="spellStart"/>
+      <w:r>
+        <w:rPr>
+          <w:rFonts w:ascii="Times New Roman" w:hAnsi="Times New Roman" w:cs="Times New Roman"/>
+          <w:lang w:val="tr-TR"/>
+        </w:rPr>
+        <w:t>was</w:t>
+      </w:r>
+      <w:proofErr w:type="spellEnd"/>
+      <w:r>
+        <w:rPr>
+          <w:rFonts w:ascii="Times New Roman" w:hAnsi="Times New Roman" w:cs="Times New Roman"/>
+          <w:lang w:val="tr-TR"/>
+        </w:rPr>
+        <w:t xml:space="preserve"> </w:t>
+      </w:r>
+      <w:proofErr w:type="spellStart"/>
+      <w:r>
+        <w:rPr>
+          <w:rFonts w:ascii="Times New Roman" w:hAnsi="Times New Roman" w:cs="Times New Roman"/>
+          <w:lang w:val="tr-TR"/>
+        </w:rPr>
+        <w:t>developed</w:t>
+      </w:r>
+      <w:proofErr w:type="spellEnd"/>
+      <w:r>
+        <w:rPr>
+          <w:rFonts w:ascii="Times New Roman" w:hAnsi="Times New Roman" w:cs="Times New Roman"/>
+          <w:lang w:val="tr-TR"/>
+        </w:rPr>
+        <w:t xml:space="preserve"> </w:t>
+      </w:r>
+      <w:proofErr w:type="spellStart"/>
+      <w:r>
+        <w:rPr>
+          <w:rFonts w:ascii="Times New Roman" w:hAnsi="Times New Roman" w:cs="Times New Roman"/>
+          <w:lang w:val="tr-TR"/>
+        </w:rPr>
+        <w:t>based</w:t>
+      </w:r>
+      <w:proofErr w:type="spellEnd"/>
+      <w:r>
+        <w:rPr>
+          <w:rFonts w:ascii="Times New Roman" w:hAnsi="Times New Roman" w:cs="Times New Roman"/>
+          <w:lang w:val="tr-TR"/>
+        </w:rPr>
+        <w:t xml:space="preserve"> on </w:t>
+      </w:r>
+      <w:proofErr w:type="spellStart"/>
+      <w:r>
+        <w:rPr>
+          <w:rFonts w:ascii="Times New Roman" w:hAnsi="Times New Roman" w:cs="Times New Roman"/>
+          <w:lang w:val="tr-TR"/>
+        </w:rPr>
+        <w:t>route-aware</w:t>
+      </w:r>
+      <w:proofErr w:type="spellEnd"/>
+      <w:r>
+        <w:rPr>
+          <w:rFonts w:ascii="Times New Roman" w:hAnsi="Times New Roman" w:cs="Times New Roman"/>
+          <w:lang w:val="tr-TR"/>
+        </w:rPr>
+        <w:t xml:space="preserve"> </w:t>
+      </w:r>
+      <w:proofErr w:type="spellStart"/>
+      <w:r>
+        <w:rPr>
+          <w:rFonts w:ascii="Times New Roman" w:hAnsi="Times New Roman" w:cs="Times New Roman"/>
+          <w:lang w:val="tr-TR"/>
+        </w:rPr>
+        <w:t>assignment</w:t>
+      </w:r>
+      <w:proofErr w:type="spellEnd"/>
+      <w:r>
+        <w:rPr>
+          <w:rFonts w:ascii="Times New Roman" w:hAnsi="Times New Roman" w:cs="Times New Roman"/>
+          <w:lang w:val="tr-TR"/>
+        </w:rPr>
+        <w:t xml:space="preserve"> </w:t>
+      </w:r>
+      <w:proofErr w:type="spellStart"/>
+      <w:r>
+        <w:rPr>
+          <w:rFonts w:ascii="Times New Roman" w:hAnsi="Times New Roman" w:cs="Times New Roman"/>
+          <w:lang w:val="tr-TR"/>
+        </w:rPr>
+        <w:t>scoring</w:t>
+      </w:r>
+      <w:proofErr w:type="spellEnd"/>
+      <w:r>
+        <w:rPr>
+          <w:rFonts w:ascii="Times New Roman" w:hAnsi="Times New Roman" w:cs="Times New Roman"/>
+          <w:lang w:val="tr-TR"/>
+        </w:rPr>
+        <w:t>.</w:t>
+      </w:r>
+    </w:p>
+    <w:p>
+      <w:pPr>
+        <w:spacing w:after="80"/>
+        <w:rPr>
+          <w:rFonts w:ascii="Times New Roman" w:hAnsi="Times New Roman" w:cs="Times New Roman"/>
+          <w:lang w:val="tr-TR"/>
+        </w:rPr>
+      </w:pPr>
+      <w:proofErr w:type="spellStart"/>
+      <w:r>
+        <w:rPr>
+          <w:rFonts w:ascii="Times New Roman" w:hAnsi="Times New Roman" w:cs="Times New Roman"/>
+          <w:lang w:val="tr-TR"/>
+        </w:rPr>
+        <w:t>Unlike</w:t>
+      </w:r>
+      <w:proofErr w:type="spellEnd"/>
+      <w:r>
+        <w:rPr>
+          <w:rFonts w:ascii="Times New Roman" w:hAnsi="Times New Roman" w:cs="Times New Roman"/>
+          <w:lang w:val="tr-TR"/>
+        </w:rPr>
+        <w:t xml:space="preserve"> </w:t>
+      </w:r>
+      <w:proofErr w:type="spellStart"/>
+      <w:r>
+        <w:rPr>
+          <w:rFonts w:ascii="Times New Roman" w:hAnsi="Times New Roman" w:cs="Times New Roman"/>
+          <w:lang w:val="tr-TR"/>
+        </w:rPr>
+        <w:t>the</w:t>
+      </w:r>
+      <w:proofErr w:type="spellEnd"/>
+      <w:r>
+        <w:rPr>
+          <w:rFonts w:ascii="Times New Roman" w:hAnsi="Times New Roman" w:cs="Times New Roman"/>
+          <w:lang w:val="tr-TR"/>
+        </w:rPr>
+        <w:t xml:space="preserve"> </w:t>
+      </w:r>
+      <w:proofErr w:type="spellStart"/>
+      <w:r>
+        <w:rPr>
+          <w:rFonts w:ascii="Times New Roman" w:hAnsi="Times New Roman" w:cs="Times New Roman"/>
+          <w:lang w:val="tr-TR"/>
+        </w:rPr>
+        <w:t>improved</w:t>
+      </w:r>
+      <w:proofErr w:type="spellEnd"/>
+      <w:r>
+        <w:rPr>
+          <w:rFonts w:ascii="Times New Roman" w:hAnsi="Times New Roman" w:cs="Times New Roman"/>
+          <w:lang w:val="tr-TR"/>
+        </w:rPr>
+        <w:t xml:space="preserve"> </w:t>
+      </w:r>
+      <w:proofErr w:type="spellStart"/>
+      <w:r>
+        <w:rPr>
+          <w:rFonts w:ascii="Times New Roman" w:hAnsi="Times New Roman" w:cs="Times New Roman"/>
+          <w:lang w:val="tr-TR"/>
+        </w:rPr>
+        <w:t>greedy</w:t>
+      </w:r>
+      <w:proofErr w:type="spellEnd"/>
+      <w:r>
+        <w:rPr>
+          <w:rFonts w:ascii="Times New Roman" w:hAnsi="Times New Roman" w:cs="Times New Roman"/>
+          <w:lang w:val="tr-TR"/>
+        </w:rPr>
+        <w:t xml:space="preserve"> </w:t>
+      </w:r>
+      <w:proofErr w:type="spellStart"/>
+      <w:r>
+        <w:rPr>
+          <w:rFonts w:ascii="Times New Roman" w:hAnsi="Times New Roman" w:cs="Times New Roman"/>
+          <w:lang w:val="tr-TR"/>
+        </w:rPr>
+        <w:t>baseline</w:t>
+      </w:r>
+      <w:proofErr w:type="spellEnd"/>
+      <w:r>
+        <w:rPr>
+          <w:rFonts w:ascii="Times New Roman" w:hAnsi="Times New Roman" w:cs="Times New Roman"/>
+          <w:lang w:val="tr-TR"/>
+        </w:rPr>
+        <w:t xml:space="preserve">, </w:t>
+      </w:r>
+      <w:proofErr w:type="spellStart"/>
+      <w:r>
+        <w:rPr>
+          <w:rFonts w:ascii="Times New Roman" w:hAnsi="Times New Roman" w:cs="Times New Roman"/>
+          <w:lang w:val="tr-TR"/>
+        </w:rPr>
+        <w:t>the</w:t>
+      </w:r>
+      <w:proofErr w:type="spellEnd"/>
+      <w:r>
+        <w:rPr>
+          <w:rFonts w:ascii="Times New Roman" w:hAnsi="Times New Roman" w:cs="Times New Roman"/>
+          <w:lang w:val="tr-TR"/>
+        </w:rPr>
+        <w:t xml:space="preserve"> </w:t>
+      </w:r>
+      <w:proofErr w:type="spellStart"/>
+      <w:r>
+        <w:rPr>
+          <w:rFonts w:ascii="Times New Roman" w:hAnsi="Times New Roman" w:cs="Times New Roman"/>
+          <w:lang w:val="tr-TR"/>
+        </w:rPr>
+        <w:t>planning</w:t>
+      </w:r>
+      <w:proofErr w:type="spellEnd"/>
+      <w:r>
+        <w:rPr>
+          <w:rFonts w:ascii="Times New Roman" w:hAnsi="Times New Roman" w:cs="Times New Roman"/>
+          <w:lang w:val="tr-TR"/>
+        </w:rPr>
+        <w:t xml:space="preserve"> </w:t>
+      </w:r>
+      <w:proofErr w:type="spellStart"/>
+      <w:r>
+        <w:rPr>
+          <w:rFonts w:ascii="Times New Roman" w:hAnsi="Times New Roman" w:cs="Times New Roman"/>
+          <w:lang w:val="tr-TR"/>
+        </w:rPr>
+        <w:t>policy</w:t>
+      </w:r>
+      <w:proofErr w:type="spellEnd"/>
+      <w:r>
+        <w:rPr>
+          <w:rFonts w:ascii="Times New Roman" w:hAnsi="Times New Roman" w:cs="Times New Roman"/>
+          <w:lang w:val="tr-TR"/>
+        </w:rPr>
+        <w:t xml:space="preserve"> </w:t>
+      </w:r>
+      <w:proofErr w:type="spellStart"/>
+      <w:r>
+        <w:rPr>
+          <w:rFonts w:ascii="Times New Roman" w:hAnsi="Times New Roman" w:cs="Times New Roman"/>
+          <w:lang w:val="tr-TR"/>
+        </w:rPr>
+        <w:t>evaluates</w:t>
+      </w:r>
+      <w:proofErr w:type="spellEnd"/>
+      <w:r>
+        <w:rPr>
+          <w:rFonts w:ascii="Times New Roman" w:hAnsi="Times New Roman" w:cs="Times New Roman"/>
+          <w:lang w:val="tr-TR"/>
+        </w:rPr>
+        <w:t xml:space="preserve"> </w:t>
+      </w:r>
+      <w:proofErr w:type="spellStart"/>
+      <w:r>
+        <w:rPr>
+          <w:rFonts w:ascii="Times New Roman" w:hAnsi="Times New Roman" w:cs="Times New Roman"/>
+          <w:lang w:val="tr-TR"/>
+        </w:rPr>
+        <w:t>each</w:t>
+      </w:r>
+      <w:proofErr w:type="spellEnd"/>
+      <w:r>
+        <w:rPr>
+          <w:rFonts w:ascii="Times New Roman" w:hAnsi="Times New Roman" w:cs="Times New Roman"/>
+          <w:lang w:val="tr-TR"/>
+        </w:rPr>
+        <w:t xml:space="preserve"> </w:t>
+      </w:r>
+      <w:proofErr w:type="spellStart"/>
+      <w:r>
+        <w:rPr>
+          <w:rFonts w:ascii="Times New Roman" w:hAnsi="Times New Roman" w:cs="Times New Roman"/>
+          <w:lang w:val="tr-TR"/>
+        </w:rPr>
+        <w:t>valid</w:t>
+      </w:r>
+      <w:proofErr w:type="spellEnd"/>
+      <w:r>
+        <w:rPr>
+          <w:rFonts w:ascii="Times New Roman" w:hAnsi="Times New Roman" w:cs="Times New Roman"/>
+          <w:lang w:val="tr-TR"/>
+        </w:rPr>
+        <w:t xml:space="preserve"> </w:t>
+      </w:r>
+      <w:proofErr w:type="spellStart"/>
+      <w:r>
+        <w:rPr>
+          <w:rFonts w:ascii="Times New Roman" w:hAnsi="Times New Roman" w:cs="Times New Roman"/>
+          <w:lang w:val="tr-TR"/>
+        </w:rPr>
+        <w:t>assignment</w:t>
+      </w:r>
+      <w:proofErr w:type="spellEnd"/>
+      <w:r>
+        <w:rPr>
+          <w:rFonts w:ascii="Times New Roman" w:hAnsi="Times New Roman" w:cs="Times New Roman"/>
+          <w:lang w:val="tr-TR"/>
+        </w:rPr>
+        <w:t xml:space="preserve"> </w:t>
+      </w:r>
+      <w:proofErr w:type="spellStart"/>
+      <w:r>
+        <w:rPr>
+          <w:rFonts w:ascii="Times New Roman" w:hAnsi="Times New Roman" w:cs="Times New Roman"/>
+          <w:lang w:val="tr-TR"/>
+        </w:rPr>
+        <w:t>using</w:t>
+      </w:r>
+      <w:proofErr w:type="spellEnd"/>
+      <w:r>
+        <w:rPr>
+          <w:rFonts w:ascii="Times New Roman" w:hAnsi="Times New Roman" w:cs="Times New Roman"/>
+          <w:lang w:val="tr-TR"/>
+        </w:rPr>
+        <w:t xml:space="preserve"> </w:t>
+      </w:r>
+      <w:proofErr w:type="spellStart"/>
+      <w:r>
+        <w:rPr>
+          <w:rFonts w:ascii="Times New Roman" w:hAnsi="Times New Roman" w:cs="Times New Roman"/>
+          <w:lang w:val="tr-TR"/>
+        </w:rPr>
+        <w:t>three</w:t>
+      </w:r>
+      <w:proofErr w:type="spellEnd"/>
+      <w:r>
+        <w:rPr>
+          <w:rFonts w:ascii="Times New Roman" w:hAnsi="Times New Roman" w:cs="Times New Roman"/>
+          <w:lang w:val="tr-TR"/>
+        </w:rPr>
+        <w:t xml:space="preserve"> </w:t>
+      </w:r>
+      <w:proofErr w:type="spellStart"/>
+      <w:r>
+        <w:rPr>
+          <w:rFonts w:ascii="Times New Roman" w:hAnsi="Times New Roman" w:cs="Times New Roman"/>
+          <w:lang w:val="tr-TR"/>
+        </w:rPr>
+        <w:t>components</w:t>
+      </w:r>
+      <w:proofErr w:type="spellEnd"/>
+      <w:r>
+        <w:rPr>
+          <w:rFonts w:ascii="Times New Roman" w:hAnsi="Times New Roman" w:cs="Times New Roman"/>
+          <w:lang w:val="tr-TR"/>
+        </w:rPr>
+        <w:t>:</w:t>
+      </w:r>
+    </w:p>
+    <w:p>
+      <w:pPr>
+        <w:numPr>
+          <w:ilvl w:val="0"/>
+          <w:numId w:val="15"/>
+        </w:numPr>
+        <w:spacing w:after="80"/>
+        <w:rPr>
+          <w:rFonts w:ascii="Times New Roman" w:hAnsi="Times New Roman" w:cs="Times New Roman"/>
+          <w:lang w:val="tr-TR"/>
+        </w:rPr>
+      </w:pPr>
+      <w:proofErr w:type="spellStart"/>
+      <w:r>
+        <w:rPr>
+          <w:rFonts w:ascii="Times New Roman" w:hAnsi="Times New Roman" w:cs="Times New Roman"/>
+          <w:lang w:val="tr-TR"/>
+        </w:rPr>
+        <w:t>Routed</w:t>
+      </w:r>
+      <w:proofErr w:type="spellEnd"/>
+      <w:r>
+        <w:rPr>
+          <w:rFonts w:ascii="Times New Roman" w:hAnsi="Times New Roman" w:cs="Times New Roman"/>
+          <w:lang w:val="tr-TR"/>
+        </w:rPr>
+        <w:t xml:space="preserve"> </w:t>
+      </w:r>
+      <w:proofErr w:type="spellStart"/>
+      <w:r>
+        <w:rPr>
+          <w:rFonts w:ascii="Times New Roman" w:hAnsi="Times New Roman" w:cs="Times New Roman"/>
+          <w:lang w:val="tr-TR"/>
+        </w:rPr>
+        <w:t>travel</w:t>
+      </w:r>
+      <w:proofErr w:type="spellEnd"/>
+      <w:r>
+        <w:rPr>
+          <w:rFonts w:ascii="Times New Roman" w:hAnsi="Times New Roman" w:cs="Times New Roman"/>
+          <w:lang w:val="tr-TR"/>
+        </w:rPr>
+        <w:t xml:space="preserve"> </w:t>
+      </w:r>
+      <w:proofErr w:type="spellStart"/>
+      <w:r>
+        <w:rPr>
+          <w:rFonts w:ascii="Times New Roman" w:hAnsi="Times New Roman" w:cs="Times New Roman"/>
+          <w:lang w:val="tr-TR"/>
+        </w:rPr>
+        <w:t>distance</w:t>
+      </w:r>
+      <w:proofErr w:type="spellEnd"/>
+      <w:r>
+        <w:rPr>
+          <w:rFonts w:ascii="Times New Roman" w:hAnsi="Times New Roman" w:cs="Times New Roman"/>
+          <w:lang w:val="tr-TR"/>
+        </w:rPr>
+        <w:t>.</w:t>
+      </w:r>
+    </w:p>
+    <w:p>
+      <w:pPr>
+        <w:numPr>
+          <w:ilvl w:val="0"/>
+          <w:numId w:val="15"/>
+        </w:numPr>
+        <w:spacing w:after="80"/>
+        <w:rPr>
+          <w:rFonts w:ascii="Times New Roman" w:hAnsi="Times New Roman" w:cs="Times New Roman"/>
+          <w:lang w:val="tr-TR"/>
+        </w:rPr>
+      </w:pPr>
+      <w:proofErr w:type="spellStart"/>
+      <w:r>
+        <w:rPr>
+          <w:rFonts w:ascii="Times New Roman" w:hAnsi="Times New Roman" w:cs="Times New Roman"/>
+          <w:lang w:val="tr-TR"/>
+        </w:rPr>
+        <w:t>Order</w:t>
+      </w:r>
+      <w:proofErr w:type="spellEnd"/>
+      <w:r>
+        <w:rPr>
+          <w:rFonts w:ascii="Times New Roman" w:hAnsi="Times New Roman" w:cs="Times New Roman"/>
+          <w:lang w:val="tr-TR"/>
+        </w:rPr>
+        <w:t xml:space="preserve"> </w:t>
+      </w:r>
+      <w:proofErr w:type="spellStart"/>
+      <w:r>
+        <w:rPr>
+          <w:rFonts w:ascii="Times New Roman" w:hAnsi="Times New Roman" w:cs="Times New Roman"/>
+          <w:lang w:val="tr-TR"/>
+        </w:rPr>
+        <w:t>urgency</w:t>
+      </w:r>
+      <w:proofErr w:type="spellEnd"/>
+      <w:r>
+        <w:rPr>
+          <w:rFonts w:ascii="Times New Roman" w:hAnsi="Times New Roman" w:cs="Times New Roman"/>
+          <w:lang w:val="tr-TR"/>
+        </w:rPr>
+        <w:t xml:space="preserve"> (</w:t>
+      </w:r>
+      <w:proofErr w:type="spellStart"/>
+      <w:r>
+        <w:rPr>
+          <w:rFonts w:ascii="Times New Roman" w:hAnsi="Times New Roman" w:cs="Times New Roman"/>
+          <w:lang w:val="tr-TR"/>
+        </w:rPr>
+        <w:t>waiting</w:t>
+      </w:r>
+      <w:proofErr w:type="spellEnd"/>
+      <w:r>
+        <w:rPr>
+          <w:rFonts w:ascii="Times New Roman" w:hAnsi="Times New Roman" w:cs="Times New Roman"/>
+          <w:lang w:val="tr-TR"/>
+        </w:rPr>
+        <w:t xml:space="preserve"> time).</w:t>
+      </w:r>
+    </w:p>
+    <w:p>
+      <w:pPr>
+        <w:numPr>
+          <w:ilvl w:val="0"/>
+          <w:numId w:val="15"/>
+        </w:numPr>
+        <w:spacing w:after="80"/>
+        <w:rPr>
+          <w:rFonts w:ascii="Times New Roman" w:hAnsi="Times New Roman" w:cs="Times New Roman"/>
+          <w:lang w:val="tr-TR"/>
+        </w:rPr>
+      </w:pPr>
+      <w:proofErr w:type="spellStart"/>
+      <w:r>
+        <w:rPr>
+          <w:rFonts w:ascii="Times New Roman" w:hAnsi="Times New Roman" w:cs="Times New Roman"/>
+          <w:lang w:val="tr-TR"/>
+        </w:rPr>
+        <w:t>Battery</w:t>
+      </w:r>
+      <w:proofErr w:type="spellEnd"/>
+      <w:r>
+        <w:rPr>
+          <w:rFonts w:ascii="Times New Roman" w:hAnsi="Times New Roman" w:cs="Times New Roman"/>
+          <w:lang w:val="tr-TR"/>
+        </w:rPr>
+        <w:t xml:space="preserve"> </w:t>
+      </w:r>
+      <w:proofErr w:type="spellStart"/>
+      <w:r>
+        <w:rPr>
+          <w:rFonts w:ascii="Times New Roman" w:hAnsi="Times New Roman" w:cs="Times New Roman"/>
+          <w:lang w:val="tr-TR"/>
+        </w:rPr>
+        <w:t>feasibility</w:t>
+      </w:r>
+      <w:proofErr w:type="spellEnd"/>
+      <w:r>
+        <w:rPr>
+          <w:rFonts w:ascii="Times New Roman" w:hAnsi="Times New Roman" w:cs="Times New Roman"/>
+          <w:lang w:val="tr-TR"/>
+        </w:rPr>
+        <w:t xml:space="preserve"> </w:t>
+      </w:r>
+      <w:proofErr w:type="spellStart"/>
+      <w:r>
+        <w:rPr>
+          <w:rFonts w:ascii="Times New Roman" w:hAnsi="Times New Roman" w:cs="Times New Roman"/>
+          <w:lang w:val="tr-TR"/>
+        </w:rPr>
+        <w:t>and</w:t>
+      </w:r>
+      <w:proofErr w:type="spellEnd"/>
+      <w:r>
+        <w:rPr>
+          <w:rFonts w:ascii="Times New Roman" w:hAnsi="Times New Roman" w:cs="Times New Roman"/>
+          <w:lang w:val="tr-TR"/>
+        </w:rPr>
+        <w:t xml:space="preserve"> </w:t>
+      </w:r>
+      <w:proofErr w:type="spellStart"/>
+      <w:r>
+        <w:rPr>
+          <w:rFonts w:ascii="Times New Roman" w:hAnsi="Times New Roman" w:cs="Times New Roman"/>
+          <w:lang w:val="tr-TR"/>
+        </w:rPr>
+        <w:t>depletion</w:t>
+      </w:r>
+      <w:proofErr w:type="spellEnd"/>
+      <w:r>
+        <w:rPr>
+          <w:rFonts w:ascii="Times New Roman" w:hAnsi="Times New Roman" w:cs="Times New Roman"/>
+          <w:lang w:val="tr-TR"/>
+        </w:rPr>
+        <w:t xml:space="preserve"> risk.</w:t>
+      </w:r>
+    </w:p>
+    <w:p>
+      <w:pPr>
+        <w:spacing w:after="80"/>
+        <w:rPr>
+          <w:rFonts w:ascii="Times New Roman" w:hAnsi="Times New Roman" w:cs="Times New Roman"/>
+          <w:lang w:val="tr-TR"/>
+        </w:rPr>
+      </w:pPr>
+      <w:proofErr w:type="spellStart"/>
+      <w:r>
+        <w:rPr>
+          <w:rFonts w:ascii="Times New Roman" w:hAnsi="Times New Roman" w:cs="Times New Roman"/>
+          <w:lang w:val="tr-TR"/>
+        </w:rPr>
+        <w:t>Low-battery</w:t>
+      </w:r>
+      <w:proofErr w:type="spellEnd"/>
+      <w:r>
+        <w:rPr>
+          <w:rFonts w:ascii="Times New Roman" w:hAnsi="Times New Roman" w:cs="Times New Roman"/>
+          <w:lang w:val="tr-TR"/>
+        </w:rPr>
+        <w:t xml:space="preserve"> </w:t>
+      </w:r>
+      <w:proofErr w:type="spellStart"/>
+      <w:r>
+        <w:rPr>
+          <w:rFonts w:ascii="Times New Roman" w:hAnsi="Times New Roman" w:cs="Times New Roman"/>
+          <w:lang w:val="tr-TR"/>
+        </w:rPr>
+        <w:t>drones</w:t>
+      </w:r>
+      <w:proofErr w:type="spellEnd"/>
+      <w:r>
+        <w:rPr>
+          <w:rFonts w:ascii="Times New Roman" w:hAnsi="Times New Roman" w:cs="Times New Roman"/>
+          <w:lang w:val="tr-TR"/>
+        </w:rPr>
+        <w:t xml:space="preserve"> </w:t>
+      </w:r>
+      <w:proofErr w:type="spellStart"/>
+      <w:r>
+        <w:rPr>
+          <w:rFonts w:ascii="Times New Roman" w:hAnsi="Times New Roman" w:cs="Times New Roman"/>
+          <w:lang w:val="tr-TR"/>
+        </w:rPr>
+        <w:t>are</w:t>
+      </w:r>
+      <w:proofErr w:type="spellEnd"/>
+      <w:r>
+        <w:rPr>
+          <w:rFonts w:ascii="Times New Roman" w:hAnsi="Times New Roman" w:cs="Times New Roman"/>
+          <w:lang w:val="tr-TR"/>
+        </w:rPr>
+        <w:t xml:space="preserve"> </w:t>
+      </w:r>
+      <w:proofErr w:type="spellStart"/>
+      <w:r>
+        <w:rPr>
+          <w:rFonts w:ascii="Times New Roman" w:hAnsi="Times New Roman" w:cs="Times New Roman"/>
+          <w:lang w:val="tr-TR"/>
+        </w:rPr>
+        <w:t>prioritized</w:t>
+      </w:r>
+      <w:proofErr w:type="spellEnd"/>
+      <w:r>
+        <w:rPr>
+          <w:rFonts w:ascii="Times New Roman" w:hAnsi="Times New Roman" w:cs="Times New Roman"/>
+          <w:lang w:val="tr-TR"/>
+        </w:rPr>
+        <w:t xml:space="preserve"> </w:t>
+      </w:r>
+      <w:proofErr w:type="spellStart"/>
+      <w:r>
+        <w:rPr>
+          <w:rFonts w:ascii="Times New Roman" w:hAnsi="Times New Roman" w:cs="Times New Roman"/>
+          <w:lang w:val="tr-TR"/>
+        </w:rPr>
+        <w:t>for</w:t>
+      </w:r>
+      <w:proofErr w:type="spellEnd"/>
+      <w:r>
+        <w:rPr>
+          <w:rFonts w:ascii="Times New Roman" w:hAnsi="Times New Roman" w:cs="Times New Roman"/>
+          <w:lang w:val="tr-TR"/>
+        </w:rPr>
+        <w:t xml:space="preserve"> </w:t>
+      </w:r>
+      <w:proofErr w:type="spellStart"/>
+      <w:r>
+        <w:rPr>
+          <w:rFonts w:ascii="Times New Roman" w:hAnsi="Times New Roman" w:cs="Times New Roman"/>
+          <w:lang w:val="tr-TR"/>
+        </w:rPr>
+        <w:t>charging</w:t>
+      </w:r>
+      <w:proofErr w:type="spellEnd"/>
+      <w:r>
+        <w:rPr>
+          <w:rFonts w:ascii="Times New Roman" w:hAnsi="Times New Roman" w:cs="Times New Roman"/>
+          <w:lang w:val="tr-TR"/>
+        </w:rPr>
+        <w:t xml:space="preserve"> </w:t>
+      </w:r>
+      <w:proofErr w:type="spellStart"/>
+      <w:r>
+        <w:rPr>
+          <w:rFonts w:ascii="Times New Roman" w:hAnsi="Times New Roman" w:cs="Times New Roman"/>
+          <w:lang w:val="tr-TR"/>
+        </w:rPr>
+        <w:t>before</w:t>
+      </w:r>
+      <w:proofErr w:type="spellEnd"/>
+      <w:r>
+        <w:rPr>
+          <w:rFonts w:ascii="Times New Roman" w:hAnsi="Times New Roman" w:cs="Times New Roman"/>
+          <w:lang w:val="tr-TR"/>
+        </w:rPr>
+        <w:t xml:space="preserve"> </w:t>
+      </w:r>
+      <w:proofErr w:type="spellStart"/>
+      <w:r>
+        <w:rPr>
+          <w:rFonts w:ascii="Times New Roman" w:hAnsi="Times New Roman" w:cs="Times New Roman"/>
+          <w:lang w:val="tr-TR"/>
+        </w:rPr>
+        <w:t>assignment</w:t>
+      </w:r>
+      <w:proofErr w:type="spellEnd"/>
+      <w:r>
+        <w:rPr>
+          <w:rFonts w:ascii="Times New Roman" w:hAnsi="Times New Roman" w:cs="Times New Roman"/>
+          <w:lang w:val="tr-TR"/>
+        </w:rPr>
+        <w:t xml:space="preserve"> </w:t>
+      </w:r>
+      <w:proofErr w:type="spellStart"/>
+      <w:r>
+        <w:rPr>
+          <w:rFonts w:ascii="Times New Roman" w:hAnsi="Times New Roman" w:cs="Times New Roman"/>
+          <w:lang w:val="tr-TR"/>
+        </w:rPr>
+        <w:t>decisions</w:t>
+      </w:r>
+      <w:proofErr w:type="spellEnd"/>
+      <w:r>
+        <w:rPr>
+          <w:rFonts w:ascii="Times New Roman" w:hAnsi="Times New Roman" w:cs="Times New Roman"/>
+          <w:lang w:val="tr-TR"/>
+        </w:rPr>
+        <w:t xml:space="preserve">. </w:t>
+      </w:r>
+      <w:proofErr w:type="spellStart"/>
+      <w:r>
+        <w:rPr>
+          <w:rFonts w:ascii="Times New Roman" w:hAnsi="Times New Roman" w:cs="Times New Roman"/>
+          <w:lang w:val="tr-TR"/>
+        </w:rPr>
+        <w:t>For</w:t>
+      </w:r>
+      <w:proofErr w:type="spellEnd"/>
+      <w:r>
+        <w:rPr>
+          <w:rFonts w:ascii="Times New Roman" w:hAnsi="Times New Roman" w:cs="Times New Roman"/>
+          <w:lang w:val="tr-TR"/>
+        </w:rPr>
+        <w:t xml:space="preserve"> </w:t>
+      </w:r>
+      <w:proofErr w:type="spellStart"/>
+      <w:r>
+        <w:rPr>
+          <w:rFonts w:ascii="Times New Roman" w:hAnsi="Times New Roman" w:cs="Times New Roman"/>
+          <w:lang w:val="tr-TR"/>
+        </w:rPr>
+        <w:t>dispatch</w:t>
+      </w:r>
+      <w:proofErr w:type="spellEnd"/>
+      <w:r>
+        <w:rPr>
+          <w:rFonts w:ascii="Times New Roman" w:hAnsi="Times New Roman" w:cs="Times New Roman"/>
+          <w:lang w:val="tr-TR"/>
+        </w:rPr>
+        <w:t xml:space="preserve"> </w:t>
+      </w:r>
+      <w:proofErr w:type="spellStart"/>
+      <w:r>
+        <w:rPr>
+          <w:rFonts w:ascii="Times New Roman" w:hAnsi="Times New Roman" w:cs="Times New Roman"/>
+          <w:lang w:val="tr-TR"/>
+        </w:rPr>
+        <w:t>actions</w:t>
+      </w:r>
+      <w:proofErr w:type="spellEnd"/>
+      <w:r>
+        <w:rPr>
+          <w:rFonts w:ascii="Times New Roman" w:hAnsi="Times New Roman" w:cs="Times New Roman"/>
+          <w:lang w:val="tr-TR"/>
+        </w:rPr>
+        <w:t xml:space="preserve">, </w:t>
+      </w:r>
+      <w:proofErr w:type="spellStart"/>
+      <w:r>
+        <w:rPr>
+          <w:rFonts w:ascii="Times New Roman" w:hAnsi="Times New Roman" w:cs="Times New Roman"/>
+          <w:lang w:val="tr-TR"/>
+        </w:rPr>
+        <w:t>the</w:t>
+      </w:r>
+      <w:proofErr w:type="spellEnd"/>
+      <w:r>
+        <w:rPr>
+          <w:rFonts w:ascii="Times New Roman" w:hAnsi="Times New Roman" w:cs="Times New Roman"/>
+          <w:lang w:val="tr-TR"/>
+        </w:rPr>
+        <w:t xml:space="preserve"> </w:t>
+      </w:r>
+      <w:proofErr w:type="spellStart"/>
+      <w:r>
+        <w:rPr>
+          <w:rFonts w:ascii="Times New Roman" w:hAnsi="Times New Roman" w:cs="Times New Roman"/>
+          <w:lang w:val="tr-TR"/>
+        </w:rPr>
+        <w:t>policy</w:t>
+      </w:r>
+      <w:proofErr w:type="spellEnd"/>
+      <w:r>
+        <w:rPr>
+          <w:rFonts w:ascii="Times New Roman" w:hAnsi="Times New Roman" w:cs="Times New Roman"/>
+          <w:lang w:val="tr-TR"/>
+        </w:rPr>
+        <w:t xml:space="preserve"> </w:t>
+      </w:r>
+      <w:proofErr w:type="spellStart"/>
+      <w:r>
+        <w:rPr>
+          <w:rFonts w:ascii="Times New Roman" w:hAnsi="Times New Roman" w:cs="Times New Roman"/>
+          <w:lang w:val="tr-TR"/>
+        </w:rPr>
+        <w:t>selects</w:t>
+      </w:r>
+      <w:proofErr w:type="spellEnd"/>
+      <w:r>
+        <w:rPr>
+          <w:rFonts w:ascii="Times New Roman" w:hAnsi="Times New Roman" w:cs="Times New Roman"/>
+          <w:lang w:val="tr-TR"/>
+        </w:rPr>
+        <w:t xml:space="preserve"> </w:t>
+      </w:r>
+      <w:proofErr w:type="spellStart"/>
+      <w:r>
+        <w:rPr>
+          <w:rFonts w:ascii="Times New Roman" w:hAnsi="Times New Roman" w:cs="Times New Roman"/>
+          <w:lang w:val="tr-TR"/>
+        </w:rPr>
+        <w:t>the</w:t>
+      </w:r>
+      <w:proofErr w:type="spellEnd"/>
+      <w:r>
+        <w:rPr>
+          <w:rFonts w:ascii="Times New Roman" w:hAnsi="Times New Roman" w:cs="Times New Roman"/>
+          <w:lang w:val="tr-TR"/>
+        </w:rPr>
+        <w:t xml:space="preserve"> </w:t>
+      </w:r>
+      <w:proofErr w:type="spellStart"/>
+      <w:r>
+        <w:rPr>
+          <w:rFonts w:ascii="Times New Roman" w:hAnsi="Times New Roman" w:cs="Times New Roman"/>
+          <w:lang w:val="tr-TR"/>
+        </w:rPr>
+        <w:t>assignment</w:t>
+      </w:r>
+      <w:proofErr w:type="spellEnd"/>
+      <w:r>
+        <w:rPr>
+          <w:rFonts w:ascii="Times New Roman" w:hAnsi="Times New Roman" w:cs="Times New Roman"/>
+          <w:lang w:val="tr-TR"/>
+        </w:rPr>
+        <w:t xml:space="preserve"> </w:t>
+      </w:r>
+      <w:proofErr w:type="spellStart"/>
+      <w:r>
+        <w:rPr>
+          <w:rFonts w:ascii="Times New Roman" w:hAnsi="Times New Roman" w:cs="Times New Roman"/>
+          <w:lang w:val="tr-TR"/>
+        </w:rPr>
+        <w:t>with</w:t>
+      </w:r>
+      <w:proofErr w:type="spellEnd"/>
+      <w:r>
+        <w:rPr>
+          <w:rFonts w:ascii="Times New Roman" w:hAnsi="Times New Roman" w:cs="Times New Roman"/>
+          <w:lang w:val="tr-TR"/>
+        </w:rPr>
+        <w:t xml:space="preserve"> </w:t>
+      </w:r>
+      <w:proofErr w:type="spellStart"/>
+      <w:r>
+        <w:rPr>
+          <w:rFonts w:ascii="Times New Roman" w:hAnsi="Times New Roman" w:cs="Times New Roman"/>
+          <w:lang w:val="tr-TR"/>
+        </w:rPr>
+        <w:t>the</w:t>
+      </w:r>
+      <w:proofErr w:type="spellEnd"/>
+      <w:r>
+        <w:rPr>
+          <w:rFonts w:ascii="Times New Roman" w:hAnsi="Times New Roman" w:cs="Times New Roman"/>
+          <w:lang w:val="tr-TR"/>
+        </w:rPr>
+        <w:t xml:space="preserve"> </w:t>
+      </w:r>
+      <w:proofErr w:type="spellStart"/>
+      <w:r>
+        <w:rPr>
+          <w:rFonts w:ascii="Times New Roman" w:hAnsi="Times New Roman" w:cs="Times New Roman"/>
+          <w:lang w:val="tr-TR"/>
+        </w:rPr>
+        <w:t>lowest</w:t>
+      </w:r>
+      <w:proofErr w:type="spellEnd"/>
+      <w:r>
+        <w:rPr>
+          <w:rFonts w:ascii="Times New Roman" w:hAnsi="Times New Roman" w:cs="Times New Roman"/>
+          <w:lang w:val="tr-TR"/>
+        </w:rPr>
+        <w:t xml:space="preserve"> </w:t>
+      </w:r>
+      <w:proofErr w:type="spellStart"/>
+      <w:r>
+        <w:rPr>
+          <w:rFonts w:ascii="Times New Roman" w:hAnsi="Times New Roman" w:cs="Times New Roman"/>
+          <w:lang w:val="tr-TR"/>
+        </w:rPr>
+        <w:t>planning</w:t>
+      </w:r>
+      <w:proofErr w:type="spellEnd"/>
+      <w:r>
+        <w:rPr>
+          <w:rFonts w:ascii="Times New Roman" w:hAnsi="Times New Roman" w:cs="Times New Roman"/>
+          <w:lang w:val="tr-TR"/>
+        </w:rPr>
+        <w:t xml:space="preserve"> </w:t>
+      </w:r>
+      <w:proofErr w:type="spellStart"/>
+      <w:r>
+        <w:rPr>
+          <w:rFonts w:ascii="Times New Roman" w:hAnsi="Times New Roman" w:cs="Times New Roman"/>
+          <w:lang w:val="tr-TR"/>
+        </w:rPr>
+        <w:t>score</w:t>
+      </w:r>
+      <w:proofErr w:type="spellEnd"/>
+      <w:r>
+        <w:rPr>
+          <w:rFonts w:ascii="Times New Roman" w:hAnsi="Times New Roman" w:cs="Times New Roman"/>
+          <w:lang w:val="tr-TR"/>
+        </w:rPr>
+        <w:t>.</w:t>
+      </w:r>
+    </w:p>
+    <w:p>
+      <w:pPr>
+        <w:spacing w:after="80"/>
+        <w:rPr>
+          <w:rFonts w:ascii="Times New Roman" w:hAnsi="Times New Roman" w:cs="Times New Roman"/>
+          <w:lang w:val="tr-TR"/>
+        </w:rPr>
+      </w:pPr>
+      <w:proofErr w:type="spellStart"/>
+      <w:r>
+        <w:rPr>
+          <w:rFonts w:ascii="Times New Roman" w:hAnsi="Times New Roman" w:cs="Times New Roman"/>
+          <w:lang w:val="tr-TR"/>
+        </w:rPr>
+        <w:t>The</w:t>
+      </w:r>
+      <w:proofErr w:type="spellEnd"/>
+      <w:r>
+        <w:rPr>
+          <w:rFonts w:ascii="Times New Roman" w:hAnsi="Times New Roman" w:cs="Times New Roman"/>
+          <w:lang w:val="tr-TR"/>
+        </w:rPr>
+        <w:t xml:space="preserve"> </w:t>
+      </w:r>
+      <w:proofErr w:type="spellStart"/>
+      <w:r>
+        <w:rPr>
+          <w:rFonts w:ascii="Times New Roman" w:hAnsi="Times New Roman" w:cs="Times New Roman"/>
+          <w:lang w:val="tr-TR"/>
+        </w:rPr>
+        <w:t>policy</w:t>
+      </w:r>
+      <w:proofErr w:type="spellEnd"/>
+      <w:r>
+        <w:rPr>
+          <w:rFonts w:ascii="Times New Roman" w:hAnsi="Times New Roman" w:cs="Times New Roman"/>
+          <w:lang w:val="tr-TR"/>
+        </w:rPr>
+        <w:t xml:space="preserve"> </w:t>
+      </w:r>
+      <w:proofErr w:type="spellStart"/>
+      <w:r>
+        <w:rPr>
+          <w:rFonts w:ascii="Times New Roman" w:hAnsi="Times New Roman" w:cs="Times New Roman"/>
+          <w:lang w:val="tr-TR"/>
+        </w:rPr>
+        <w:t>was</w:t>
+      </w:r>
+      <w:proofErr w:type="spellEnd"/>
+      <w:r>
+        <w:rPr>
+          <w:rFonts w:ascii="Times New Roman" w:hAnsi="Times New Roman" w:cs="Times New Roman"/>
+          <w:lang w:val="tr-TR"/>
+        </w:rPr>
+        <w:t xml:space="preserve"> </w:t>
+      </w:r>
+      <w:proofErr w:type="spellStart"/>
+      <w:r>
+        <w:rPr>
+          <w:rFonts w:ascii="Times New Roman" w:hAnsi="Times New Roman" w:cs="Times New Roman"/>
+          <w:lang w:val="tr-TR"/>
+        </w:rPr>
+        <w:t>evaluated</w:t>
+      </w:r>
+      <w:proofErr w:type="spellEnd"/>
+      <w:r>
+        <w:rPr>
+          <w:rFonts w:ascii="Times New Roman" w:hAnsi="Times New Roman" w:cs="Times New Roman"/>
+          <w:lang w:val="tr-TR"/>
+        </w:rPr>
+        <w:t xml:space="preserve"> </w:t>
+      </w:r>
+      <w:proofErr w:type="spellStart"/>
+      <w:r>
+        <w:rPr>
+          <w:rFonts w:ascii="Times New Roman" w:hAnsi="Times New Roman" w:cs="Times New Roman"/>
+          <w:lang w:val="tr-TR"/>
+        </w:rPr>
+        <w:t>using</w:t>
+      </w:r>
+      <w:proofErr w:type="spellEnd"/>
+      <w:r>
+        <w:rPr>
+          <w:rFonts w:ascii="Times New Roman" w:hAnsi="Times New Roman" w:cs="Times New Roman"/>
+          <w:lang w:val="tr-TR"/>
+        </w:rPr>
+        <w:t xml:space="preserve"> </w:t>
+      </w:r>
+      <w:proofErr w:type="spellStart"/>
+      <w:r>
+        <w:rPr>
+          <w:rFonts w:ascii="Times New Roman" w:hAnsi="Times New Roman" w:cs="Times New Roman"/>
+          <w:lang w:val="tr-TR"/>
+        </w:rPr>
+        <w:t>the</w:t>
+      </w:r>
+      <w:proofErr w:type="spellEnd"/>
+      <w:r>
+        <w:rPr>
+          <w:rFonts w:ascii="Times New Roman" w:hAnsi="Times New Roman" w:cs="Times New Roman"/>
+          <w:lang w:val="tr-TR"/>
+        </w:rPr>
+        <w:t xml:space="preserve"> </w:t>
+      </w:r>
+      <w:proofErr w:type="spellStart"/>
+      <w:r>
+        <w:rPr>
+          <w:rFonts w:ascii="Times New Roman" w:hAnsi="Times New Roman" w:cs="Times New Roman"/>
+          <w:lang w:val="tr-TR"/>
+        </w:rPr>
+        <w:t>standard</w:t>
+      </w:r>
+      <w:proofErr w:type="spellEnd"/>
+      <w:r>
+        <w:rPr>
+          <w:rFonts w:ascii="Times New Roman" w:hAnsi="Times New Roman" w:cs="Times New Roman"/>
+          <w:lang w:val="tr-TR"/>
+        </w:rPr>
+        <w:t xml:space="preserve"> </w:t>
+      </w:r>
+      <w:proofErr w:type="spellStart"/>
+      <w:r>
+        <w:rPr>
+          <w:rFonts w:ascii="Times New Roman" w:hAnsi="Times New Roman" w:cs="Times New Roman"/>
+          <w:lang w:val="tr-TR"/>
+        </w:rPr>
+        <w:t>evaluation</w:t>
+      </w:r>
+      <w:proofErr w:type="spellEnd"/>
+      <w:r>
+        <w:rPr>
+          <w:rFonts w:ascii="Times New Roman" w:hAnsi="Times New Roman" w:cs="Times New Roman"/>
+          <w:lang w:val="tr-TR"/>
+        </w:rPr>
+        <w:t xml:space="preserve"> </w:t>
+      </w:r>
+      <w:proofErr w:type="spellStart"/>
+      <w:r>
+        <w:rPr>
+          <w:rFonts w:ascii="Times New Roman" w:hAnsi="Times New Roman" w:cs="Times New Roman"/>
+          <w:lang w:val="tr-TR"/>
+        </w:rPr>
+        <w:t>configuration</w:t>
+      </w:r>
+      <w:proofErr w:type="spellEnd"/>
+      <w:r>
+        <w:rPr>
+          <w:rFonts w:ascii="Times New Roman" w:hAnsi="Times New Roman" w:cs="Times New Roman"/>
+          <w:lang w:val="tr-TR"/>
+        </w:rPr>
+        <w:t xml:space="preserve"> (</w:t>
+      </w:r>
+      <w:proofErr w:type="spellStart"/>
+      <w:r>
+        <w:rPr>
+          <w:rFonts w:ascii="Times New Roman" w:hAnsi="Times New Roman" w:cs="Times New Roman"/>
+          <w:lang w:val="tr-TR"/>
+        </w:rPr>
+        <w:t>configs</w:t>
+      </w:r>
+      <w:proofErr w:type="spellEnd"/>
+      <w:r>
+        <w:rPr>
+          <w:rFonts w:ascii="Times New Roman" w:hAnsi="Times New Roman" w:cs="Times New Roman"/>
+          <w:lang w:val="tr-TR"/>
+        </w:rPr>
+        <w:t>/</w:t>
+      </w:r>
+      <w:proofErr w:type="spellStart"/>
+      <w:r>
+        <w:rPr>
+          <w:rFonts w:ascii="Times New Roman" w:hAnsi="Times New Roman" w:cs="Times New Roman"/>
+          <w:lang w:val="tr-TR"/>
+        </w:rPr>
+        <w:t>eval_standard.yaml</w:t>
+      </w:r>
+      <w:proofErr w:type="spellEnd"/>
+      <w:r>
+        <w:rPr>
+          <w:rFonts w:ascii="Times New Roman" w:hAnsi="Times New Roman" w:cs="Times New Roman"/>
+          <w:lang w:val="tr-TR"/>
+        </w:rPr>
+        <w:t xml:space="preserve">) </w:t>
+      </w:r>
+      <w:proofErr w:type="spellStart"/>
+      <w:r>
+        <w:rPr>
+          <w:rFonts w:ascii="Times New Roman" w:hAnsi="Times New Roman" w:cs="Times New Roman"/>
+          <w:lang w:val="tr-TR"/>
+        </w:rPr>
+        <w:t>and</w:t>
+      </w:r>
+      <w:proofErr w:type="spellEnd"/>
+      <w:r>
+        <w:rPr>
+          <w:rFonts w:ascii="Times New Roman" w:hAnsi="Times New Roman" w:cs="Times New Roman"/>
+          <w:lang w:val="tr-TR"/>
+        </w:rPr>
+        <w:t xml:space="preserve"> </w:t>
+      </w:r>
+      <w:proofErr w:type="spellStart"/>
+      <w:r>
+        <w:rPr>
+          <w:rFonts w:ascii="Times New Roman" w:hAnsi="Times New Roman" w:cs="Times New Roman"/>
+          <w:lang w:val="tr-TR"/>
+        </w:rPr>
+        <w:t>evaluation</w:t>
+      </w:r>
+      <w:proofErr w:type="spellEnd"/>
+      <w:r>
+        <w:rPr>
+          <w:rFonts w:ascii="Times New Roman" w:hAnsi="Times New Roman" w:cs="Times New Roman"/>
+          <w:lang w:val="tr-TR"/>
+        </w:rPr>
+        <w:t xml:space="preserve"> </w:t>
+      </w:r>
+      <w:proofErr w:type="spellStart"/>
+      <w:r>
+        <w:rPr>
+          <w:rFonts w:ascii="Times New Roman" w:hAnsi="Times New Roman" w:cs="Times New Roman"/>
+          <w:lang w:val="tr-TR"/>
+        </w:rPr>
+        <w:t>seeds</w:t>
+      </w:r>
+      <w:proofErr w:type="spellEnd"/>
+      <w:r>
+        <w:rPr>
+          <w:rFonts w:ascii="Times New Roman" w:hAnsi="Times New Roman" w:cs="Times New Roman"/>
+          <w:lang w:val="tr-TR"/>
+        </w:rPr>
+        <w:t xml:space="preserve"> 0, 1, </w:t>
+      </w:r>
+      <w:proofErr w:type="spellStart"/>
+      <w:r>
+        <w:rPr>
+          <w:rFonts w:ascii="Times New Roman" w:hAnsi="Times New Roman" w:cs="Times New Roman"/>
+          <w:lang w:val="tr-TR"/>
+        </w:rPr>
+        <w:t>and</w:t>
+      </w:r>
+      <w:proofErr w:type="spellEnd"/>
+      <w:r>
+        <w:rPr>
+          <w:rFonts w:ascii="Times New Roman" w:hAnsi="Times New Roman" w:cs="Times New Roman"/>
+          <w:lang w:val="tr-TR"/>
+        </w:rPr>
+        <w:t xml:space="preserve"> 2.</w:t>
+      </w:r>
+    </w:p>
+    <w:tbl>
+      <w:tblPr>
+        <w:tblW w:w="0" w:type="auto"/>
+        <w:tblCellSpacing w:w="15" w:type="dxa"/>
+        <w:tblCellMar>
+          <w:top w:w="15" w:type="dxa"/>
+          <w:left w:w="15" w:type="dxa"/>
+          <w:bottom w:w="15" w:type="dxa"/>
+          <w:right w:w="15" w:type="dxa"/>
+        </w:tblCellMar>
+        <w:tblLook w:val="04A0" w:firstRow="1" w:lastRow="0" w:firstColumn="1" w:lastColumn="0" w:noHBand="0" w:noVBand="1"/>
+      </w:tblPr>
+      <w:tblGrid>
+        <w:gridCol w:w="3358"/>
+        <w:gridCol w:w="1360"/>
+        <w:gridCol w:w="1116"/>
+        <w:gridCol w:w="864"/>
+      </w:tblGrid>
+      <w:tr>
+        <w:trPr>
+          <w:tblHeader/>
+          <w:tblCellSpacing w:w="15" w:type="dxa"/>
+        </w:trPr>
+        <w:tc>
+          <w:tcPr>
+            <w:tcW w:w="0" w:type="auto"/>
+            <w:vAlign w:val="center"/>
+            <w:hideMark/>
+          </w:tcPr>
+          <w:p>
+            <w:pPr>
+              <w:spacing w:after="80"/>
+              <w:rPr>
+                <w:rFonts w:ascii="Times New Roman" w:hAnsi="Times New Roman" w:cs="Times New Roman"/>
+                <w:b/>
+                <w:bCs/>
+                <w:lang w:val="tr-TR"/>
+              </w:rPr>
+            </w:pPr>
+            <w:proofErr w:type="spellStart"/>
+            <w:r>
+              <w:rPr>
+                <w:rFonts w:ascii="Times New Roman" w:hAnsi="Times New Roman" w:cs="Times New Roman"/>
+                <w:b/>
+                <w:bCs/>
+                <w:lang w:val="tr-TR"/>
+              </w:rPr>
+              <w:t>Method</w:t>
+            </w:r>
+            <w:proofErr w:type="spellEnd"/>
+          </w:p>
+        </w:tc>
+        <w:tc>
+          <w:tcPr>
+            <w:tcW w:w="0" w:type="auto"/>
+            <w:vAlign w:val="center"/>
+            <w:hideMark/>
+          </w:tcPr>
+          <w:p>
+            <w:pPr>
+              <w:spacing w:after="80"/>
+              <w:rPr>
+                <w:rFonts w:ascii="Times New Roman" w:hAnsi="Times New Roman" w:cs="Times New Roman"/>
+                <w:b/>
+                <w:bCs/>
+                <w:lang w:val="tr-TR"/>
+              </w:rPr>
+            </w:pPr>
+            <w:proofErr w:type="spellStart"/>
+            <w:proofErr w:type="gramStart"/>
+            <w:r>
+              <w:rPr>
+                <w:rFonts w:ascii="Times New Roman" w:hAnsi="Times New Roman" w:cs="Times New Roman"/>
+                <w:b/>
+                <w:bCs/>
+                <w:lang w:val="tr-TR"/>
+              </w:rPr>
+              <w:t>cost</w:t>
+            </w:r>
+            <w:proofErr w:type="gramEnd"/>
+            <w:r>
+              <w:rPr>
+                <w:rFonts w:ascii="Times New Roman" w:hAnsi="Times New Roman" w:cs="Times New Roman"/>
+                <w:b/>
+                <w:bCs/>
+                <w:lang w:val="tr-TR"/>
+              </w:rPr>
+              <w:t>_per_order</w:t>
+            </w:r>
+            <w:proofErr w:type="spellEnd"/>
+          </w:p>
+        </w:tc>
+        <w:tc>
+          <w:tcPr>
+            <w:tcW w:w="0" w:type="auto"/>
+            <w:vAlign w:val="center"/>
+            <w:hideMark/>
+          </w:tcPr>
+          <w:p>
+            <w:pPr>
+              <w:spacing w:after="80"/>
+              <w:rPr>
+                <w:rFonts w:ascii="Times New Roman" w:hAnsi="Times New Roman" w:cs="Times New Roman"/>
+                <w:b/>
+                <w:bCs/>
+                <w:lang w:val="tr-TR"/>
+              </w:rPr>
+            </w:pPr>
+            <w:proofErr w:type="spellStart"/>
+            <w:proofErr w:type="gramStart"/>
+            <w:r>
+              <w:rPr>
+                <w:rFonts w:ascii="Times New Roman" w:hAnsi="Times New Roman" w:cs="Times New Roman"/>
+                <w:b/>
+                <w:bCs/>
+                <w:lang w:val="tr-TR"/>
+              </w:rPr>
+              <w:t>success</w:t>
+            </w:r>
+            <w:proofErr w:type="gramEnd"/>
+            <w:r>
+              <w:rPr>
+                <w:rFonts w:ascii="Times New Roman" w:hAnsi="Times New Roman" w:cs="Times New Roman"/>
+                <w:b/>
+                <w:bCs/>
+                <w:lang w:val="tr-TR"/>
+              </w:rPr>
+              <w:t>_rate</w:t>
+            </w:r>
+            <w:proofErr w:type="spellEnd"/>
+          </w:p>
+        </w:tc>
+        <w:tc>
+          <w:tcPr>
+            <w:tcW w:w="0" w:type="auto"/>
+            <w:vAlign w:val="center"/>
+            <w:hideMark/>
+          </w:tcPr>
+          <w:p>
+            <w:pPr>
+              <w:spacing w:after="80"/>
+              <w:rPr>
+                <w:rFonts w:ascii="Times New Roman" w:hAnsi="Times New Roman" w:cs="Times New Roman"/>
+                <w:b/>
+                <w:bCs/>
+                <w:lang w:val="tr-TR"/>
+              </w:rPr>
+            </w:pPr>
+            <w:proofErr w:type="spellStart"/>
+            <w:proofErr w:type="gramStart"/>
+            <w:r>
+              <w:rPr>
+                <w:rFonts w:ascii="Times New Roman" w:hAnsi="Times New Roman" w:cs="Times New Roman"/>
+                <w:b/>
+                <w:bCs/>
+                <w:lang w:val="tr-TR"/>
+              </w:rPr>
+              <w:t>delivered</w:t>
+            </w:r>
+            <w:proofErr w:type="spellEnd"/>
+            <w:proofErr w:type="gramEnd"/>
+          </w:p>
+        </w:tc>
+      </w:tr>
+      <w:tr>
+        <w:trPr>
+          <w:tblCellSpacing w:w="15" w:type="dxa"/>
+        </w:trPr>
+        <w:tc>
+          <w:tcPr>
+            <w:tcW w:w="0" w:type="auto"/>
+            <w:vAlign w:val="center"/>
+            <w:hideMark/>
+          </w:tcPr>
+          <w:p>
+            <w:pPr>
+              <w:spacing w:after="80"/>
+              <w:rPr>
+                <w:rFonts w:ascii="Times New Roman" w:hAnsi="Times New Roman" w:cs="Times New Roman"/>
+                <w:lang w:val="tr-TR"/>
+              </w:rPr>
+            </w:pPr>
+            <w:proofErr w:type="spellStart"/>
+            <w:r>
+              <w:rPr>
+                <w:rFonts w:ascii="Times New Roman" w:hAnsi="Times New Roman" w:cs="Times New Roman"/>
+                <w:lang w:val="tr-TR"/>
+              </w:rPr>
+              <w:t>Improved</w:t>
+            </w:r>
+            <w:proofErr w:type="spellEnd"/>
+            <w:r>
+              <w:rPr>
+                <w:rFonts w:ascii="Times New Roman" w:hAnsi="Times New Roman" w:cs="Times New Roman"/>
+                <w:lang w:val="tr-TR"/>
+              </w:rPr>
+              <w:t xml:space="preserve"> </w:t>
+            </w:r>
+            <w:proofErr w:type="spellStart"/>
+            <w:r>
+              <w:rPr>
+                <w:rFonts w:ascii="Times New Roman" w:hAnsi="Times New Roman" w:cs="Times New Roman"/>
+                <w:lang w:val="tr-TR"/>
+              </w:rPr>
+              <w:t>Greedy</w:t>
+            </w:r>
+            <w:proofErr w:type="spellEnd"/>
+            <w:r>
+              <w:rPr>
+                <w:rFonts w:ascii="Times New Roman" w:hAnsi="Times New Roman" w:cs="Times New Roman"/>
+                <w:lang w:val="tr-TR"/>
+              </w:rPr>
+              <w:t xml:space="preserve"> (</w:t>
+            </w:r>
+            <w:proofErr w:type="spellStart"/>
+            <w:r>
+              <w:rPr>
+                <w:rFonts w:ascii="Times New Roman" w:hAnsi="Times New Roman" w:cs="Times New Roman"/>
+                <w:lang w:val="tr-TR"/>
+              </w:rPr>
+              <w:t>default</w:t>
+            </w:r>
+            <w:proofErr w:type="spellEnd"/>
+            <w:r>
+              <w:rPr>
+                <w:rFonts w:ascii="Times New Roman" w:hAnsi="Times New Roman" w:cs="Times New Roman"/>
+                <w:lang w:val="tr-TR"/>
+              </w:rPr>
+              <w:t xml:space="preserve"> </w:t>
+            </w:r>
+            <w:proofErr w:type="spellStart"/>
+            <w:r>
+              <w:rPr>
+                <w:rFonts w:ascii="Times New Roman" w:hAnsi="Times New Roman" w:cs="Times New Roman"/>
+                <w:lang w:val="tr-TR"/>
+              </w:rPr>
+              <w:t>configuration</w:t>
+            </w:r>
+            <w:proofErr w:type="spellEnd"/>
+            <w:r>
+              <w:rPr>
+                <w:rFonts w:ascii="Times New Roman" w:hAnsi="Times New Roman" w:cs="Times New Roman"/>
+                <w:lang w:val="tr-TR"/>
+              </w:rPr>
+              <w:t>)</w:t>
+            </w:r>
+          </w:p>
+        </w:tc>
+        <w:tc>
+          <w:tcPr>
+            <w:tcW w:w="0" w:type="auto"/>
+            <w:vAlign w:val="center"/>
+            <w:hideMark/>
+          </w:tcPr>
+          <w:p>
+            <w:pPr>
+              <w:spacing w:after="80"/>
+              <w:rPr>
+                <w:rFonts w:ascii="Times New Roman" w:hAnsi="Times New Roman" w:cs="Times New Roman"/>
+                <w:lang w:val="tr-TR"/>
+              </w:rPr>
+            </w:pPr>
+            <w:r>
+              <w:rPr>
+                <w:rFonts w:ascii="Times New Roman" w:hAnsi="Times New Roman" w:cs="Times New Roman"/>
+                <w:lang w:val="tr-TR"/>
+              </w:rPr>
+              <w:t>1.726</w:t>
+            </w:r>
+          </w:p>
+        </w:tc>
+        <w:tc>
+          <w:tcPr>
+            <w:tcW w:w="0" w:type="auto"/>
+            <w:vAlign w:val="center"/>
+            <w:hideMark/>
+          </w:tcPr>
+          <w:p>
+            <w:pPr>
+              <w:spacing w:after="80"/>
+              <w:rPr>
+                <w:rFonts w:ascii="Times New Roman" w:hAnsi="Times New Roman" w:cs="Times New Roman"/>
+                <w:lang w:val="tr-TR"/>
+              </w:rPr>
+            </w:pPr>
+            <w:r>
+              <w:rPr>
+                <w:rFonts w:ascii="Times New Roman" w:hAnsi="Times New Roman" w:cs="Times New Roman"/>
+                <w:lang w:val="tr-TR"/>
+              </w:rPr>
+              <w:t>0.920</w:t>
+            </w:r>
+          </w:p>
+        </w:tc>
+        <w:tc>
+          <w:tcPr>
+            <w:tcW w:w="0" w:type="auto"/>
+            <w:vAlign w:val="center"/>
+            <w:hideMark/>
+          </w:tcPr>
+          <w:p>
+            <w:pPr>
+              <w:spacing w:after="80"/>
+              <w:rPr>
+                <w:rFonts w:ascii="Times New Roman" w:hAnsi="Times New Roman" w:cs="Times New Roman"/>
+                <w:lang w:val="tr-TR"/>
+              </w:rPr>
+            </w:pPr>
+            <w:r>
+              <w:rPr>
+                <w:rFonts w:ascii="Times New Roman" w:hAnsi="Times New Roman" w:cs="Times New Roman"/>
+                <w:lang w:val="tr-TR"/>
+              </w:rPr>
+              <w:t>131.67</w:t>
+            </w:r>
+          </w:p>
+        </w:tc>
+      </w:tr>
+      <w:tr>
+        <w:trPr>
+          <w:tblCellSpacing w:w="15" w:type="dxa"/>
+        </w:trPr>
+        <w:tc>
+          <w:tcPr>
+            <w:tcW w:w="0" w:type="auto"/>
+            <w:vAlign w:val="center"/>
+            <w:hideMark/>
+          </w:tcPr>
+          <w:p>
+            <w:pPr>
+              <w:spacing w:after="80"/>
+              <w:rPr>
+                <w:rFonts w:ascii="Times New Roman" w:hAnsi="Times New Roman" w:cs="Times New Roman"/>
+                <w:lang w:val="tr-TR"/>
+              </w:rPr>
+            </w:pPr>
+            <w:r>
+              <w:rPr>
+                <w:rFonts w:ascii="Times New Roman" w:hAnsi="Times New Roman" w:cs="Times New Roman"/>
+                <w:lang w:val="tr-TR"/>
+              </w:rPr>
+              <w:t xml:space="preserve">Planning </w:t>
+            </w:r>
+            <w:proofErr w:type="spellStart"/>
+            <w:r>
+              <w:rPr>
+                <w:rFonts w:ascii="Times New Roman" w:hAnsi="Times New Roman" w:cs="Times New Roman"/>
+                <w:lang w:val="tr-TR"/>
+              </w:rPr>
+              <w:t>Policy</w:t>
+            </w:r>
+            <w:proofErr w:type="spellEnd"/>
+          </w:p>
+        </w:tc>
+        <w:tc>
+          <w:tcPr>
+            <w:tcW w:w="0" w:type="auto"/>
+            <w:vAlign w:val="center"/>
+            <w:hideMark/>
+          </w:tcPr>
+          <w:p>
+            <w:pPr>
+              <w:spacing w:after="80"/>
+              <w:rPr>
+                <w:rFonts w:ascii="Times New Roman" w:hAnsi="Times New Roman" w:cs="Times New Roman"/>
+                <w:lang w:val="tr-TR"/>
+              </w:rPr>
+            </w:pPr>
+            <w:r>
+              <w:rPr>
+                <w:rFonts w:ascii="Times New Roman" w:hAnsi="Times New Roman" w:cs="Times New Roman"/>
+                <w:lang w:val="tr-TR"/>
+              </w:rPr>
+              <w:t>1.458</w:t>
+            </w:r>
+          </w:p>
+        </w:tc>
+        <w:tc>
+          <w:tcPr>
+            <w:tcW w:w="0" w:type="auto"/>
+            <w:vAlign w:val="center"/>
+            <w:hideMark/>
+          </w:tcPr>
+          <w:p>
+            <w:pPr>
+              <w:spacing w:after="80"/>
+              <w:rPr>
+                <w:rFonts w:ascii="Times New Roman" w:hAnsi="Times New Roman" w:cs="Times New Roman"/>
+                <w:lang w:val="tr-TR"/>
+              </w:rPr>
+            </w:pPr>
+            <w:r>
+              <w:rPr>
+                <w:rFonts w:ascii="Times New Roman" w:hAnsi="Times New Roman" w:cs="Times New Roman"/>
+                <w:lang w:val="tr-TR"/>
+              </w:rPr>
+              <w:t>0.935</w:t>
+            </w:r>
+          </w:p>
+        </w:tc>
+        <w:tc>
+          <w:tcPr>
+            <w:tcW w:w="0" w:type="auto"/>
+            <w:vAlign w:val="center"/>
+            <w:hideMark/>
+          </w:tcPr>
+          <w:p>
+            <w:pPr>
+              <w:spacing w:after="80"/>
+              <w:rPr>
+                <w:rFonts w:ascii="Times New Roman" w:hAnsi="Times New Roman" w:cs="Times New Roman"/>
+                <w:lang w:val="tr-TR"/>
+              </w:rPr>
+            </w:pPr>
+            <w:r>
+              <w:rPr>
+                <w:rFonts w:ascii="Times New Roman" w:hAnsi="Times New Roman" w:cs="Times New Roman"/>
+                <w:lang w:val="tr-TR"/>
+              </w:rPr>
+              <w:t>134.67</w:t>
+            </w:r>
+          </w:p>
+        </w:tc>
+      </w:tr>
+    </w:tbl>
+    <w:p>
+      <w:pPr>
+        <w:spacing w:after="80"/>
+        <w:rPr>
+          <w:rFonts w:ascii="Times New Roman" w:hAnsi="Times New Roman" w:cs="Times New Roman"/>
+          <w:lang w:val="tr-TR"/>
+        </w:rPr>
+      </w:pPr>
+      <w:proofErr w:type="spellStart"/>
+      <w:r>
+        <w:rPr>
+          <w:rFonts w:ascii="Times New Roman" w:hAnsi="Times New Roman" w:cs="Times New Roman"/>
+          <w:lang w:val="tr-TR"/>
+        </w:rPr>
+        <w:t>The</w:t>
+      </w:r>
+      <w:proofErr w:type="spellEnd"/>
+      <w:r>
+        <w:rPr>
+          <w:rFonts w:ascii="Times New Roman" w:hAnsi="Times New Roman" w:cs="Times New Roman"/>
+          <w:lang w:val="tr-TR"/>
+        </w:rPr>
+        <w:t xml:space="preserve"> </w:t>
+      </w:r>
+      <w:proofErr w:type="spellStart"/>
+      <w:r>
+        <w:rPr>
+          <w:rFonts w:ascii="Times New Roman" w:hAnsi="Times New Roman" w:cs="Times New Roman"/>
+          <w:lang w:val="tr-TR"/>
+        </w:rPr>
+        <w:t>planning</w:t>
+      </w:r>
+      <w:proofErr w:type="spellEnd"/>
+      <w:r>
+        <w:rPr>
+          <w:rFonts w:ascii="Times New Roman" w:hAnsi="Times New Roman" w:cs="Times New Roman"/>
+          <w:lang w:val="tr-TR"/>
+        </w:rPr>
+        <w:t xml:space="preserve"> </w:t>
+      </w:r>
+      <w:proofErr w:type="spellStart"/>
+      <w:r>
+        <w:rPr>
+          <w:rFonts w:ascii="Times New Roman" w:hAnsi="Times New Roman" w:cs="Times New Roman"/>
+          <w:lang w:val="tr-TR"/>
+        </w:rPr>
+        <w:t>policy</w:t>
+      </w:r>
+      <w:proofErr w:type="spellEnd"/>
+      <w:r>
+        <w:rPr>
+          <w:rFonts w:ascii="Times New Roman" w:hAnsi="Times New Roman" w:cs="Times New Roman"/>
+          <w:lang w:val="tr-TR"/>
+        </w:rPr>
+        <w:t xml:space="preserve"> </w:t>
+      </w:r>
+      <w:proofErr w:type="spellStart"/>
+      <w:r>
+        <w:rPr>
+          <w:rFonts w:ascii="Times New Roman" w:hAnsi="Times New Roman" w:cs="Times New Roman"/>
+          <w:lang w:val="tr-TR"/>
+        </w:rPr>
+        <w:t>improved</w:t>
+      </w:r>
+      <w:proofErr w:type="spellEnd"/>
+      <w:r>
+        <w:rPr>
+          <w:rFonts w:ascii="Times New Roman" w:hAnsi="Times New Roman" w:cs="Times New Roman"/>
+          <w:lang w:val="tr-TR"/>
+        </w:rPr>
+        <w:t xml:space="preserve"> </w:t>
+      </w:r>
+      <w:proofErr w:type="spellStart"/>
+      <w:r>
+        <w:rPr>
+          <w:rFonts w:ascii="Times New Roman" w:hAnsi="Times New Roman" w:cs="Times New Roman"/>
+          <w:lang w:val="tr-TR"/>
+        </w:rPr>
+        <w:t>cost_per_order</w:t>
+      </w:r>
+      <w:proofErr w:type="spellEnd"/>
+      <w:r>
+        <w:rPr>
+          <w:rFonts w:ascii="Times New Roman" w:hAnsi="Times New Roman" w:cs="Times New Roman"/>
+          <w:lang w:val="tr-TR"/>
+        </w:rPr>
+        <w:t xml:space="preserve"> </w:t>
+      </w:r>
+      <w:proofErr w:type="spellStart"/>
+      <w:r>
+        <w:rPr>
+          <w:rFonts w:ascii="Times New Roman" w:hAnsi="Times New Roman" w:cs="Times New Roman"/>
+          <w:lang w:val="tr-TR"/>
+        </w:rPr>
+        <w:t>by</w:t>
+      </w:r>
+      <w:proofErr w:type="spellEnd"/>
+      <w:r>
+        <w:rPr>
+          <w:rFonts w:ascii="Times New Roman" w:hAnsi="Times New Roman" w:cs="Times New Roman"/>
+          <w:lang w:val="tr-TR"/>
+        </w:rPr>
+        <w:t xml:space="preserve"> </w:t>
+      </w:r>
+      <w:proofErr w:type="spellStart"/>
+      <w:r>
+        <w:rPr>
+          <w:rFonts w:ascii="Times New Roman" w:hAnsi="Times New Roman" w:cs="Times New Roman"/>
+          <w:lang w:val="tr-TR"/>
+        </w:rPr>
+        <w:t>approximately</w:t>
+      </w:r>
+      <w:proofErr w:type="spellEnd"/>
+      <w:r>
+        <w:rPr>
+          <w:rFonts w:ascii="Times New Roman" w:hAnsi="Times New Roman" w:cs="Times New Roman"/>
+          <w:lang w:val="tr-TR"/>
+        </w:rPr>
+        <w:t xml:space="preserve"> 15.5% </w:t>
+      </w:r>
+      <w:proofErr w:type="spellStart"/>
+      <w:r>
+        <w:rPr>
+          <w:rFonts w:ascii="Times New Roman" w:hAnsi="Times New Roman" w:cs="Times New Roman"/>
+          <w:lang w:val="tr-TR"/>
+        </w:rPr>
+        <w:t>compared</w:t>
+      </w:r>
+      <w:proofErr w:type="spellEnd"/>
+      <w:r>
+        <w:rPr>
+          <w:rFonts w:ascii="Times New Roman" w:hAnsi="Times New Roman" w:cs="Times New Roman"/>
+          <w:lang w:val="tr-TR"/>
+        </w:rPr>
+        <w:t xml:space="preserve"> </w:t>
+      </w:r>
+      <w:proofErr w:type="spellStart"/>
+      <w:r>
+        <w:rPr>
+          <w:rFonts w:ascii="Times New Roman" w:hAnsi="Times New Roman" w:cs="Times New Roman"/>
+          <w:lang w:val="tr-TR"/>
+        </w:rPr>
+        <w:t>to</w:t>
+      </w:r>
+      <w:proofErr w:type="spellEnd"/>
+      <w:r>
+        <w:rPr>
+          <w:rFonts w:ascii="Times New Roman" w:hAnsi="Times New Roman" w:cs="Times New Roman"/>
+          <w:lang w:val="tr-TR"/>
+        </w:rPr>
+        <w:t xml:space="preserve"> </w:t>
+      </w:r>
+      <w:proofErr w:type="spellStart"/>
+      <w:r>
+        <w:rPr>
+          <w:rFonts w:ascii="Times New Roman" w:hAnsi="Times New Roman" w:cs="Times New Roman"/>
+          <w:lang w:val="tr-TR"/>
+        </w:rPr>
+        <w:t>the</w:t>
+      </w:r>
+      <w:proofErr w:type="spellEnd"/>
+      <w:r>
+        <w:rPr>
+          <w:rFonts w:ascii="Times New Roman" w:hAnsi="Times New Roman" w:cs="Times New Roman"/>
+          <w:lang w:val="tr-TR"/>
+        </w:rPr>
+        <w:t xml:space="preserve"> </w:t>
+      </w:r>
+      <w:proofErr w:type="spellStart"/>
+      <w:r>
+        <w:rPr>
+          <w:rFonts w:ascii="Times New Roman" w:hAnsi="Times New Roman" w:cs="Times New Roman"/>
+          <w:lang w:val="tr-TR"/>
+        </w:rPr>
+        <w:t>default</w:t>
+      </w:r>
+      <w:proofErr w:type="spellEnd"/>
+      <w:r>
+        <w:rPr>
+          <w:rFonts w:ascii="Times New Roman" w:hAnsi="Times New Roman" w:cs="Times New Roman"/>
+          <w:lang w:val="tr-TR"/>
+        </w:rPr>
+        <w:t xml:space="preserve"> </w:t>
+      </w:r>
+      <w:proofErr w:type="spellStart"/>
+      <w:r>
+        <w:rPr>
+          <w:rFonts w:ascii="Times New Roman" w:hAnsi="Times New Roman" w:cs="Times New Roman"/>
+          <w:lang w:val="tr-TR"/>
+        </w:rPr>
+        <w:t>improved</w:t>
+      </w:r>
+      <w:proofErr w:type="spellEnd"/>
+      <w:r>
+        <w:rPr>
+          <w:rFonts w:ascii="Times New Roman" w:hAnsi="Times New Roman" w:cs="Times New Roman"/>
+          <w:lang w:val="tr-TR"/>
+        </w:rPr>
+        <w:t xml:space="preserve"> </w:t>
+      </w:r>
+      <w:proofErr w:type="spellStart"/>
+      <w:r>
+        <w:rPr>
+          <w:rFonts w:ascii="Times New Roman" w:hAnsi="Times New Roman" w:cs="Times New Roman"/>
+          <w:lang w:val="tr-TR"/>
+        </w:rPr>
+        <w:t>greedy</w:t>
+      </w:r>
+      <w:proofErr w:type="spellEnd"/>
+      <w:r>
+        <w:rPr>
+          <w:rFonts w:ascii="Times New Roman" w:hAnsi="Times New Roman" w:cs="Times New Roman"/>
+          <w:lang w:val="tr-TR"/>
+        </w:rPr>
+        <w:t xml:space="preserve"> </w:t>
+      </w:r>
+      <w:proofErr w:type="spellStart"/>
+      <w:r>
+        <w:rPr>
+          <w:rFonts w:ascii="Times New Roman" w:hAnsi="Times New Roman" w:cs="Times New Roman"/>
+          <w:lang w:val="tr-TR"/>
+        </w:rPr>
+        <w:t>configuration</w:t>
+      </w:r>
+      <w:proofErr w:type="spellEnd"/>
+      <w:r>
+        <w:rPr>
+          <w:rFonts w:ascii="Times New Roman" w:hAnsi="Times New Roman" w:cs="Times New Roman"/>
+          <w:lang w:val="tr-TR"/>
+        </w:rPr>
+        <w:t xml:space="preserve"> </w:t>
+      </w:r>
+      <w:proofErr w:type="spellStart"/>
+      <w:r>
+        <w:rPr>
+          <w:rFonts w:ascii="Times New Roman" w:hAnsi="Times New Roman" w:cs="Times New Roman"/>
+          <w:lang w:val="tr-TR"/>
+        </w:rPr>
+        <w:t>while</w:t>
+      </w:r>
+      <w:proofErr w:type="spellEnd"/>
+      <w:r>
+        <w:rPr>
+          <w:rFonts w:ascii="Times New Roman" w:hAnsi="Times New Roman" w:cs="Times New Roman"/>
+          <w:lang w:val="tr-TR"/>
+        </w:rPr>
+        <w:t xml:space="preserve"> </w:t>
+      </w:r>
+      <w:proofErr w:type="spellStart"/>
+      <w:r>
+        <w:rPr>
+          <w:rFonts w:ascii="Times New Roman" w:hAnsi="Times New Roman" w:cs="Times New Roman"/>
+          <w:lang w:val="tr-TR"/>
+        </w:rPr>
+        <w:t>increasing</w:t>
+      </w:r>
+      <w:proofErr w:type="spellEnd"/>
+      <w:r>
+        <w:rPr>
+          <w:rFonts w:ascii="Times New Roman" w:hAnsi="Times New Roman" w:cs="Times New Roman"/>
+          <w:lang w:val="tr-TR"/>
+        </w:rPr>
+        <w:t xml:space="preserve"> </w:t>
+      </w:r>
+      <w:proofErr w:type="spellStart"/>
+      <w:r>
+        <w:rPr>
+          <w:rFonts w:ascii="Times New Roman" w:hAnsi="Times New Roman" w:cs="Times New Roman"/>
+          <w:lang w:val="tr-TR"/>
+        </w:rPr>
+        <w:t>the</w:t>
+      </w:r>
+      <w:proofErr w:type="spellEnd"/>
+      <w:r>
+        <w:rPr>
+          <w:rFonts w:ascii="Times New Roman" w:hAnsi="Times New Roman" w:cs="Times New Roman"/>
+          <w:lang w:val="tr-TR"/>
+        </w:rPr>
+        <w:t xml:space="preserve"> </w:t>
+      </w:r>
+      <w:proofErr w:type="spellStart"/>
+      <w:r>
+        <w:rPr>
+          <w:rFonts w:ascii="Times New Roman" w:hAnsi="Times New Roman" w:cs="Times New Roman"/>
+          <w:lang w:val="tr-TR"/>
+        </w:rPr>
+        <w:t>number</w:t>
+      </w:r>
+      <w:proofErr w:type="spellEnd"/>
+      <w:r>
+        <w:rPr>
+          <w:rFonts w:ascii="Times New Roman" w:hAnsi="Times New Roman" w:cs="Times New Roman"/>
+          <w:lang w:val="tr-TR"/>
+        </w:rPr>
+        <w:t xml:space="preserve"> of </w:t>
+      </w:r>
+      <w:proofErr w:type="spellStart"/>
+      <w:r>
+        <w:rPr>
+          <w:rFonts w:ascii="Times New Roman" w:hAnsi="Times New Roman" w:cs="Times New Roman"/>
+          <w:lang w:val="tr-TR"/>
+        </w:rPr>
+        <w:t>delivered</w:t>
+      </w:r>
+      <w:proofErr w:type="spellEnd"/>
+      <w:r>
+        <w:rPr>
+          <w:rFonts w:ascii="Times New Roman" w:hAnsi="Times New Roman" w:cs="Times New Roman"/>
+          <w:lang w:val="tr-TR"/>
+        </w:rPr>
+        <w:t xml:space="preserve"> </w:t>
+      </w:r>
+      <w:proofErr w:type="spellStart"/>
+      <w:r>
+        <w:rPr>
+          <w:rFonts w:ascii="Times New Roman" w:hAnsi="Times New Roman" w:cs="Times New Roman"/>
+          <w:lang w:val="tr-TR"/>
+        </w:rPr>
+        <w:t>orders</w:t>
+      </w:r>
+      <w:proofErr w:type="spellEnd"/>
+      <w:r>
+        <w:rPr>
+          <w:rFonts w:ascii="Times New Roman" w:hAnsi="Times New Roman" w:cs="Times New Roman"/>
+          <w:lang w:val="tr-TR"/>
+        </w:rPr>
+        <w:t xml:space="preserve"> </w:t>
+      </w:r>
+      <w:proofErr w:type="spellStart"/>
+      <w:r>
+        <w:rPr>
+          <w:rFonts w:ascii="Times New Roman" w:hAnsi="Times New Roman" w:cs="Times New Roman"/>
+          <w:lang w:val="tr-TR"/>
+        </w:rPr>
+        <w:t>and</w:t>
+      </w:r>
+      <w:proofErr w:type="spellEnd"/>
+      <w:r>
+        <w:rPr>
+          <w:rFonts w:ascii="Times New Roman" w:hAnsi="Times New Roman" w:cs="Times New Roman"/>
+          <w:lang w:val="tr-TR"/>
+        </w:rPr>
+        <w:t xml:space="preserve"> </w:t>
+      </w:r>
+      <w:proofErr w:type="spellStart"/>
+      <w:r>
+        <w:rPr>
+          <w:rFonts w:ascii="Times New Roman" w:hAnsi="Times New Roman" w:cs="Times New Roman"/>
+          <w:lang w:val="tr-TR"/>
+        </w:rPr>
+        <w:t>reducing</w:t>
+      </w:r>
+      <w:proofErr w:type="spellEnd"/>
+      <w:r>
+        <w:rPr>
+          <w:rFonts w:ascii="Times New Roman" w:hAnsi="Times New Roman" w:cs="Times New Roman"/>
+          <w:lang w:val="tr-TR"/>
+        </w:rPr>
+        <w:t xml:space="preserve"> </w:t>
+      </w:r>
+      <w:proofErr w:type="spellStart"/>
+      <w:r>
+        <w:rPr>
+          <w:rFonts w:ascii="Times New Roman" w:hAnsi="Times New Roman" w:cs="Times New Roman"/>
+          <w:lang w:val="tr-TR"/>
+        </w:rPr>
+        <w:t>dropped</w:t>
+      </w:r>
+      <w:proofErr w:type="spellEnd"/>
+      <w:r>
+        <w:rPr>
+          <w:rFonts w:ascii="Times New Roman" w:hAnsi="Times New Roman" w:cs="Times New Roman"/>
+          <w:lang w:val="tr-TR"/>
+        </w:rPr>
+        <w:t xml:space="preserve"> </w:t>
+      </w:r>
+      <w:proofErr w:type="spellStart"/>
+      <w:r>
+        <w:rPr>
+          <w:rFonts w:ascii="Times New Roman" w:hAnsi="Times New Roman" w:cs="Times New Roman"/>
+          <w:lang w:val="tr-TR"/>
+        </w:rPr>
+        <w:t>deliveries</w:t>
+      </w:r>
+      <w:proofErr w:type="spellEnd"/>
+      <w:r>
+        <w:rPr>
+          <w:rFonts w:ascii="Times New Roman" w:hAnsi="Times New Roman" w:cs="Times New Roman"/>
+          <w:lang w:val="tr-TR"/>
+        </w:rPr>
+        <w:t>.</w:t>
+      </w:r>
+    </w:p>
+    <w:p>
+      <w:pPr>
+        <w:spacing w:after="80"/>
+        <w:rPr>
+          <w:rFonts w:ascii="Times New Roman" w:hAnsi="Times New Roman" w:cs="Times New Roman"/>
+          <w:lang w:val="tr-TR"/>
+        </w:rPr>
+      </w:pPr>
+      <w:proofErr w:type="spellStart"/>
+      <w:r>
+        <w:rPr>
+          <w:rFonts w:ascii="Times New Roman" w:hAnsi="Times New Roman" w:cs="Times New Roman"/>
+          <w:lang w:val="tr-TR"/>
+        </w:rPr>
+        <w:t>Although</w:t>
+      </w:r>
+      <w:proofErr w:type="spellEnd"/>
+      <w:r>
+        <w:rPr>
+          <w:rFonts w:ascii="Times New Roman" w:hAnsi="Times New Roman" w:cs="Times New Roman"/>
+          <w:lang w:val="tr-TR"/>
+        </w:rPr>
+        <w:t xml:space="preserve"> it </w:t>
+      </w:r>
+      <w:proofErr w:type="spellStart"/>
+      <w:r>
+        <w:rPr>
+          <w:rFonts w:ascii="Times New Roman" w:hAnsi="Times New Roman" w:cs="Times New Roman"/>
+          <w:lang w:val="tr-TR"/>
+        </w:rPr>
+        <w:t>did</w:t>
+      </w:r>
+      <w:proofErr w:type="spellEnd"/>
+      <w:r>
+        <w:rPr>
+          <w:rFonts w:ascii="Times New Roman" w:hAnsi="Times New Roman" w:cs="Times New Roman"/>
+          <w:lang w:val="tr-TR"/>
+        </w:rPr>
+        <w:t xml:space="preserve"> not </w:t>
+      </w:r>
+      <w:proofErr w:type="spellStart"/>
+      <w:r>
+        <w:rPr>
+          <w:rFonts w:ascii="Times New Roman" w:hAnsi="Times New Roman" w:cs="Times New Roman"/>
+          <w:lang w:val="tr-TR"/>
+        </w:rPr>
+        <w:t>surpass</w:t>
+      </w:r>
+      <w:proofErr w:type="spellEnd"/>
+      <w:r>
+        <w:rPr>
+          <w:rFonts w:ascii="Times New Roman" w:hAnsi="Times New Roman" w:cs="Times New Roman"/>
+          <w:lang w:val="tr-TR"/>
+        </w:rPr>
+        <w:t xml:space="preserve"> </w:t>
+      </w:r>
+      <w:proofErr w:type="spellStart"/>
+      <w:r>
+        <w:rPr>
+          <w:rFonts w:ascii="Times New Roman" w:hAnsi="Times New Roman" w:cs="Times New Roman"/>
+          <w:lang w:val="tr-TR"/>
+        </w:rPr>
+        <w:t>the</w:t>
+      </w:r>
+      <w:proofErr w:type="spellEnd"/>
+      <w:r>
+        <w:rPr>
+          <w:rFonts w:ascii="Times New Roman" w:hAnsi="Times New Roman" w:cs="Times New Roman"/>
+          <w:lang w:val="tr-TR"/>
+        </w:rPr>
+        <w:t xml:space="preserve"> </w:t>
+      </w:r>
+      <w:proofErr w:type="spellStart"/>
+      <w:r>
+        <w:rPr>
+          <w:rFonts w:ascii="Times New Roman" w:hAnsi="Times New Roman" w:cs="Times New Roman"/>
+          <w:lang w:val="tr-TR"/>
+        </w:rPr>
+        <w:t>best</w:t>
+      </w:r>
+      <w:proofErr w:type="spellEnd"/>
+      <w:r>
+        <w:rPr>
+          <w:rFonts w:ascii="Times New Roman" w:hAnsi="Times New Roman" w:cs="Times New Roman"/>
+          <w:lang w:val="tr-TR"/>
+        </w:rPr>
+        <w:t xml:space="preserve"> </w:t>
+      </w:r>
+      <w:proofErr w:type="spellStart"/>
+      <w:r>
+        <w:rPr>
+          <w:rFonts w:ascii="Times New Roman" w:hAnsi="Times New Roman" w:cs="Times New Roman"/>
+          <w:lang w:val="tr-TR"/>
+        </w:rPr>
+        <w:t>threshold-tuned</w:t>
+      </w:r>
+      <w:proofErr w:type="spellEnd"/>
+      <w:r>
+        <w:rPr>
+          <w:rFonts w:ascii="Times New Roman" w:hAnsi="Times New Roman" w:cs="Times New Roman"/>
+          <w:lang w:val="tr-TR"/>
+        </w:rPr>
+        <w:t xml:space="preserve"> </w:t>
+      </w:r>
+      <w:proofErr w:type="spellStart"/>
+      <w:r>
+        <w:rPr>
+          <w:rFonts w:ascii="Times New Roman" w:hAnsi="Times New Roman" w:cs="Times New Roman"/>
+          <w:lang w:val="tr-TR"/>
+        </w:rPr>
+        <w:t>improved</w:t>
+      </w:r>
+      <w:proofErr w:type="spellEnd"/>
+      <w:r>
+        <w:rPr>
+          <w:rFonts w:ascii="Times New Roman" w:hAnsi="Times New Roman" w:cs="Times New Roman"/>
+          <w:lang w:val="tr-TR"/>
+        </w:rPr>
+        <w:t xml:space="preserve"> </w:t>
+      </w:r>
+      <w:proofErr w:type="spellStart"/>
+      <w:r>
+        <w:rPr>
+          <w:rFonts w:ascii="Times New Roman" w:hAnsi="Times New Roman" w:cs="Times New Roman"/>
+          <w:lang w:val="tr-TR"/>
+        </w:rPr>
+        <w:t>greedy</w:t>
+      </w:r>
+      <w:proofErr w:type="spellEnd"/>
+      <w:r>
+        <w:rPr>
+          <w:rFonts w:ascii="Times New Roman" w:hAnsi="Times New Roman" w:cs="Times New Roman"/>
+          <w:lang w:val="tr-TR"/>
+        </w:rPr>
+        <w:t xml:space="preserve"> </w:t>
+      </w:r>
+      <w:proofErr w:type="spellStart"/>
+      <w:r>
+        <w:rPr>
+          <w:rFonts w:ascii="Times New Roman" w:hAnsi="Times New Roman" w:cs="Times New Roman"/>
+          <w:lang w:val="tr-TR"/>
+        </w:rPr>
+        <w:t>teacher</w:t>
+      </w:r>
+      <w:proofErr w:type="spellEnd"/>
+      <w:r>
+        <w:rPr>
+          <w:rFonts w:ascii="Times New Roman" w:hAnsi="Times New Roman" w:cs="Times New Roman"/>
+          <w:lang w:val="tr-TR"/>
+        </w:rPr>
+        <w:t xml:space="preserve"> (</w:t>
+      </w:r>
+      <w:proofErr w:type="spellStart"/>
+      <w:r>
+        <w:rPr>
+          <w:rFonts w:ascii="Times New Roman" w:hAnsi="Times New Roman" w:cs="Times New Roman"/>
+          <w:lang w:val="tr-TR"/>
+        </w:rPr>
+        <w:t>cost_per_order</w:t>
+      </w:r>
+      <w:proofErr w:type="spellEnd"/>
+      <w:r>
+        <w:rPr>
+          <w:rFonts w:ascii="Times New Roman" w:hAnsi="Times New Roman" w:cs="Times New Roman"/>
+          <w:lang w:val="tr-TR"/>
+        </w:rPr>
+        <w:t xml:space="preserve"> = 1.388), it </w:t>
+      </w:r>
+      <w:proofErr w:type="spellStart"/>
+      <w:r>
+        <w:rPr>
+          <w:rFonts w:ascii="Times New Roman" w:hAnsi="Times New Roman" w:cs="Times New Roman"/>
+          <w:lang w:val="tr-TR"/>
+        </w:rPr>
+        <w:t>demonstrated</w:t>
+      </w:r>
+      <w:proofErr w:type="spellEnd"/>
+      <w:r>
+        <w:rPr>
+          <w:rFonts w:ascii="Times New Roman" w:hAnsi="Times New Roman" w:cs="Times New Roman"/>
+          <w:lang w:val="tr-TR"/>
+        </w:rPr>
+        <w:t xml:space="preserve"> </w:t>
+      </w:r>
+      <w:proofErr w:type="spellStart"/>
+      <w:r>
+        <w:rPr>
+          <w:rFonts w:ascii="Times New Roman" w:hAnsi="Times New Roman" w:cs="Times New Roman"/>
+          <w:lang w:val="tr-TR"/>
+        </w:rPr>
+        <w:t>that</w:t>
+      </w:r>
+      <w:proofErr w:type="spellEnd"/>
+      <w:r>
+        <w:rPr>
+          <w:rFonts w:ascii="Times New Roman" w:hAnsi="Times New Roman" w:cs="Times New Roman"/>
+          <w:lang w:val="tr-TR"/>
+        </w:rPr>
+        <w:t xml:space="preserve"> </w:t>
+      </w:r>
+      <w:proofErr w:type="spellStart"/>
+      <w:r>
+        <w:rPr>
+          <w:rFonts w:ascii="Times New Roman" w:hAnsi="Times New Roman" w:cs="Times New Roman"/>
+          <w:lang w:val="tr-TR"/>
+        </w:rPr>
+        <w:t>planning-based</w:t>
+      </w:r>
+      <w:proofErr w:type="spellEnd"/>
+      <w:r>
+        <w:rPr>
+          <w:rFonts w:ascii="Times New Roman" w:hAnsi="Times New Roman" w:cs="Times New Roman"/>
+          <w:lang w:val="tr-TR"/>
+        </w:rPr>
+        <w:t xml:space="preserve"> </w:t>
+      </w:r>
+      <w:proofErr w:type="spellStart"/>
+      <w:r>
+        <w:rPr>
+          <w:rFonts w:ascii="Times New Roman" w:hAnsi="Times New Roman" w:cs="Times New Roman"/>
+          <w:lang w:val="tr-TR"/>
+        </w:rPr>
+        <w:t>prioritization</w:t>
+      </w:r>
+      <w:proofErr w:type="spellEnd"/>
+      <w:r>
+        <w:rPr>
+          <w:rFonts w:ascii="Times New Roman" w:hAnsi="Times New Roman" w:cs="Times New Roman"/>
+          <w:lang w:val="tr-TR"/>
+        </w:rPr>
+        <w:t xml:space="preserve"> </w:t>
+      </w:r>
+      <w:proofErr w:type="spellStart"/>
+      <w:r>
+        <w:rPr>
+          <w:rFonts w:ascii="Times New Roman" w:hAnsi="Times New Roman" w:cs="Times New Roman"/>
+          <w:lang w:val="tr-TR"/>
+        </w:rPr>
+        <w:t>using</w:t>
+      </w:r>
+      <w:proofErr w:type="spellEnd"/>
+      <w:r>
+        <w:rPr>
+          <w:rFonts w:ascii="Times New Roman" w:hAnsi="Times New Roman" w:cs="Times New Roman"/>
+          <w:lang w:val="tr-TR"/>
+        </w:rPr>
+        <w:t xml:space="preserve"> </w:t>
+      </w:r>
+      <w:proofErr w:type="spellStart"/>
+      <w:r>
+        <w:rPr>
+          <w:rFonts w:ascii="Times New Roman" w:hAnsi="Times New Roman" w:cs="Times New Roman"/>
+          <w:lang w:val="tr-TR"/>
+        </w:rPr>
+        <w:t>urgency</w:t>
+      </w:r>
+      <w:proofErr w:type="spellEnd"/>
+      <w:r>
+        <w:rPr>
+          <w:rFonts w:ascii="Times New Roman" w:hAnsi="Times New Roman" w:cs="Times New Roman"/>
+          <w:lang w:val="tr-TR"/>
+        </w:rPr>
+        <w:t xml:space="preserve"> </w:t>
+      </w:r>
+      <w:proofErr w:type="spellStart"/>
+      <w:r>
+        <w:rPr>
+          <w:rFonts w:ascii="Times New Roman" w:hAnsi="Times New Roman" w:cs="Times New Roman"/>
+          <w:lang w:val="tr-TR"/>
+        </w:rPr>
+        <w:t>and</w:t>
+      </w:r>
+      <w:proofErr w:type="spellEnd"/>
+      <w:r>
+        <w:rPr>
+          <w:rFonts w:ascii="Times New Roman" w:hAnsi="Times New Roman" w:cs="Times New Roman"/>
+          <w:lang w:val="tr-TR"/>
+        </w:rPr>
+        <w:t xml:space="preserve"> </w:t>
+      </w:r>
+      <w:proofErr w:type="spellStart"/>
+      <w:r>
+        <w:rPr>
+          <w:rFonts w:ascii="Times New Roman" w:hAnsi="Times New Roman" w:cs="Times New Roman"/>
+          <w:lang w:val="tr-TR"/>
+        </w:rPr>
+        <w:t>battery-awareness</w:t>
+      </w:r>
+      <w:proofErr w:type="spellEnd"/>
+      <w:r>
+        <w:rPr>
+          <w:rFonts w:ascii="Times New Roman" w:hAnsi="Times New Roman" w:cs="Times New Roman"/>
+          <w:lang w:val="tr-TR"/>
+        </w:rPr>
+        <w:t xml:space="preserve"> can </w:t>
+      </w:r>
+      <w:proofErr w:type="spellStart"/>
+      <w:r>
+        <w:rPr>
+          <w:rFonts w:ascii="Times New Roman" w:hAnsi="Times New Roman" w:cs="Times New Roman"/>
+          <w:lang w:val="tr-TR"/>
+        </w:rPr>
+        <w:t>improve</w:t>
+      </w:r>
+      <w:proofErr w:type="spellEnd"/>
+      <w:r>
+        <w:rPr>
+          <w:rFonts w:ascii="Times New Roman" w:hAnsi="Times New Roman" w:cs="Times New Roman"/>
+          <w:lang w:val="tr-TR"/>
+        </w:rPr>
+        <w:t xml:space="preserve"> </w:t>
+      </w:r>
+      <w:proofErr w:type="spellStart"/>
+      <w:r>
+        <w:rPr>
+          <w:rFonts w:ascii="Times New Roman" w:hAnsi="Times New Roman" w:cs="Times New Roman"/>
+          <w:lang w:val="tr-TR"/>
+        </w:rPr>
+        <w:t>dispatch</w:t>
+      </w:r>
+      <w:proofErr w:type="spellEnd"/>
+      <w:r>
+        <w:rPr>
+          <w:rFonts w:ascii="Times New Roman" w:hAnsi="Times New Roman" w:cs="Times New Roman"/>
+          <w:lang w:val="tr-TR"/>
+        </w:rPr>
+        <w:t xml:space="preserve"> </w:t>
+      </w:r>
+      <w:proofErr w:type="spellStart"/>
+      <w:r>
+        <w:rPr>
+          <w:rFonts w:ascii="Times New Roman" w:hAnsi="Times New Roman" w:cs="Times New Roman"/>
+          <w:lang w:val="tr-TR"/>
+        </w:rPr>
+        <w:t>performance</w:t>
+      </w:r>
+      <w:proofErr w:type="spellEnd"/>
+      <w:r>
+        <w:rPr>
+          <w:rFonts w:ascii="Times New Roman" w:hAnsi="Times New Roman" w:cs="Times New Roman"/>
+          <w:lang w:val="tr-TR"/>
+        </w:rPr>
+        <w:t>.</w:t>
+      </w:r>
+    </w:p>
+    <w:p>
+      <w:pPr>
+        <w:spacing w:after="80"/>
+        <w:rPr>
+          <w:rFonts w:ascii="Times New Roman" w:hAnsi="Times New Roman" w:cs="Times New Roman"/>
+        </w:rPr>
+      </w:pPr>
     </w:p>
     <w:p>
       <w:pPr>
@@ -7497,6 +10025,7 @@
                 <w:b/>
                 <w:sz w:val="18"/>
               </w:rPr>
+              <w:lastRenderedPageBreak/>
               <w:t>Random</w:t>
             </w:r>
           </w:p>
@@ -8407,7 +10936,6 @@
         <w:pStyle w:val="Balk1"/>
       </w:pPr>
       <w:r>
-        <w:lastRenderedPageBreak/>
         <w:t xml:space="preserve"> </w:t>
       </w:r>
       <w:bookmarkStart w:id="28" w:name="_Toc232764920"/>
@@ -8723,6 +11251,7 @@
         <w:rPr>
           <w:rFonts w:ascii="Times New Roman" w:hAnsi="Times New Roman" w:cs="Times New Roman"/>
         </w:rPr>
+        <w:lastRenderedPageBreak/>
         <w:t xml:space="preserve">All </w:t>
       </w:r>
       <w:proofErr w:type="gramStart"/>
@@ -9073,6 +11602,119 @@
     </w:lvl>
   </w:abstractNum>
   <w:abstractNum w:abstractNumId="9" w15:restartNumberingAfterBreak="0">
+    <w:nsid w:val="0049317D"/>
+    <w:multiLevelType w:val="multilevel"/>
+    <w:tmpl w:val="7CD699EA"/>
+    <w:lvl w:ilvl="0">
+      <w:start w:val="1"/>
+      <w:numFmt w:val="decimal"/>
+      <w:lvlText w:val="%1."/>
+      <w:lvlJc w:val="left"/>
+      <w:pPr>
+        <w:tabs>
+          <w:tab w:val="num" w:pos="720"/>
+        </w:tabs>
+        <w:ind w:left="720" w:hanging="360"/>
+      </w:pPr>
+    </w:lvl>
+    <w:lvl w:ilvl="1" w:tentative="1">
+      <w:start w:val="1"/>
+      <w:numFmt w:val="decimal"/>
+      <w:lvlText w:val="%2."/>
+      <w:lvlJc w:val="left"/>
+      <w:pPr>
+        <w:tabs>
+          <w:tab w:val="num" w:pos="1440"/>
+        </w:tabs>
+        <w:ind w:left="1440" w:hanging="360"/>
+      </w:pPr>
+    </w:lvl>
+    <w:lvl w:ilvl="2" w:tentative="1">
+      <w:start w:val="1"/>
+      <w:numFmt w:val="decimal"/>
+      <w:lvlText w:val="%3."/>
+      <w:lvlJc w:val="left"/>
+      <w:pPr>
+        <w:tabs>
+          <w:tab w:val="num" w:pos="2160"/>
+        </w:tabs>
+        <w:ind w:left="2160" w:hanging="360"/>
+      </w:pPr>
+    </w:lvl>
+    <w:lvl w:ilvl="3" w:tentative="1">
+      <w:start w:val="1"/>
+      <w:numFmt w:val="decimal"/>
+      <w:lvlText w:val="%4."/>
+      <w:lvlJc w:val="left"/>
+      <w:pPr>
+        <w:tabs>
+          <w:tab w:val="num" w:pos="2880"/>
+        </w:tabs>
+        <w:ind w:left="2880" w:hanging="360"/>
+      </w:pPr>
+    </w:lvl>
+    <w:lvl w:ilvl="4" w:tentative="1">
+      <w:start w:val="1"/>
+      <w:numFmt w:val="decimal"/>
+      <w:lvlText w:val="%5."/>
+      <w:lvlJc w:val="left"/>
+      <w:pPr>
+        <w:tabs>
+          <w:tab w:val="num" w:pos="3600"/>
+        </w:tabs>
+        <w:ind w:left="3600" w:hanging="360"/>
+      </w:pPr>
+    </w:lvl>
+    <w:lvl w:ilvl="5" w:tentative="1">
+      <w:start w:val="1"/>
+      <w:numFmt w:val="decimal"/>
+      <w:lvlText w:val="%6."/>
+      <w:lvlJc w:val="left"/>
+      <w:pPr>
+        <w:tabs>
+          <w:tab w:val="num" w:pos="4320"/>
+        </w:tabs>
+        <w:ind w:left="4320" w:hanging="360"/>
+      </w:pPr>
+    </w:lvl>
+    <w:lvl w:ilvl="6" w:tentative="1">
+      <w:start w:val="1"/>
+      <w:numFmt w:val="decimal"/>
+      <w:lvlText w:val="%7."/>
+      <w:lvlJc w:val="left"/>
+      <w:pPr>
+        <w:tabs>
+          <w:tab w:val="num" w:pos="5040"/>
+        </w:tabs>
+        <w:ind w:left="5040" w:hanging="360"/>
+      </w:pPr>
+    </w:lvl>
+    <w:lvl w:ilvl="7" w:tentative="1">
+      <w:start w:val="1"/>
+      <w:numFmt w:val="decimal"/>
+      <w:lvlText w:val="%8."/>
+      <w:lvlJc w:val="left"/>
+      <w:pPr>
+        <w:tabs>
+          <w:tab w:val="num" w:pos="5760"/>
+        </w:tabs>
+        <w:ind w:left="5760" w:hanging="360"/>
+      </w:pPr>
+    </w:lvl>
+    <w:lvl w:ilvl="8" w:tentative="1">
+      <w:start w:val="1"/>
+      <w:numFmt w:val="decimal"/>
+      <w:lvlText w:val="%9."/>
+      <w:lvlJc w:val="left"/>
+      <w:pPr>
+        <w:tabs>
+          <w:tab w:val="num" w:pos="6480"/>
+        </w:tabs>
+        <w:ind w:left="6480" w:hanging="360"/>
+      </w:pPr>
+    </w:lvl>
+  </w:abstractNum>
+  <w:abstractNum w:abstractNumId="10" w15:restartNumberingAfterBreak="0">
     <w:nsid w:val="08606C08"/>
     <w:multiLevelType w:val="hybridMultilevel"/>
     <w:tmpl w:val="A14C5516"/>
@@ -9185,7 +11827,7 @@
       </w:rPr>
     </w:lvl>
   </w:abstractNum>
-  <w:abstractNum w:abstractNumId="10" w15:restartNumberingAfterBreak="0">
+  <w:abstractNum w:abstractNumId="11" w15:restartNumberingAfterBreak="0">
     <w:nsid w:val="2C435232"/>
     <w:multiLevelType w:val="hybridMultilevel"/>
     <w:tmpl w:val="31E2F33C"/>
@@ -9298,7 +11940,7 @@
       </w:rPr>
     </w:lvl>
   </w:abstractNum>
-  <w:abstractNum w:abstractNumId="11" w15:restartNumberingAfterBreak="0">
+  <w:abstractNum w:abstractNumId="12" w15:restartNumberingAfterBreak="0">
     <w:nsid w:val="2ECD2751"/>
     <w:multiLevelType w:val="hybridMultilevel"/>
     <w:tmpl w:val="77C095A0"/>
@@ -9384,7 +12026,7 @@
       </w:pPr>
     </w:lvl>
   </w:abstractNum>
-  <w:abstractNum w:abstractNumId="12" w15:restartNumberingAfterBreak="0">
+  <w:abstractNum w:abstractNumId="13" w15:restartNumberingAfterBreak="0">
     <w:nsid w:val="429B6CFE"/>
     <w:multiLevelType w:val="hybridMultilevel"/>
     <w:tmpl w:val="04487D76"/>
@@ -9473,7 +12115,7 @@
       </w:pPr>
     </w:lvl>
   </w:abstractNum>
-  <w:abstractNum w:abstractNumId="13" w15:restartNumberingAfterBreak="0">
+  <w:abstractNum w:abstractNumId="14" w15:restartNumberingAfterBreak="0">
     <w:nsid w:val="4921351F"/>
     <w:multiLevelType w:val="hybridMultilevel"/>
     <w:tmpl w:val="64C2BCD6"/>
@@ -9614,19 +12256,22 @@
     <w:abstractNumId w:val="0"/>
   </w:num>
   <w:num w:numId="10" w16cid:durableId="1720594818">
+    <w:abstractNumId w:val="13"/>
+  </w:num>
+  <w:num w:numId="11" w16cid:durableId="555434114">
+    <w:abstractNumId w:val="10"/>
+  </w:num>
+  <w:num w:numId="12" w16cid:durableId="1530993960">
+    <w:abstractNumId w:val="11"/>
+  </w:num>
+  <w:num w:numId="13" w16cid:durableId="1756825744">
     <w:abstractNumId w:val="12"/>
   </w:num>
-  <w:num w:numId="11" w16cid:durableId="555434114">
+  <w:num w:numId="14" w16cid:durableId="881786884">
+    <w:abstractNumId w:val="14"/>
+  </w:num>
+  <w:num w:numId="15" w16cid:durableId="583219454">
     <w:abstractNumId w:val="9"/>
-  </w:num>
-  <w:num w:numId="12" w16cid:durableId="1530993960">
-    <w:abstractNumId w:val="10"/>
-  </w:num>
-  <w:num w:numId="13" w16cid:durableId="1756825744">
-    <w:abstractNumId w:val="11"/>
-  </w:num>
-  <w:num w:numId="14" w16cid:durableId="881786884">
-    <w:abstractNumId w:val="13"/>
   </w:num>
 </w:numbering>
 </file>
@@ -10236,7 +12881,6 @@
   <w:style w:type="character" w:default="1" w:styleId="VarsaylanParagrafYazTipi">
     <w:name w:val="Default Paragraph Font"/>
     <w:uiPriority w:val="1"/>
-    <w:semiHidden/>
     <w:unhideWhenUsed/>
   </w:style>
   <w:style w:type="table" w:default="1" w:styleId="NormalTablo">

</xml_diff>

<commit_message>
finalize team member names and responsibilities
</commit_message>
<xml_diff>
--- a/REPORT.docx
+++ b/REPORT.docx
@@ -253,18 +253,16 @@
           <w:sz w:val="36"/>
           <w:szCs w:val="36"/>
         </w:rPr>
-        <w:t>Fatma Gizem KANIK…………………</w:t>
-      </w:r>
-      <w:proofErr w:type="gramStart"/>
+        <w:t>Fatma Gizem KANIK………</w:t>
+      </w:r>
       <w:r>
         <w:rPr>
           <w:rFonts w:ascii="Times New Roman" w:hAnsi="Times New Roman" w:cs="Times New Roman"/>
           <w:sz w:val="36"/>
           <w:szCs w:val="36"/>
         </w:rPr>
-        <w:t>…..</w:t>
-      </w:r>
-      <w:proofErr w:type="gramEnd"/>
+        <w:t>200106006014</w:t>
+      </w:r>
     </w:p>
     <w:p>
       <w:pPr>
@@ -1932,8 +1930,18 @@
                 <w:b/>
                 <w:sz w:val="18"/>
               </w:rPr>
-              <w:t>Teammate 2</w:t>
-            </w:r>
+              <w:t xml:space="preserve">Gizem </w:t>
+            </w:r>
+            <w:proofErr w:type="spellStart"/>
+            <w:r>
+              <w:rPr>
+                <w:rFonts w:ascii="Times New Roman" w:hAnsi="Times New Roman" w:cs="Times New Roman"/>
+                <w:b/>
+                <w:sz w:val="18"/>
+              </w:rPr>
+              <w:t>Kanık</w:t>
+            </w:r>
+            <w:proofErr w:type="spellEnd"/>
           </w:p>
         </w:tc>
         <w:tc>
@@ -1954,7 +1962,7 @@
                 <w:b/>
                 <w:sz w:val="18"/>
               </w:rPr>
-              <w:t>Planning-based method / offline RL / multi-agent component</w:t>
+              <w:t>Planning-based dispatch policy, evaluation pipeline, planning policy analysis, documentation</w:t>
             </w:r>
           </w:p>
         </w:tc>
@@ -1966,20 +1974,6 @@
           <w:rFonts w:ascii="Times New Roman" w:hAnsi="Times New Roman" w:cs="Times New Roman"/>
         </w:rPr>
       </w:pPr>
-    </w:p>
-    <w:p>
-      <w:pPr>
-        <w:pStyle w:val="GlAlnt"/>
-        <w:rPr>
-          <w:rFonts w:ascii="Times New Roman" w:hAnsi="Times New Roman" w:cs="Times New Roman"/>
-        </w:rPr>
-      </w:pPr>
-      <w:r>
-        <w:rPr>
-          <w:rFonts w:ascii="Times New Roman" w:hAnsi="Times New Roman" w:cs="Times New Roman"/>
-        </w:rPr>
-        <w:t>Note: The role table should be updated according to the final contribution split before submission.</w:t>
-      </w:r>
     </w:p>
     <w:p>
       <w:pPr>
@@ -12881,6 +12875,7 @@
   <w:style w:type="character" w:default="1" w:styleId="VarsaylanParagrafYazTipi">
     <w:name w:val="Default Paragraph Font"/>
     <w:uiPriority w:val="1"/>
+    <w:semiHidden/>
     <w:unhideWhenUsed/>
   </w:style>
   <w:style w:type="table" w:default="1" w:styleId="NormalTablo">

</xml_diff>

<commit_message>
finalize report with role B documentation
</commit_message>
<xml_diff>
--- a/REPORT.docx
+++ b/REPORT.docx
@@ -1854,15 +1854,31 @@
             <w:pPr>
               <w:rPr>
                 <w:rFonts w:ascii="Times New Roman" w:hAnsi="Times New Roman" w:cs="Times New Roman"/>
+                <w:b/>
+                <w:bCs/>
               </w:rPr>
             </w:pPr>
+            <w:proofErr w:type="spellStart"/>
             <w:r>
               <w:rPr>
                 <w:rFonts w:ascii="Times New Roman" w:hAnsi="Times New Roman" w:cs="Times New Roman"/>
                 <w:b/>
+                <w:bCs/>
                 <w:sz w:val="18"/>
-              </w:rPr>
-              <w:t>Teammate 1</w:t>
+                <w:szCs w:val="20"/>
+              </w:rPr>
+              <w:t>Doğuhan</w:t>
+            </w:r>
+            <w:proofErr w:type="spellEnd"/>
+            <w:r>
+              <w:rPr>
+                <w:rFonts w:ascii="Times New Roman" w:hAnsi="Times New Roman" w:cs="Times New Roman"/>
+                <w:b/>
+                <w:bCs/>
+                <w:sz w:val="18"/>
+                <w:szCs w:val="20"/>
+              </w:rPr>
+              <w:t xml:space="preserve"> Duman</w:t>
             </w:r>
           </w:p>
         </w:tc>
@@ -7335,19 +7351,13 @@
     </w:p>
     <w:p>
       <w:pPr>
-        <w:spacing w:after="80"/>
-        <w:rPr>
-          <w:rFonts w:ascii="Times New Roman" w:hAnsi="Times New Roman" w:cs="Times New Roman"/>
-          <w:b/>
-          <w:bCs/>
-          <w:lang w:val="tr-TR"/>
-        </w:rPr>
-      </w:pPr>
-      <w:r>
-        <w:rPr>
-          <w:rFonts w:ascii="Times New Roman" w:hAnsi="Times New Roman" w:cs="Times New Roman"/>
-          <w:b/>
-          <w:bCs/>
+        <w:pStyle w:val="Balk2"/>
+        <w:rPr>
+          <w:lang w:val="tr-TR"/>
+        </w:rPr>
+      </w:pPr>
+      <w:r>
+        <w:rPr>
           <w:lang w:val="tr-TR"/>
         </w:rPr>
         <w:t>9A. Planning-</w:t>
@@ -7355,9 +7365,6 @@
       <w:proofErr w:type="spellStart"/>
       <w:r>
         <w:rPr>
-          <w:rFonts w:ascii="Times New Roman" w:hAnsi="Times New Roman" w:cs="Times New Roman"/>
-          <w:b/>
-          <w:bCs/>
           <w:lang w:val="tr-TR"/>
         </w:rPr>
         <w:t>Based</w:t>
@@ -7365,9 +7372,6 @@
       <w:proofErr w:type="spellEnd"/>
       <w:r>
         <w:rPr>
-          <w:rFonts w:ascii="Times New Roman" w:hAnsi="Times New Roman" w:cs="Times New Roman"/>
-          <w:b/>
-          <w:bCs/>
           <w:lang w:val="tr-TR"/>
         </w:rPr>
         <w:t xml:space="preserve"> </w:t>
@@ -7375,9 +7379,6 @@
       <w:proofErr w:type="spellStart"/>
       <w:r>
         <w:rPr>
-          <w:rFonts w:ascii="Times New Roman" w:hAnsi="Times New Roman" w:cs="Times New Roman"/>
-          <w:b/>
-          <w:bCs/>
           <w:lang w:val="tr-TR"/>
         </w:rPr>
         <w:t>Dispatch</w:t>
@@ -7385,9 +7386,6 @@
       <w:proofErr w:type="spellEnd"/>
       <w:r>
         <w:rPr>
-          <w:rFonts w:ascii="Times New Roman" w:hAnsi="Times New Roman" w:cs="Times New Roman"/>
-          <w:b/>
-          <w:bCs/>
           <w:lang w:val="tr-TR"/>
         </w:rPr>
         <w:t xml:space="preserve"> </w:t>
@@ -7395,9 +7393,6 @@
       <w:proofErr w:type="spellStart"/>
       <w:r>
         <w:rPr>
-          <w:rFonts w:ascii="Times New Roman" w:hAnsi="Times New Roman" w:cs="Times New Roman"/>
-          <w:b/>
-          <w:bCs/>
           <w:lang w:val="tr-TR"/>
         </w:rPr>
         <w:t>Policy</w:t>
@@ -7405,9 +7400,6 @@
       <w:proofErr w:type="spellEnd"/>
       <w:r>
         <w:rPr>
-          <w:rFonts w:ascii="Times New Roman" w:hAnsi="Times New Roman" w:cs="Times New Roman"/>
-          <w:b/>
-          <w:bCs/>
           <w:lang w:val="tr-TR"/>
         </w:rPr>
         <w:t xml:space="preserve"> (Role C)</w:t>
@@ -7426,7 +7418,7 @@
           <w:rFonts w:ascii="Times New Roman" w:hAnsi="Times New Roman" w:cs="Times New Roman"/>
           <w:lang w:val="tr-TR"/>
         </w:rPr>
-        <w:t xml:space="preserve">As </w:t>
+        <w:t>As the planning-</w:t>
       </w:r>
       <w:proofErr w:type="spellStart"/>
       <w:r>
@@ -7434,7 +7426,7 @@
           <w:rFonts w:ascii="Times New Roman" w:hAnsi="Times New Roman" w:cs="Times New Roman"/>
           <w:lang w:val="tr-TR"/>
         </w:rPr>
-        <w:t>the</w:t>
+        <w:t>method</w:t>
       </w:r>
       <w:proofErr w:type="spellEnd"/>
       <w:r>
@@ -7450,7 +7442,7 @@
           <w:rFonts w:ascii="Times New Roman" w:hAnsi="Times New Roman" w:cs="Times New Roman"/>
           <w:lang w:val="tr-TR"/>
         </w:rPr>
-        <w:t>planning-method</w:t>
+        <w:t>contribution</w:t>
       </w:r>
       <w:proofErr w:type="spellEnd"/>
       <w:r>
@@ -7458,7 +7450,7 @@
           <w:rFonts w:ascii="Times New Roman" w:hAnsi="Times New Roman" w:cs="Times New Roman"/>
           <w:lang w:val="tr-TR"/>
         </w:rPr>
-        <w:t xml:space="preserve"> </w:t>
+        <w:t>, a planning-</w:t>
       </w:r>
       <w:proofErr w:type="spellStart"/>
       <w:r>
@@ -7466,23 +7458,7 @@
           <w:rFonts w:ascii="Times New Roman" w:hAnsi="Times New Roman" w:cs="Times New Roman"/>
           <w:lang w:val="tr-TR"/>
         </w:rPr>
-        <w:t>contribution</w:t>
-      </w:r>
-      <w:proofErr w:type="spellEnd"/>
-      <w:r>
-        <w:rPr>
-          <w:rFonts w:ascii="Times New Roman" w:hAnsi="Times New Roman" w:cs="Times New Roman"/>
-          <w:lang w:val="tr-TR"/>
-        </w:rPr>
-        <w:t xml:space="preserve">, a </w:t>
-      </w:r>
-      <w:proofErr w:type="spellStart"/>
-      <w:r>
-        <w:rPr>
-          <w:rFonts w:ascii="Times New Roman" w:hAnsi="Times New Roman" w:cs="Times New Roman"/>
-          <w:lang w:val="tr-TR"/>
-        </w:rPr>
-        <w:t>planning-inspired</w:t>
+        <w:t>inspired</w:t>
       </w:r>
       <w:proofErr w:type="spellEnd"/>
       <w:r>
@@ -7643,6 +7619,22 @@
           <w:rFonts w:ascii="Times New Roman" w:hAnsi="Times New Roman" w:cs="Times New Roman"/>
           <w:lang w:val="tr-TR"/>
         </w:rPr>
+        <w:t xml:space="preserve"> the </w:t>
+      </w:r>
+      <w:proofErr w:type="spellStart"/>
+      <w:r>
+        <w:rPr>
+          <w:rFonts w:ascii="Times New Roman" w:hAnsi="Times New Roman" w:cs="Times New Roman"/>
+          <w:lang w:val="tr-TR"/>
+        </w:rPr>
+        <w:t>improved</w:t>
+      </w:r>
+      <w:proofErr w:type="spellEnd"/>
+      <w:r>
+        <w:rPr>
+          <w:rFonts w:ascii="Times New Roman" w:hAnsi="Times New Roman" w:cs="Times New Roman"/>
+          <w:lang w:val="tr-TR"/>
+        </w:rPr>
         <w:t xml:space="preserve"> </w:t>
       </w:r>
       <w:proofErr w:type="spellStart"/>
@@ -7651,7 +7643,7 @@
           <w:rFonts w:ascii="Times New Roman" w:hAnsi="Times New Roman" w:cs="Times New Roman"/>
           <w:lang w:val="tr-TR"/>
         </w:rPr>
-        <w:t>the</w:t>
+        <w:t>greedy</w:t>
       </w:r>
       <w:proofErr w:type="spellEnd"/>
       <w:r>
@@ -7667,7 +7659,7 @@
           <w:rFonts w:ascii="Times New Roman" w:hAnsi="Times New Roman" w:cs="Times New Roman"/>
           <w:lang w:val="tr-TR"/>
         </w:rPr>
-        <w:t>improved</w:t>
+        <w:t>baseline</w:t>
       </w:r>
       <w:proofErr w:type="spellEnd"/>
       <w:r>
@@ -7675,71 +7667,7 @@
           <w:rFonts w:ascii="Times New Roman" w:hAnsi="Times New Roman" w:cs="Times New Roman"/>
           <w:lang w:val="tr-TR"/>
         </w:rPr>
-        <w:t xml:space="preserve"> </w:t>
-      </w:r>
-      <w:proofErr w:type="spellStart"/>
-      <w:r>
-        <w:rPr>
-          <w:rFonts w:ascii="Times New Roman" w:hAnsi="Times New Roman" w:cs="Times New Roman"/>
-          <w:lang w:val="tr-TR"/>
-        </w:rPr>
-        <w:t>greedy</w:t>
-      </w:r>
-      <w:proofErr w:type="spellEnd"/>
-      <w:r>
-        <w:rPr>
-          <w:rFonts w:ascii="Times New Roman" w:hAnsi="Times New Roman" w:cs="Times New Roman"/>
-          <w:lang w:val="tr-TR"/>
-        </w:rPr>
-        <w:t xml:space="preserve"> </w:t>
-      </w:r>
-      <w:proofErr w:type="spellStart"/>
-      <w:r>
-        <w:rPr>
-          <w:rFonts w:ascii="Times New Roman" w:hAnsi="Times New Roman" w:cs="Times New Roman"/>
-          <w:lang w:val="tr-TR"/>
-        </w:rPr>
-        <w:t>baseline</w:t>
-      </w:r>
-      <w:proofErr w:type="spellEnd"/>
-      <w:r>
-        <w:rPr>
-          <w:rFonts w:ascii="Times New Roman" w:hAnsi="Times New Roman" w:cs="Times New Roman"/>
-          <w:lang w:val="tr-TR"/>
-        </w:rPr>
-        <w:t xml:space="preserve">, </w:t>
-      </w:r>
-      <w:proofErr w:type="spellStart"/>
-      <w:r>
-        <w:rPr>
-          <w:rFonts w:ascii="Times New Roman" w:hAnsi="Times New Roman" w:cs="Times New Roman"/>
-          <w:lang w:val="tr-TR"/>
-        </w:rPr>
-        <w:t>the</w:t>
-      </w:r>
-      <w:proofErr w:type="spellEnd"/>
-      <w:r>
-        <w:rPr>
-          <w:rFonts w:ascii="Times New Roman" w:hAnsi="Times New Roman" w:cs="Times New Roman"/>
-          <w:lang w:val="tr-TR"/>
-        </w:rPr>
-        <w:t xml:space="preserve"> </w:t>
-      </w:r>
-      <w:proofErr w:type="spellStart"/>
-      <w:r>
-        <w:rPr>
-          <w:rFonts w:ascii="Times New Roman" w:hAnsi="Times New Roman" w:cs="Times New Roman"/>
-          <w:lang w:val="tr-TR"/>
-        </w:rPr>
-        <w:t>planning</w:t>
-      </w:r>
-      <w:proofErr w:type="spellEnd"/>
-      <w:r>
-        <w:rPr>
-          <w:rFonts w:ascii="Times New Roman" w:hAnsi="Times New Roman" w:cs="Times New Roman"/>
-          <w:lang w:val="tr-TR"/>
-        </w:rPr>
-        <w:t xml:space="preserve"> </w:t>
+        <w:t xml:space="preserve">, the planning </w:t>
       </w:r>
       <w:proofErr w:type="spellStart"/>
       <w:r>
@@ -8267,7 +8195,7 @@
           <w:rFonts w:ascii="Times New Roman" w:hAnsi="Times New Roman" w:cs="Times New Roman"/>
           <w:lang w:val="tr-TR"/>
         </w:rPr>
-        <w:t xml:space="preserve">, </w:t>
+        <w:t xml:space="preserve">, the </w:t>
       </w:r>
       <w:proofErr w:type="spellStart"/>
       <w:r>
@@ -8275,7 +8203,7 @@
           <w:rFonts w:ascii="Times New Roman" w:hAnsi="Times New Roman" w:cs="Times New Roman"/>
           <w:lang w:val="tr-TR"/>
         </w:rPr>
-        <w:t>the</w:t>
+        <w:t>policy</w:t>
       </w:r>
       <w:proofErr w:type="spellEnd"/>
       <w:r>
@@ -8291,7 +8219,7 @@
           <w:rFonts w:ascii="Times New Roman" w:hAnsi="Times New Roman" w:cs="Times New Roman"/>
           <w:lang w:val="tr-TR"/>
         </w:rPr>
-        <w:t>policy</w:t>
+        <w:t>selects</w:t>
       </w:r>
       <w:proofErr w:type="spellEnd"/>
       <w:r>
@@ -8299,7 +8227,7 @@
           <w:rFonts w:ascii="Times New Roman" w:hAnsi="Times New Roman" w:cs="Times New Roman"/>
           <w:lang w:val="tr-TR"/>
         </w:rPr>
-        <w:t xml:space="preserve"> </w:t>
+        <w:t xml:space="preserve"> the </w:t>
       </w:r>
       <w:proofErr w:type="spellStart"/>
       <w:r>
@@ -8307,7 +8235,7 @@
           <w:rFonts w:ascii="Times New Roman" w:hAnsi="Times New Roman" w:cs="Times New Roman"/>
           <w:lang w:val="tr-TR"/>
         </w:rPr>
-        <w:t>selects</w:t>
+        <w:t>assignment</w:t>
       </w:r>
       <w:proofErr w:type="spellEnd"/>
       <w:r>
@@ -8315,7 +8243,7 @@
           <w:rFonts w:ascii="Times New Roman" w:hAnsi="Times New Roman" w:cs="Times New Roman"/>
           <w:lang w:val="tr-TR"/>
         </w:rPr>
-        <w:t xml:space="preserve"> </w:t>
+        <w:t xml:space="preserve"> with the </w:t>
       </w:r>
       <w:proofErr w:type="spellStart"/>
       <w:r>
@@ -8323,7 +8251,7 @@
           <w:rFonts w:ascii="Times New Roman" w:hAnsi="Times New Roman" w:cs="Times New Roman"/>
           <w:lang w:val="tr-TR"/>
         </w:rPr>
-        <w:t>the</w:t>
+        <w:t>lowest</w:t>
       </w:r>
       <w:proofErr w:type="spellEnd"/>
       <w:r>
@@ -8331,87 +8259,7 @@
           <w:rFonts w:ascii="Times New Roman" w:hAnsi="Times New Roman" w:cs="Times New Roman"/>
           <w:lang w:val="tr-TR"/>
         </w:rPr>
-        <w:t xml:space="preserve"> </w:t>
-      </w:r>
-      <w:proofErr w:type="spellStart"/>
-      <w:r>
-        <w:rPr>
-          <w:rFonts w:ascii="Times New Roman" w:hAnsi="Times New Roman" w:cs="Times New Roman"/>
-          <w:lang w:val="tr-TR"/>
-        </w:rPr>
-        <w:t>assignment</w:t>
-      </w:r>
-      <w:proofErr w:type="spellEnd"/>
-      <w:r>
-        <w:rPr>
-          <w:rFonts w:ascii="Times New Roman" w:hAnsi="Times New Roman" w:cs="Times New Roman"/>
-          <w:lang w:val="tr-TR"/>
-        </w:rPr>
-        <w:t xml:space="preserve"> </w:t>
-      </w:r>
-      <w:proofErr w:type="spellStart"/>
-      <w:r>
-        <w:rPr>
-          <w:rFonts w:ascii="Times New Roman" w:hAnsi="Times New Roman" w:cs="Times New Roman"/>
-          <w:lang w:val="tr-TR"/>
-        </w:rPr>
-        <w:t>with</w:t>
-      </w:r>
-      <w:proofErr w:type="spellEnd"/>
-      <w:r>
-        <w:rPr>
-          <w:rFonts w:ascii="Times New Roman" w:hAnsi="Times New Roman" w:cs="Times New Roman"/>
-          <w:lang w:val="tr-TR"/>
-        </w:rPr>
-        <w:t xml:space="preserve"> </w:t>
-      </w:r>
-      <w:proofErr w:type="spellStart"/>
-      <w:r>
-        <w:rPr>
-          <w:rFonts w:ascii="Times New Roman" w:hAnsi="Times New Roman" w:cs="Times New Roman"/>
-          <w:lang w:val="tr-TR"/>
-        </w:rPr>
-        <w:t>the</w:t>
-      </w:r>
-      <w:proofErr w:type="spellEnd"/>
-      <w:r>
-        <w:rPr>
-          <w:rFonts w:ascii="Times New Roman" w:hAnsi="Times New Roman" w:cs="Times New Roman"/>
-          <w:lang w:val="tr-TR"/>
-        </w:rPr>
-        <w:t xml:space="preserve"> </w:t>
-      </w:r>
-      <w:proofErr w:type="spellStart"/>
-      <w:r>
-        <w:rPr>
-          <w:rFonts w:ascii="Times New Roman" w:hAnsi="Times New Roman" w:cs="Times New Roman"/>
-          <w:lang w:val="tr-TR"/>
-        </w:rPr>
-        <w:t>lowest</w:t>
-      </w:r>
-      <w:proofErr w:type="spellEnd"/>
-      <w:r>
-        <w:rPr>
-          <w:rFonts w:ascii="Times New Roman" w:hAnsi="Times New Roman" w:cs="Times New Roman"/>
-          <w:lang w:val="tr-TR"/>
-        </w:rPr>
-        <w:t xml:space="preserve"> </w:t>
-      </w:r>
-      <w:proofErr w:type="spellStart"/>
-      <w:r>
-        <w:rPr>
-          <w:rFonts w:ascii="Times New Roman" w:hAnsi="Times New Roman" w:cs="Times New Roman"/>
-          <w:lang w:val="tr-TR"/>
-        </w:rPr>
-        <w:t>planning</w:t>
-      </w:r>
-      <w:proofErr w:type="spellEnd"/>
-      <w:r>
-        <w:rPr>
-          <w:rFonts w:ascii="Times New Roman" w:hAnsi="Times New Roman" w:cs="Times New Roman"/>
-          <w:lang w:val="tr-TR"/>
-        </w:rPr>
-        <w:t xml:space="preserve"> </w:t>
+        <w:t xml:space="preserve"> planning </w:t>
       </w:r>
       <w:proofErr w:type="spellStart"/>
       <w:r>
@@ -8438,13 +8286,20 @@
           <w:lang w:val="tr-TR"/>
         </w:rPr>
       </w:pPr>
+      <w:r>
+        <w:rPr>
+          <w:rFonts w:ascii="Times New Roman" w:hAnsi="Times New Roman" w:cs="Times New Roman"/>
+          <w:lang w:val="tr-TR"/>
+        </w:rPr>
+        <w:t xml:space="preserve">The </w:t>
+      </w:r>
       <w:proofErr w:type="spellStart"/>
       <w:r>
         <w:rPr>
           <w:rFonts w:ascii="Times New Roman" w:hAnsi="Times New Roman" w:cs="Times New Roman"/>
           <w:lang w:val="tr-TR"/>
         </w:rPr>
-        <w:t>The</w:t>
+        <w:t>policy</w:t>
       </w:r>
       <w:proofErr w:type="spellEnd"/>
       <w:r>
@@ -8460,7 +8315,7 @@
           <w:rFonts w:ascii="Times New Roman" w:hAnsi="Times New Roman" w:cs="Times New Roman"/>
           <w:lang w:val="tr-TR"/>
         </w:rPr>
-        <w:t>policy</w:t>
+        <w:t>was</w:t>
       </w:r>
       <w:proofErr w:type="spellEnd"/>
       <w:r>
@@ -8476,7 +8331,7 @@
           <w:rFonts w:ascii="Times New Roman" w:hAnsi="Times New Roman" w:cs="Times New Roman"/>
           <w:lang w:val="tr-TR"/>
         </w:rPr>
-        <w:t>was</w:t>
+        <w:t>evaluated</w:t>
       </w:r>
       <w:proofErr w:type="spellEnd"/>
       <w:r>
@@ -8492,7 +8347,7 @@
           <w:rFonts w:ascii="Times New Roman" w:hAnsi="Times New Roman" w:cs="Times New Roman"/>
           <w:lang w:val="tr-TR"/>
         </w:rPr>
-        <w:t>evaluated</w:t>
+        <w:t>using</w:t>
       </w:r>
       <w:proofErr w:type="spellEnd"/>
       <w:r>
@@ -8500,39 +8355,7 @@
           <w:rFonts w:ascii="Times New Roman" w:hAnsi="Times New Roman" w:cs="Times New Roman"/>
           <w:lang w:val="tr-TR"/>
         </w:rPr>
-        <w:t xml:space="preserve"> </w:t>
-      </w:r>
-      <w:proofErr w:type="spellStart"/>
-      <w:r>
-        <w:rPr>
-          <w:rFonts w:ascii="Times New Roman" w:hAnsi="Times New Roman" w:cs="Times New Roman"/>
-          <w:lang w:val="tr-TR"/>
-        </w:rPr>
-        <w:t>using</w:t>
-      </w:r>
-      <w:proofErr w:type="spellEnd"/>
-      <w:r>
-        <w:rPr>
-          <w:rFonts w:ascii="Times New Roman" w:hAnsi="Times New Roman" w:cs="Times New Roman"/>
-          <w:lang w:val="tr-TR"/>
-        </w:rPr>
-        <w:t xml:space="preserve"> </w:t>
-      </w:r>
-      <w:proofErr w:type="spellStart"/>
-      <w:r>
-        <w:rPr>
-          <w:rFonts w:ascii="Times New Roman" w:hAnsi="Times New Roman" w:cs="Times New Roman"/>
-          <w:lang w:val="tr-TR"/>
-        </w:rPr>
-        <w:t>the</w:t>
-      </w:r>
-      <w:proofErr w:type="spellEnd"/>
-      <w:r>
-        <w:rPr>
-          <w:rFonts w:ascii="Times New Roman" w:hAnsi="Times New Roman" w:cs="Times New Roman"/>
-          <w:lang w:val="tr-TR"/>
-        </w:rPr>
-        <w:t xml:space="preserve"> </w:t>
+        <w:t xml:space="preserve"> the </w:t>
       </w:r>
       <w:proofErr w:type="spellStart"/>
       <w:r>
@@ -9112,13 +8935,20 @@
           <w:lang w:val="tr-TR"/>
         </w:rPr>
       </w:pPr>
+      <w:r>
+        <w:rPr>
+          <w:rFonts w:ascii="Times New Roman" w:hAnsi="Times New Roman" w:cs="Times New Roman"/>
+          <w:lang w:val="tr-TR"/>
+        </w:rPr>
+        <w:t xml:space="preserve">The planning </w:t>
+      </w:r>
       <w:proofErr w:type="spellStart"/>
       <w:r>
         <w:rPr>
           <w:rFonts w:ascii="Times New Roman" w:hAnsi="Times New Roman" w:cs="Times New Roman"/>
           <w:lang w:val="tr-TR"/>
         </w:rPr>
-        <w:t>The</w:t>
+        <w:t>policy</w:t>
       </w:r>
       <w:proofErr w:type="spellEnd"/>
       <w:r>
@@ -9134,7 +8964,7 @@
           <w:rFonts w:ascii="Times New Roman" w:hAnsi="Times New Roman" w:cs="Times New Roman"/>
           <w:lang w:val="tr-TR"/>
         </w:rPr>
-        <w:t>planning</w:t>
+        <w:t>improved</w:t>
       </w:r>
       <w:proofErr w:type="spellEnd"/>
       <w:r>
@@ -9150,7 +8980,7 @@
           <w:rFonts w:ascii="Times New Roman" w:hAnsi="Times New Roman" w:cs="Times New Roman"/>
           <w:lang w:val="tr-TR"/>
         </w:rPr>
-        <w:t>policy</w:t>
+        <w:t>cost_per_order</w:t>
       </w:r>
       <w:proofErr w:type="spellEnd"/>
       <w:r>
@@ -9158,6 +8988,38 @@
           <w:rFonts w:ascii="Times New Roman" w:hAnsi="Times New Roman" w:cs="Times New Roman"/>
           <w:lang w:val="tr-TR"/>
         </w:rPr>
+        <w:t xml:space="preserve"> by </w:t>
+      </w:r>
+      <w:proofErr w:type="spellStart"/>
+      <w:r>
+        <w:rPr>
+          <w:rFonts w:ascii="Times New Roman" w:hAnsi="Times New Roman" w:cs="Times New Roman"/>
+          <w:lang w:val="tr-TR"/>
+        </w:rPr>
+        <w:t>approximately</w:t>
+      </w:r>
+      <w:proofErr w:type="spellEnd"/>
+      <w:r>
+        <w:rPr>
+          <w:rFonts w:ascii="Times New Roman" w:hAnsi="Times New Roman" w:cs="Times New Roman"/>
+          <w:lang w:val="tr-TR"/>
+        </w:rPr>
+        <w:t xml:space="preserve"> 15.5% </w:t>
+      </w:r>
+      <w:proofErr w:type="spellStart"/>
+      <w:r>
+        <w:rPr>
+          <w:rFonts w:ascii="Times New Roman" w:hAnsi="Times New Roman" w:cs="Times New Roman"/>
+          <w:lang w:val="tr-TR"/>
+        </w:rPr>
+        <w:t>compared</w:t>
+      </w:r>
+      <w:proofErr w:type="spellEnd"/>
+      <w:r>
+        <w:rPr>
+          <w:rFonts w:ascii="Times New Roman" w:hAnsi="Times New Roman" w:cs="Times New Roman"/>
+          <w:lang w:val="tr-TR"/>
+        </w:rPr>
         <w:t xml:space="preserve"> </w:t>
       </w:r>
       <w:proofErr w:type="spellStart"/>
@@ -9166,6 +9028,38 @@
           <w:rFonts w:ascii="Times New Roman" w:hAnsi="Times New Roman" w:cs="Times New Roman"/>
           <w:lang w:val="tr-TR"/>
         </w:rPr>
+        <w:t>to</w:t>
+      </w:r>
+      <w:proofErr w:type="spellEnd"/>
+      <w:r>
+        <w:rPr>
+          <w:rFonts w:ascii="Times New Roman" w:hAnsi="Times New Roman" w:cs="Times New Roman"/>
+          <w:lang w:val="tr-TR"/>
+        </w:rPr>
+        <w:t xml:space="preserve"> the </w:t>
+      </w:r>
+      <w:proofErr w:type="spellStart"/>
+      <w:r>
+        <w:rPr>
+          <w:rFonts w:ascii="Times New Roman" w:hAnsi="Times New Roman" w:cs="Times New Roman"/>
+          <w:lang w:val="tr-TR"/>
+        </w:rPr>
+        <w:t>default</w:t>
+      </w:r>
+      <w:proofErr w:type="spellEnd"/>
+      <w:r>
+        <w:rPr>
+          <w:rFonts w:ascii="Times New Roman" w:hAnsi="Times New Roman" w:cs="Times New Roman"/>
+          <w:lang w:val="tr-TR"/>
+        </w:rPr>
+        <w:t xml:space="preserve"> </w:t>
+      </w:r>
+      <w:proofErr w:type="spellStart"/>
+      <w:r>
+        <w:rPr>
+          <w:rFonts w:ascii="Times New Roman" w:hAnsi="Times New Roman" w:cs="Times New Roman"/>
+          <w:lang w:val="tr-TR"/>
+        </w:rPr>
         <w:t>improved</w:t>
       </w:r>
       <w:proofErr w:type="spellEnd"/>
@@ -9182,7 +9076,7 @@
           <w:rFonts w:ascii="Times New Roman" w:hAnsi="Times New Roman" w:cs="Times New Roman"/>
           <w:lang w:val="tr-TR"/>
         </w:rPr>
-        <w:t>cost_per_order</w:t>
+        <w:t>greedy</w:t>
       </w:r>
       <w:proofErr w:type="spellEnd"/>
       <w:r>
@@ -9198,7 +9092,7 @@
           <w:rFonts w:ascii="Times New Roman" w:hAnsi="Times New Roman" w:cs="Times New Roman"/>
           <w:lang w:val="tr-TR"/>
         </w:rPr>
-        <w:t>by</w:t>
+        <w:t>configuration</w:t>
       </w:r>
       <w:proofErr w:type="spellEnd"/>
       <w:r>
@@ -9214,7 +9108,7 @@
           <w:rFonts w:ascii="Times New Roman" w:hAnsi="Times New Roman" w:cs="Times New Roman"/>
           <w:lang w:val="tr-TR"/>
         </w:rPr>
-        <w:t>approximately</w:t>
+        <w:t>while</w:t>
       </w:r>
       <w:proofErr w:type="spellEnd"/>
       <w:r>
@@ -9222,7 +9116,7 @@
           <w:rFonts w:ascii="Times New Roman" w:hAnsi="Times New Roman" w:cs="Times New Roman"/>
           <w:lang w:val="tr-TR"/>
         </w:rPr>
-        <w:t xml:space="preserve"> 15.5% </w:t>
+        <w:t xml:space="preserve"> </w:t>
       </w:r>
       <w:proofErr w:type="spellStart"/>
       <w:r>
@@ -9230,7 +9124,7 @@
           <w:rFonts w:ascii="Times New Roman" w:hAnsi="Times New Roman" w:cs="Times New Roman"/>
           <w:lang w:val="tr-TR"/>
         </w:rPr>
-        <w:t>compared</w:t>
+        <w:t>increasing</w:t>
       </w:r>
       <w:proofErr w:type="spellEnd"/>
       <w:r>
@@ -9238,151 +9132,7 @@
           <w:rFonts w:ascii="Times New Roman" w:hAnsi="Times New Roman" w:cs="Times New Roman"/>
           <w:lang w:val="tr-TR"/>
         </w:rPr>
-        <w:t xml:space="preserve"> </w:t>
-      </w:r>
-      <w:proofErr w:type="spellStart"/>
-      <w:r>
-        <w:rPr>
-          <w:rFonts w:ascii="Times New Roman" w:hAnsi="Times New Roman" w:cs="Times New Roman"/>
-          <w:lang w:val="tr-TR"/>
-        </w:rPr>
-        <w:t>to</w:t>
-      </w:r>
-      <w:proofErr w:type="spellEnd"/>
-      <w:r>
-        <w:rPr>
-          <w:rFonts w:ascii="Times New Roman" w:hAnsi="Times New Roman" w:cs="Times New Roman"/>
-          <w:lang w:val="tr-TR"/>
-        </w:rPr>
-        <w:t xml:space="preserve"> </w:t>
-      </w:r>
-      <w:proofErr w:type="spellStart"/>
-      <w:r>
-        <w:rPr>
-          <w:rFonts w:ascii="Times New Roman" w:hAnsi="Times New Roman" w:cs="Times New Roman"/>
-          <w:lang w:val="tr-TR"/>
-        </w:rPr>
-        <w:t>the</w:t>
-      </w:r>
-      <w:proofErr w:type="spellEnd"/>
-      <w:r>
-        <w:rPr>
-          <w:rFonts w:ascii="Times New Roman" w:hAnsi="Times New Roman" w:cs="Times New Roman"/>
-          <w:lang w:val="tr-TR"/>
-        </w:rPr>
-        <w:t xml:space="preserve"> </w:t>
-      </w:r>
-      <w:proofErr w:type="spellStart"/>
-      <w:r>
-        <w:rPr>
-          <w:rFonts w:ascii="Times New Roman" w:hAnsi="Times New Roman" w:cs="Times New Roman"/>
-          <w:lang w:val="tr-TR"/>
-        </w:rPr>
-        <w:t>default</w:t>
-      </w:r>
-      <w:proofErr w:type="spellEnd"/>
-      <w:r>
-        <w:rPr>
-          <w:rFonts w:ascii="Times New Roman" w:hAnsi="Times New Roman" w:cs="Times New Roman"/>
-          <w:lang w:val="tr-TR"/>
-        </w:rPr>
-        <w:t xml:space="preserve"> </w:t>
-      </w:r>
-      <w:proofErr w:type="spellStart"/>
-      <w:r>
-        <w:rPr>
-          <w:rFonts w:ascii="Times New Roman" w:hAnsi="Times New Roman" w:cs="Times New Roman"/>
-          <w:lang w:val="tr-TR"/>
-        </w:rPr>
-        <w:t>improved</w:t>
-      </w:r>
-      <w:proofErr w:type="spellEnd"/>
-      <w:r>
-        <w:rPr>
-          <w:rFonts w:ascii="Times New Roman" w:hAnsi="Times New Roman" w:cs="Times New Roman"/>
-          <w:lang w:val="tr-TR"/>
-        </w:rPr>
-        <w:t xml:space="preserve"> </w:t>
-      </w:r>
-      <w:proofErr w:type="spellStart"/>
-      <w:r>
-        <w:rPr>
-          <w:rFonts w:ascii="Times New Roman" w:hAnsi="Times New Roman" w:cs="Times New Roman"/>
-          <w:lang w:val="tr-TR"/>
-        </w:rPr>
-        <w:t>greedy</w:t>
-      </w:r>
-      <w:proofErr w:type="spellEnd"/>
-      <w:r>
-        <w:rPr>
-          <w:rFonts w:ascii="Times New Roman" w:hAnsi="Times New Roman" w:cs="Times New Roman"/>
-          <w:lang w:val="tr-TR"/>
-        </w:rPr>
-        <w:t xml:space="preserve"> </w:t>
-      </w:r>
-      <w:proofErr w:type="spellStart"/>
-      <w:r>
-        <w:rPr>
-          <w:rFonts w:ascii="Times New Roman" w:hAnsi="Times New Roman" w:cs="Times New Roman"/>
-          <w:lang w:val="tr-TR"/>
-        </w:rPr>
-        <w:t>configuration</w:t>
-      </w:r>
-      <w:proofErr w:type="spellEnd"/>
-      <w:r>
-        <w:rPr>
-          <w:rFonts w:ascii="Times New Roman" w:hAnsi="Times New Roman" w:cs="Times New Roman"/>
-          <w:lang w:val="tr-TR"/>
-        </w:rPr>
-        <w:t xml:space="preserve"> </w:t>
-      </w:r>
-      <w:proofErr w:type="spellStart"/>
-      <w:r>
-        <w:rPr>
-          <w:rFonts w:ascii="Times New Roman" w:hAnsi="Times New Roman" w:cs="Times New Roman"/>
-          <w:lang w:val="tr-TR"/>
-        </w:rPr>
-        <w:t>while</w:t>
-      </w:r>
-      <w:proofErr w:type="spellEnd"/>
-      <w:r>
-        <w:rPr>
-          <w:rFonts w:ascii="Times New Roman" w:hAnsi="Times New Roman" w:cs="Times New Roman"/>
-          <w:lang w:val="tr-TR"/>
-        </w:rPr>
-        <w:t xml:space="preserve"> </w:t>
-      </w:r>
-      <w:proofErr w:type="spellStart"/>
-      <w:r>
-        <w:rPr>
-          <w:rFonts w:ascii="Times New Roman" w:hAnsi="Times New Roman" w:cs="Times New Roman"/>
-          <w:lang w:val="tr-TR"/>
-        </w:rPr>
-        <w:t>increasing</w:t>
-      </w:r>
-      <w:proofErr w:type="spellEnd"/>
-      <w:r>
-        <w:rPr>
-          <w:rFonts w:ascii="Times New Roman" w:hAnsi="Times New Roman" w:cs="Times New Roman"/>
-          <w:lang w:val="tr-TR"/>
-        </w:rPr>
-        <w:t xml:space="preserve"> </w:t>
-      </w:r>
-      <w:proofErr w:type="spellStart"/>
-      <w:r>
-        <w:rPr>
-          <w:rFonts w:ascii="Times New Roman" w:hAnsi="Times New Roman" w:cs="Times New Roman"/>
-          <w:lang w:val="tr-TR"/>
-        </w:rPr>
-        <w:t>the</w:t>
-      </w:r>
-      <w:proofErr w:type="spellEnd"/>
-      <w:r>
-        <w:rPr>
-          <w:rFonts w:ascii="Times New Roman" w:hAnsi="Times New Roman" w:cs="Times New Roman"/>
-          <w:lang w:val="tr-TR"/>
-        </w:rPr>
-        <w:t xml:space="preserve"> </w:t>
+        <w:t xml:space="preserve"> the </w:t>
       </w:r>
       <w:proofErr w:type="spellStart"/>
       <w:r>
@@ -9551,6 +9301,22 @@
           <w:rFonts w:ascii="Times New Roman" w:hAnsi="Times New Roman" w:cs="Times New Roman"/>
           <w:lang w:val="tr-TR"/>
         </w:rPr>
+        <w:t xml:space="preserve"> the </w:t>
+      </w:r>
+      <w:proofErr w:type="spellStart"/>
+      <w:r>
+        <w:rPr>
+          <w:rFonts w:ascii="Times New Roman" w:hAnsi="Times New Roman" w:cs="Times New Roman"/>
+          <w:lang w:val="tr-TR"/>
+        </w:rPr>
+        <w:t>best</w:t>
+      </w:r>
+      <w:proofErr w:type="spellEnd"/>
+      <w:r>
+        <w:rPr>
+          <w:rFonts w:ascii="Times New Roman" w:hAnsi="Times New Roman" w:cs="Times New Roman"/>
+          <w:lang w:val="tr-TR"/>
+        </w:rPr>
         <w:t xml:space="preserve"> </w:t>
       </w:r>
       <w:proofErr w:type="spellStart"/>
@@ -9559,7 +9325,7 @@
           <w:rFonts w:ascii="Times New Roman" w:hAnsi="Times New Roman" w:cs="Times New Roman"/>
           <w:lang w:val="tr-TR"/>
         </w:rPr>
-        <w:t>the</w:t>
+        <w:t>threshold-tuned</w:t>
       </w:r>
       <w:proofErr w:type="spellEnd"/>
       <w:r>
@@ -9575,7 +9341,7 @@
           <w:rFonts w:ascii="Times New Roman" w:hAnsi="Times New Roman" w:cs="Times New Roman"/>
           <w:lang w:val="tr-TR"/>
         </w:rPr>
-        <w:t>best</w:t>
+        <w:t>improved</w:t>
       </w:r>
       <w:proofErr w:type="spellEnd"/>
       <w:r>
@@ -9591,7 +9357,7 @@
           <w:rFonts w:ascii="Times New Roman" w:hAnsi="Times New Roman" w:cs="Times New Roman"/>
           <w:lang w:val="tr-TR"/>
         </w:rPr>
-        <w:t>threshold-tuned</w:t>
+        <w:t>greedy</w:t>
       </w:r>
       <w:proofErr w:type="spellEnd"/>
       <w:r>
@@ -9607,7 +9373,7 @@
           <w:rFonts w:ascii="Times New Roman" w:hAnsi="Times New Roman" w:cs="Times New Roman"/>
           <w:lang w:val="tr-TR"/>
         </w:rPr>
-        <w:t>improved</w:t>
+        <w:t>teacher</w:t>
       </w:r>
       <w:proofErr w:type="spellEnd"/>
       <w:r>
@@ -9615,6 +9381,38 @@
           <w:rFonts w:ascii="Times New Roman" w:hAnsi="Times New Roman" w:cs="Times New Roman"/>
           <w:lang w:val="tr-TR"/>
         </w:rPr>
+        <w:t xml:space="preserve"> (</w:t>
+      </w:r>
+      <w:proofErr w:type="spellStart"/>
+      <w:r>
+        <w:rPr>
+          <w:rFonts w:ascii="Times New Roman" w:hAnsi="Times New Roman" w:cs="Times New Roman"/>
+          <w:lang w:val="tr-TR"/>
+        </w:rPr>
+        <w:t>cost_per_order</w:t>
+      </w:r>
+      <w:proofErr w:type="spellEnd"/>
+      <w:r>
+        <w:rPr>
+          <w:rFonts w:ascii="Times New Roman" w:hAnsi="Times New Roman" w:cs="Times New Roman"/>
+          <w:lang w:val="tr-TR"/>
+        </w:rPr>
+        <w:t xml:space="preserve"> = 1.388), it </w:t>
+      </w:r>
+      <w:proofErr w:type="spellStart"/>
+      <w:r>
+        <w:rPr>
+          <w:rFonts w:ascii="Times New Roman" w:hAnsi="Times New Roman" w:cs="Times New Roman"/>
+          <w:lang w:val="tr-TR"/>
+        </w:rPr>
+        <w:t>demonstrated</w:t>
+      </w:r>
+      <w:proofErr w:type="spellEnd"/>
+      <w:r>
+        <w:rPr>
+          <w:rFonts w:ascii="Times New Roman" w:hAnsi="Times New Roman" w:cs="Times New Roman"/>
+          <w:lang w:val="tr-TR"/>
+        </w:rPr>
         <w:t xml:space="preserve"> </w:t>
       </w:r>
       <w:proofErr w:type="spellStart"/>
@@ -9623,7 +9421,7 @@
           <w:rFonts w:ascii="Times New Roman" w:hAnsi="Times New Roman" w:cs="Times New Roman"/>
           <w:lang w:val="tr-TR"/>
         </w:rPr>
-        <w:t>greedy</w:t>
+        <w:t>that</w:t>
       </w:r>
       <w:proofErr w:type="spellEnd"/>
       <w:r>
@@ -9631,7 +9429,7 @@
           <w:rFonts w:ascii="Times New Roman" w:hAnsi="Times New Roman" w:cs="Times New Roman"/>
           <w:lang w:val="tr-TR"/>
         </w:rPr>
-        <w:t xml:space="preserve"> </w:t>
+        <w:t xml:space="preserve"> planning-</w:t>
       </w:r>
       <w:proofErr w:type="spellStart"/>
       <w:r>
@@ -9639,71 +9437,7 @@
           <w:rFonts w:ascii="Times New Roman" w:hAnsi="Times New Roman" w:cs="Times New Roman"/>
           <w:lang w:val="tr-TR"/>
         </w:rPr>
-        <w:t>teacher</w:t>
-      </w:r>
-      <w:proofErr w:type="spellEnd"/>
-      <w:r>
-        <w:rPr>
-          <w:rFonts w:ascii="Times New Roman" w:hAnsi="Times New Roman" w:cs="Times New Roman"/>
-          <w:lang w:val="tr-TR"/>
-        </w:rPr>
-        <w:t xml:space="preserve"> (</w:t>
-      </w:r>
-      <w:proofErr w:type="spellStart"/>
-      <w:r>
-        <w:rPr>
-          <w:rFonts w:ascii="Times New Roman" w:hAnsi="Times New Roman" w:cs="Times New Roman"/>
-          <w:lang w:val="tr-TR"/>
-        </w:rPr>
-        <w:t>cost_per_order</w:t>
-      </w:r>
-      <w:proofErr w:type="spellEnd"/>
-      <w:r>
-        <w:rPr>
-          <w:rFonts w:ascii="Times New Roman" w:hAnsi="Times New Roman" w:cs="Times New Roman"/>
-          <w:lang w:val="tr-TR"/>
-        </w:rPr>
-        <w:t xml:space="preserve"> = 1.388), it </w:t>
-      </w:r>
-      <w:proofErr w:type="spellStart"/>
-      <w:r>
-        <w:rPr>
-          <w:rFonts w:ascii="Times New Roman" w:hAnsi="Times New Roman" w:cs="Times New Roman"/>
-          <w:lang w:val="tr-TR"/>
-        </w:rPr>
-        <w:t>demonstrated</w:t>
-      </w:r>
-      <w:proofErr w:type="spellEnd"/>
-      <w:r>
-        <w:rPr>
-          <w:rFonts w:ascii="Times New Roman" w:hAnsi="Times New Roman" w:cs="Times New Roman"/>
-          <w:lang w:val="tr-TR"/>
-        </w:rPr>
-        <w:t xml:space="preserve"> </w:t>
-      </w:r>
-      <w:proofErr w:type="spellStart"/>
-      <w:r>
-        <w:rPr>
-          <w:rFonts w:ascii="Times New Roman" w:hAnsi="Times New Roman" w:cs="Times New Roman"/>
-          <w:lang w:val="tr-TR"/>
-        </w:rPr>
-        <w:t>that</w:t>
-      </w:r>
-      <w:proofErr w:type="spellEnd"/>
-      <w:r>
-        <w:rPr>
-          <w:rFonts w:ascii="Times New Roman" w:hAnsi="Times New Roman" w:cs="Times New Roman"/>
-          <w:lang w:val="tr-TR"/>
-        </w:rPr>
-        <w:t xml:space="preserve"> </w:t>
-      </w:r>
-      <w:proofErr w:type="spellStart"/>
-      <w:r>
-        <w:rPr>
-          <w:rFonts w:ascii="Times New Roman" w:hAnsi="Times New Roman" w:cs="Times New Roman"/>
-          <w:lang w:val="tr-TR"/>
-        </w:rPr>
-        <w:t>planning-based</w:t>
+        <w:t>based</w:t>
       </w:r>
       <w:proofErr w:type="spellEnd"/>
       <w:r>
@@ -9847,15 +9581,1705 @@
         <w:spacing w:after="80"/>
         <w:rPr>
           <w:rFonts w:ascii="Times New Roman" w:hAnsi="Times New Roman" w:cs="Times New Roman"/>
+          <w:lang w:val="tr-TR"/>
         </w:rPr>
       </w:pPr>
     </w:p>
     <w:p>
       <w:pPr>
+        <w:spacing w:after="80"/>
+        <w:rPr>
+          <w:rFonts w:ascii="Times New Roman" w:hAnsi="Times New Roman" w:cs="Times New Roman"/>
+          <w:lang w:val="tr-TR"/>
+        </w:rPr>
+      </w:pPr>
+    </w:p>
+    <w:p>
+      <w:pPr>
+        <w:spacing w:after="80"/>
+        <w:rPr>
+          <w:rFonts w:ascii="Times New Roman" w:hAnsi="Times New Roman" w:cs="Times New Roman"/>
+          <w:lang w:val="tr-TR"/>
+        </w:rPr>
+      </w:pPr>
+    </w:p>
+    <w:p>
+      <w:pPr>
+        <w:spacing w:after="80"/>
+        <w:rPr>
+          <w:rFonts w:ascii="Times New Roman" w:hAnsi="Times New Roman" w:cs="Times New Roman"/>
+          <w:lang w:val="tr-TR"/>
+        </w:rPr>
+      </w:pPr>
+    </w:p>
+    <w:p>
+      <w:pPr>
+        <w:pStyle w:val="Balk2"/>
+        <w:rPr>
+          <w:rFonts w:ascii="Times New Roman" w:hAnsi="Times New Roman" w:cs="Times New Roman"/>
+          <w:lang w:val="tr-TR"/>
+        </w:rPr>
+      </w:pPr>
+      <w:r>
+        <w:rPr>
+          <w:rFonts w:ascii="Times New Roman" w:hAnsi="Times New Roman" w:cs="Times New Roman"/>
+          <w:lang w:val="tr-TR"/>
+        </w:rPr>
+        <w:lastRenderedPageBreak/>
+        <w:t xml:space="preserve">9B. </w:t>
+      </w:r>
+      <w:proofErr w:type="spellStart"/>
+      <w:r>
+        <w:rPr>
+          <w:rFonts w:ascii="Times New Roman" w:hAnsi="Times New Roman" w:cs="Times New Roman"/>
+          <w:lang w:val="tr-TR"/>
+        </w:rPr>
+        <w:t>Policy-Based</w:t>
+      </w:r>
+      <w:proofErr w:type="spellEnd"/>
+      <w:r>
+        <w:rPr>
+          <w:rFonts w:ascii="Times New Roman" w:hAnsi="Times New Roman" w:cs="Times New Roman"/>
+          <w:lang w:val="tr-TR"/>
+        </w:rPr>
+        <w:t xml:space="preserve"> </w:t>
+      </w:r>
+      <w:proofErr w:type="spellStart"/>
+      <w:r>
+        <w:rPr>
+          <w:rFonts w:ascii="Times New Roman" w:hAnsi="Times New Roman" w:cs="Times New Roman"/>
+          <w:lang w:val="tr-TR"/>
+        </w:rPr>
+        <w:t>Reinforcement</w:t>
+      </w:r>
+      <w:proofErr w:type="spellEnd"/>
+      <w:r>
+        <w:rPr>
+          <w:rFonts w:ascii="Times New Roman" w:hAnsi="Times New Roman" w:cs="Times New Roman"/>
+          <w:lang w:val="tr-TR"/>
+        </w:rPr>
+        <w:t xml:space="preserve"> Learning (Role B)</w:t>
+      </w:r>
+    </w:p>
+    <w:p>
+      <w:pPr>
+        <w:rPr>
+          <w:rFonts w:ascii="Times New Roman" w:hAnsi="Times New Roman" w:cs="Times New Roman"/>
+          <w:b/>
+          <w:bCs/>
+          <w:lang w:val="tr-TR"/>
+        </w:rPr>
+      </w:pPr>
+      <w:proofErr w:type="spellStart"/>
+      <w:r>
+        <w:rPr>
+          <w:rFonts w:ascii="Times New Roman" w:hAnsi="Times New Roman" w:cs="Times New Roman"/>
+          <w:b/>
+          <w:bCs/>
+          <w:lang w:val="tr-TR"/>
+        </w:rPr>
+        <w:t>Method</w:t>
+      </w:r>
+      <w:proofErr w:type="spellEnd"/>
+      <w:r>
+        <w:rPr>
+          <w:rFonts w:ascii="Times New Roman" w:hAnsi="Times New Roman" w:cs="Times New Roman"/>
+          <w:b/>
+          <w:bCs/>
+          <w:lang w:val="tr-TR"/>
+        </w:rPr>
+        <w:t xml:space="preserve"> </w:t>
+      </w:r>
+      <w:proofErr w:type="spellStart"/>
+      <w:r>
+        <w:rPr>
+          <w:rFonts w:ascii="Times New Roman" w:hAnsi="Times New Roman" w:cs="Times New Roman"/>
+          <w:b/>
+          <w:bCs/>
+          <w:lang w:val="tr-TR"/>
+        </w:rPr>
+        <w:t>Description</w:t>
+      </w:r>
+      <w:proofErr w:type="spellEnd"/>
+    </w:p>
+    <w:p>
+      <w:pPr>
+        <w:rPr>
+          <w:rFonts w:ascii="Times New Roman" w:hAnsi="Times New Roman" w:cs="Times New Roman"/>
+          <w:lang w:val="tr-TR"/>
+        </w:rPr>
+      </w:pPr>
+      <w:r>
+        <w:rPr>
+          <w:rFonts w:ascii="Times New Roman" w:hAnsi="Times New Roman" w:cs="Times New Roman"/>
+          <w:lang w:val="tr-TR"/>
+        </w:rPr>
+        <w:t xml:space="preserve">A </w:t>
+      </w:r>
+      <w:proofErr w:type="spellStart"/>
+      <w:r>
+        <w:rPr>
+          <w:rFonts w:ascii="Times New Roman" w:hAnsi="Times New Roman" w:cs="Times New Roman"/>
+          <w:lang w:val="tr-TR"/>
+        </w:rPr>
+        <w:t>centralized</w:t>
+      </w:r>
+      <w:proofErr w:type="spellEnd"/>
+      <w:r>
+        <w:rPr>
+          <w:rFonts w:ascii="Times New Roman" w:hAnsi="Times New Roman" w:cs="Times New Roman"/>
+          <w:lang w:val="tr-TR"/>
+        </w:rPr>
+        <w:t xml:space="preserve"> </w:t>
+      </w:r>
+      <w:proofErr w:type="spellStart"/>
+      <w:r>
+        <w:rPr>
+          <w:rFonts w:ascii="Times New Roman" w:hAnsi="Times New Roman" w:cs="Times New Roman"/>
+          <w:lang w:val="tr-TR"/>
+        </w:rPr>
+        <w:t>Masked</w:t>
+      </w:r>
+      <w:proofErr w:type="spellEnd"/>
+      <w:r>
+        <w:rPr>
+          <w:rFonts w:ascii="Times New Roman" w:hAnsi="Times New Roman" w:cs="Times New Roman"/>
+          <w:lang w:val="tr-TR"/>
+        </w:rPr>
+        <w:t xml:space="preserve"> </w:t>
+      </w:r>
+      <w:proofErr w:type="spellStart"/>
+      <w:r>
+        <w:rPr>
+          <w:rFonts w:ascii="Times New Roman" w:hAnsi="Times New Roman" w:cs="Times New Roman"/>
+          <w:lang w:val="tr-TR"/>
+        </w:rPr>
+        <w:t>Actor-Critic</w:t>
+      </w:r>
+      <w:proofErr w:type="spellEnd"/>
+      <w:r>
+        <w:rPr>
+          <w:rFonts w:ascii="Times New Roman" w:hAnsi="Times New Roman" w:cs="Times New Roman"/>
+          <w:lang w:val="tr-TR"/>
+        </w:rPr>
+        <w:t xml:space="preserve"> (Advantage </w:t>
+      </w:r>
+      <w:proofErr w:type="spellStart"/>
+      <w:r>
+        <w:rPr>
+          <w:rFonts w:ascii="Times New Roman" w:hAnsi="Times New Roman" w:cs="Times New Roman"/>
+          <w:lang w:val="tr-TR"/>
+        </w:rPr>
+        <w:t>Actor-Critic</w:t>
+      </w:r>
+      <w:proofErr w:type="spellEnd"/>
+      <w:r>
+        <w:rPr>
+          <w:rFonts w:ascii="Times New Roman" w:hAnsi="Times New Roman" w:cs="Times New Roman"/>
+          <w:lang w:val="tr-TR"/>
+        </w:rPr>
+        <w:t xml:space="preserve">, A2C) </w:t>
+      </w:r>
+      <w:proofErr w:type="spellStart"/>
+      <w:r>
+        <w:rPr>
+          <w:rFonts w:ascii="Times New Roman" w:hAnsi="Times New Roman" w:cs="Times New Roman"/>
+          <w:lang w:val="tr-TR"/>
+        </w:rPr>
+        <w:t>architecture</w:t>
+      </w:r>
+      <w:proofErr w:type="spellEnd"/>
+      <w:r>
+        <w:rPr>
+          <w:rFonts w:ascii="Times New Roman" w:hAnsi="Times New Roman" w:cs="Times New Roman"/>
+          <w:lang w:val="tr-TR"/>
+        </w:rPr>
+        <w:t xml:space="preserve"> </w:t>
+      </w:r>
+      <w:proofErr w:type="spellStart"/>
+      <w:r>
+        <w:rPr>
+          <w:rFonts w:ascii="Times New Roman" w:hAnsi="Times New Roman" w:cs="Times New Roman"/>
+          <w:lang w:val="tr-TR"/>
+        </w:rPr>
+        <w:t>was</w:t>
+      </w:r>
+      <w:proofErr w:type="spellEnd"/>
+      <w:r>
+        <w:rPr>
+          <w:rFonts w:ascii="Times New Roman" w:hAnsi="Times New Roman" w:cs="Times New Roman"/>
+          <w:lang w:val="tr-TR"/>
+        </w:rPr>
+        <w:t xml:space="preserve"> </w:t>
+      </w:r>
+      <w:proofErr w:type="spellStart"/>
+      <w:r>
+        <w:rPr>
+          <w:rFonts w:ascii="Times New Roman" w:hAnsi="Times New Roman" w:cs="Times New Roman"/>
+          <w:lang w:val="tr-TR"/>
+        </w:rPr>
+        <w:t>implemented</w:t>
+      </w:r>
+      <w:proofErr w:type="spellEnd"/>
+      <w:r>
+        <w:rPr>
+          <w:rFonts w:ascii="Times New Roman" w:hAnsi="Times New Roman" w:cs="Times New Roman"/>
+          <w:lang w:val="tr-TR"/>
+        </w:rPr>
+        <w:t xml:space="preserve"> </w:t>
+      </w:r>
+      <w:proofErr w:type="spellStart"/>
+      <w:r>
+        <w:rPr>
+          <w:rFonts w:ascii="Times New Roman" w:hAnsi="Times New Roman" w:cs="Times New Roman"/>
+          <w:lang w:val="tr-TR"/>
+        </w:rPr>
+        <w:t>to</w:t>
+      </w:r>
+      <w:proofErr w:type="spellEnd"/>
+      <w:r>
+        <w:rPr>
+          <w:rFonts w:ascii="Times New Roman" w:hAnsi="Times New Roman" w:cs="Times New Roman"/>
+          <w:lang w:val="tr-TR"/>
+        </w:rPr>
+        <w:t xml:space="preserve"> </w:t>
+      </w:r>
+      <w:proofErr w:type="spellStart"/>
+      <w:r>
+        <w:rPr>
+          <w:rFonts w:ascii="Times New Roman" w:hAnsi="Times New Roman" w:cs="Times New Roman"/>
+          <w:lang w:val="tr-TR"/>
+        </w:rPr>
+        <w:t>solve</w:t>
+      </w:r>
+      <w:proofErr w:type="spellEnd"/>
+      <w:r>
+        <w:rPr>
+          <w:rFonts w:ascii="Times New Roman" w:hAnsi="Times New Roman" w:cs="Times New Roman"/>
+          <w:lang w:val="tr-TR"/>
+        </w:rPr>
+        <w:t xml:space="preserve"> the </w:t>
+      </w:r>
+      <w:proofErr w:type="spellStart"/>
+      <w:r>
+        <w:rPr>
+          <w:rFonts w:ascii="Times New Roman" w:hAnsi="Times New Roman" w:cs="Times New Roman"/>
+          <w:lang w:val="tr-TR"/>
+        </w:rPr>
+        <w:t>drone</w:t>
+      </w:r>
+      <w:proofErr w:type="spellEnd"/>
+      <w:r>
+        <w:rPr>
+          <w:rFonts w:ascii="Times New Roman" w:hAnsi="Times New Roman" w:cs="Times New Roman"/>
+          <w:lang w:val="tr-TR"/>
+        </w:rPr>
+        <w:t xml:space="preserve"> </w:t>
+      </w:r>
+      <w:proofErr w:type="spellStart"/>
+      <w:r>
+        <w:rPr>
+          <w:rFonts w:ascii="Times New Roman" w:hAnsi="Times New Roman" w:cs="Times New Roman"/>
+          <w:lang w:val="tr-TR"/>
+        </w:rPr>
+        <w:t>dispatch</w:t>
+      </w:r>
+      <w:proofErr w:type="spellEnd"/>
+      <w:r>
+        <w:rPr>
+          <w:rFonts w:ascii="Times New Roman" w:hAnsi="Times New Roman" w:cs="Times New Roman"/>
+          <w:lang w:val="tr-TR"/>
+        </w:rPr>
+        <w:t xml:space="preserve"> problem </w:t>
+      </w:r>
+      <w:proofErr w:type="spellStart"/>
+      <w:r>
+        <w:rPr>
+          <w:rFonts w:ascii="Times New Roman" w:hAnsi="Times New Roman" w:cs="Times New Roman"/>
+          <w:lang w:val="tr-TR"/>
+        </w:rPr>
+        <w:t>using</w:t>
+      </w:r>
+      <w:proofErr w:type="spellEnd"/>
+      <w:r>
+        <w:rPr>
+          <w:rFonts w:ascii="Times New Roman" w:hAnsi="Times New Roman" w:cs="Times New Roman"/>
+          <w:lang w:val="tr-TR"/>
+        </w:rPr>
+        <w:t xml:space="preserve"> </w:t>
+      </w:r>
+      <w:proofErr w:type="spellStart"/>
+      <w:r>
+        <w:rPr>
+          <w:rFonts w:ascii="Times New Roman" w:hAnsi="Times New Roman" w:cs="Times New Roman"/>
+          <w:lang w:val="tr-TR"/>
+        </w:rPr>
+        <w:t>policy-gradient</w:t>
+      </w:r>
+      <w:proofErr w:type="spellEnd"/>
+      <w:r>
+        <w:rPr>
+          <w:rFonts w:ascii="Times New Roman" w:hAnsi="Times New Roman" w:cs="Times New Roman"/>
+          <w:lang w:val="tr-TR"/>
+        </w:rPr>
+        <w:t xml:space="preserve"> </w:t>
+      </w:r>
+      <w:proofErr w:type="spellStart"/>
+      <w:r>
+        <w:rPr>
+          <w:rFonts w:ascii="Times New Roman" w:hAnsi="Times New Roman" w:cs="Times New Roman"/>
+          <w:lang w:val="tr-TR"/>
+        </w:rPr>
+        <w:t>reinforcement</w:t>
+      </w:r>
+      <w:proofErr w:type="spellEnd"/>
+      <w:r>
+        <w:rPr>
+          <w:rFonts w:ascii="Times New Roman" w:hAnsi="Times New Roman" w:cs="Times New Roman"/>
+          <w:lang w:val="tr-TR"/>
+        </w:rPr>
+        <w:t xml:space="preserve"> </w:t>
+      </w:r>
+      <w:proofErr w:type="spellStart"/>
+      <w:r>
+        <w:rPr>
+          <w:rFonts w:ascii="Times New Roman" w:hAnsi="Times New Roman" w:cs="Times New Roman"/>
+          <w:lang w:val="tr-TR"/>
+        </w:rPr>
+        <w:t>learning</w:t>
+      </w:r>
+      <w:proofErr w:type="spellEnd"/>
+      <w:r>
+        <w:rPr>
+          <w:rFonts w:ascii="Times New Roman" w:hAnsi="Times New Roman" w:cs="Times New Roman"/>
+          <w:lang w:val="tr-TR"/>
+        </w:rPr>
+        <w:t xml:space="preserve">. The model </w:t>
+      </w:r>
+      <w:proofErr w:type="spellStart"/>
+      <w:r>
+        <w:rPr>
+          <w:rFonts w:ascii="Times New Roman" w:hAnsi="Times New Roman" w:cs="Times New Roman"/>
+          <w:lang w:val="tr-TR"/>
+        </w:rPr>
+        <w:t>consists</w:t>
+      </w:r>
+      <w:proofErr w:type="spellEnd"/>
+      <w:r>
+        <w:rPr>
+          <w:rFonts w:ascii="Times New Roman" w:hAnsi="Times New Roman" w:cs="Times New Roman"/>
+          <w:lang w:val="tr-TR"/>
+        </w:rPr>
+        <w:t xml:space="preserve"> of a </w:t>
+      </w:r>
+      <w:proofErr w:type="spellStart"/>
+      <w:r>
+        <w:rPr>
+          <w:rFonts w:ascii="Times New Roman" w:hAnsi="Times New Roman" w:cs="Times New Roman"/>
+          <w:lang w:val="tr-TR"/>
+        </w:rPr>
+        <w:t>shared</w:t>
+      </w:r>
+      <w:proofErr w:type="spellEnd"/>
+      <w:r>
+        <w:rPr>
+          <w:rFonts w:ascii="Times New Roman" w:hAnsi="Times New Roman" w:cs="Times New Roman"/>
+          <w:lang w:val="tr-TR"/>
+        </w:rPr>
+        <w:t xml:space="preserve"> Multi-</w:t>
+      </w:r>
+      <w:proofErr w:type="spellStart"/>
+      <w:r>
+        <w:rPr>
+          <w:rFonts w:ascii="Times New Roman" w:hAnsi="Times New Roman" w:cs="Times New Roman"/>
+          <w:lang w:val="tr-TR"/>
+        </w:rPr>
+        <w:t>Layer</w:t>
+      </w:r>
+      <w:proofErr w:type="spellEnd"/>
+      <w:r>
+        <w:rPr>
+          <w:rFonts w:ascii="Times New Roman" w:hAnsi="Times New Roman" w:cs="Times New Roman"/>
+          <w:lang w:val="tr-TR"/>
+        </w:rPr>
+        <w:t xml:space="preserve"> </w:t>
+      </w:r>
+      <w:proofErr w:type="spellStart"/>
+      <w:r>
+        <w:rPr>
+          <w:rFonts w:ascii="Times New Roman" w:hAnsi="Times New Roman" w:cs="Times New Roman"/>
+          <w:lang w:val="tr-TR"/>
+        </w:rPr>
+        <w:t>Perceptron</w:t>
+      </w:r>
+      <w:proofErr w:type="spellEnd"/>
+      <w:r>
+        <w:rPr>
+          <w:rFonts w:ascii="Times New Roman" w:hAnsi="Times New Roman" w:cs="Times New Roman"/>
+          <w:lang w:val="tr-TR"/>
+        </w:rPr>
+        <w:t xml:space="preserve"> with two </w:t>
+      </w:r>
+      <w:proofErr w:type="spellStart"/>
+      <w:r>
+        <w:rPr>
+          <w:rFonts w:ascii="Times New Roman" w:hAnsi="Times New Roman" w:cs="Times New Roman"/>
+          <w:lang w:val="tr-TR"/>
+        </w:rPr>
+        <w:t>hidden</w:t>
+      </w:r>
+      <w:proofErr w:type="spellEnd"/>
+      <w:r>
+        <w:rPr>
+          <w:rFonts w:ascii="Times New Roman" w:hAnsi="Times New Roman" w:cs="Times New Roman"/>
+          <w:lang w:val="tr-TR"/>
+        </w:rPr>
+        <w:t xml:space="preserve"> </w:t>
+      </w:r>
+      <w:proofErr w:type="spellStart"/>
+      <w:r>
+        <w:rPr>
+          <w:rFonts w:ascii="Times New Roman" w:hAnsi="Times New Roman" w:cs="Times New Roman"/>
+          <w:lang w:val="tr-TR"/>
+        </w:rPr>
+        <w:t>layers</w:t>
+      </w:r>
+      <w:proofErr w:type="spellEnd"/>
+      <w:r>
+        <w:rPr>
+          <w:rFonts w:ascii="Times New Roman" w:hAnsi="Times New Roman" w:cs="Times New Roman"/>
+          <w:lang w:val="tr-TR"/>
+        </w:rPr>
+        <w:t xml:space="preserve"> of 128 </w:t>
+      </w:r>
+      <w:proofErr w:type="spellStart"/>
+      <w:r>
+        <w:rPr>
+          <w:rFonts w:ascii="Times New Roman" w:hAnsi="Times New Roman" w:cs="Times New Roman"/>
+          <w:lang w:val="tr-TR"/>
+        </w:rPr>
+        <w:t>neurons</w:t>
+      </w:r>
+      <w:proofErr w:type="spellEnd"/>
+      <w:r>
+        <w:rPr>
+          <w:rFonts w:ascii="Times New Roman" w:hAnsi="Times New Roman" w:cs="Times New Roman"/>
+          <w:lang w:val="tr-TR"/>
+        </w:rPr>
+        <w:t xml:space="preserve"> </w:t>
+      </w:r>
+      <w:proofErr w:type="spellStart"/>
+      <w:r>
+        <w:rPr>
+          <w:rFonts w:ascii="Times New Roman" w:hAnsi="Times New Roman" w:cs="Times New Roman"/>
+          <w:lang w:val="tr-TR"/>
+        </w:rPr>
+        <w:t>and</w:t>
+      </w:r>
+      <w:proofErr w:type="spellEnd"/>
+      <w:r>
+        <w:rPr>
+          <w:rFonts w:ascii="Times New Roman" w:hAnsi="Times New Roman" w:cs="Times New Roman"/>
+          <w:lang w:val="tr-TR"/>
+        </w:rPr>
+        <w:t xml:space="preserve"> </w:t>
+      </w:r>
+      <w:proofErr w:type="spellStart"/>
+      <w:r>
+        <w:rPr>
+          <w:rFonts w:ascii="Times New Roman" w:hAnsi="Times New Roman" w:cs="Times New Roman"/>
+          <w:lang w:val="tr-TR"/>
+        </w:rPr>
+        <w:t>ReLU</w:t>
+      </w:r>
+      <w:proofErr w:type="spellEnd"/>
+      <w:r>
+        <w:rPr>
+          <w:rFonts w:ascii="Times New Roman" w:hAnsi="Times New Roman" w:cs="Times New Roman"/>
+          <w:lang w:val="tr-TR"/>
+        </w:rPr>
+        <w:t xml:space="preserve"> </w:t>
+      </w:r>
+      <w:proofErr w:type="spellStart"/>
+      <w:r>
+        <w:rPr>
+          <w:rFonts w:ascii="Times New Roman" w:hAnsi="Times New Roman" w:cs="Times New Roman"/>
+          <w:lang w:val="tr-TR"/>
+        </w:rPr>
+        <w:t>activation</w:t>
+      </w:r>
+      <w:proofErr w:type="spellEnd"/>
+      <w:r>
+        <w:rPr>
+          <w:rFonts w:ascii="Times New Roman" w:hAnsi="Times New Roman" w:cs="Times New Roman"/>
+          <w:lang w:val="tr-TR"/>
+        </w:rPr>
+        <w:t xml:space="preserve"> </w:t>
+      </w:r>
+      <w:proofErr w:type="spellStart"/>
+      <w:r>
+        <w:rPr>
+          <w:rFonts w:ascii="Times New Roman" w:hAnsi="Times New Roman" w:cs="Times New Roman"/>
+          <w:lang w:val="tr-TR"/>
+        </w:rPr>
+        <w:t>functions</w:t>
+      </w:r>
+      <w:proofErr w:type="spellEnd"/>
+      <w:r>
+        <w:rPr>
+          <w:rFonts w:ascii="Times New Roman" w:hAnsi="Times New Roman" w:cs="Times New Roman"/>
+          <w:lang w:val="tr-TR"/>
+        </w:rPr>
+        <w:t xml:space="preserve">. The </w:t>
+      </w:r>
+      <w:proofErr w:type="spellStart"/>
+      <w:r>
+        <w:rPr>
+          <w:rFonts w:ascii="Times New Roman" w:hAnsi="Times New Roman" w:cs="Times New Roman"/>
+          <w:lang w:val="tr-TR"/>
+        </w:rPr>
+        <w:t>shared</w:t>
+      </w:r>
+      <w:proofErr w:type="spellEnd"/>
+      <w:r>
+        <w:rPr>
+          <w:rFonts w:ascii="Times New Roman" w:hAnsi="Times New Roman" w:cs="Times New Roman"/>
+          <w:lang w:val="tr-TR"/>
+        </w:rPr>
+        <w:t xml:space="preserve"> </w:t>
+      </w:r>
+      <w:proofErr w:type="spellStart"/>
+      <w:r>
+        <w:rPr>
+          <w:rFonts w:ascii="Times New Roman" w:hAnsi="Times New Roman" w:cs="Times New Roman"/>
+          <w:lang w:val="tr-TR"/>
+        </w:rPr>
+        <w:t>representation</w:t>
+      </w:r>
+      <w:proofErr w:type="spellEnd"/>
+      <w:r>
+        <w:rPr>
+          <w:rFonts w:ascii="Times New Roman" w:hAnsi="Times New Roman" w:cs="Times New Roman"/>
+          <w:lang w:val="tr-TR"/>
+        </w:rPr>
+        <w:t xml:space="preserve"> </w:t>
+      </w:r>
+      <w:proofErr w:type="spellStart"/>
+      <w:r>
+        <w:rPr>
+          <w:rFonts w:ascii="Times New Roman" w:hAnsi="Times New Roman" w:cs="Times New Roman"/>
+          <w:lang w:val="tr-TR"/>
+        </w:rPr>
+        <w:t>branches</w:t>
+      </w:r>
+      <w:proofErr w:type="spellEnd"/>
+      <w:r>
+        <w:rPr>
+          <w:rFonts w:ascii="Times New Roman" w:hAnsi="Times New Roman" w:cs="Times New Roman"/>
+          <w:lang w:val="tr-TR"/>
+        </w:rPr>
+        <w:t xml:space="preserve"> </w:t>
+      </w:r>
+      <w:proofErr w:type="spellStart"/>
+      <w:r>
+        <w:rPr>
+          <w:rFonts w:ascii="Times New Roman" w:hAnsi="Times New Roman" w:cs="Times New Roman"/>
+          <w:lang w:val="tr-TR"/>
+        </w:rPr>
+        <w:t>into</w:t>
+      </w:r>
+      <w:proofErr w:type="spellEnd"/>
+      <w:r>
+        <w:rPr>
+          <w:rFonts w:ascii="Times New Roman" w:hAnsi="Times New Roman" w:cs="Times New Roman"/>
+          <w:lang w:val="tr-TR"/>
+        </w:rPr>
+        <w:t xml:space="preserve"> an </w:t>
+      </w:r>
+      <w:proofErr w:type="spellStart"/>
+      <w:r>
+        <w:rPr>
+          <w:rFonts w:ascii="Times New Roman" w:hAnsi="Times New Roman" w:cs="Times New Roman"/>
+          <w:lang w:val="tr-TR"/>
+        </w:rPr>
+        <w:t>Actor</w:t>
+      </w:r>
+      <w:proofErr w:type="spellEnd"/>
+      <w:r>
+        <w:rPr>
+          <w:rFonts w:ascii="Times New Roman" w:hAnsi="Times New Roman" w:cs="Times New Roman"/>
+          <w:lang w:val="tr-TR"/>
+        </w:rPr>
+        <w:t xml:space="preserve"> network, </w:t>
+      </w:r>
+      <w:proofErr w:type="spellStart"/>
+      <w:r>
+        <w:rPr>
+          <w:rFonts w:ascii="Times New Roman" w:hAnsi="Times New Roman" w:cs="Times New Roman"/>
+          <w:lang w:val="tr-TR"/>
+        </w:rPr>
+        <w:t>which</w:t>
+      </w:r>
+      <w:proofErr w:type="spellEnd"/>
+      <w:r>
+        <w:rPr>
+          <w:rFonts w:ascii="Times New Roman" w:hAnsi="Times New Roman" w:cs="Times New Roman"/>
+          <w:lang w:val="tr-TR"/>
+        </w:rPr>
+        <w:t xml:space="preserve"> </w:t>
+      </w:r>
+      <w:proofErr w:type="spellStart"/>
+      <w:r>
+        <w:rPr>
+          <w:rFonts w:ascii="Times New Roman" w:hAnsi="Times New Roman" w:cs="Times New Roman"/>
+          <w:lang w:val="tr-TR"/>
+        </w:rPr>
+        <w:t>predicts</w:t>
+      </w:r>
+      <w:proofErr w:type="spellEnd"/>
+      <w:r>
+        <w:rPr>
+          <w:rFonts w:ascii="Times New Roman" w:hAnsi="Times New Roman" w:cs="Times New Roman"/>
+          <w:lang w:val="tr-TR"/>
+        </w:rPr>
+        <w:t xml:space="preserve"> </w:t>
+      </w:r>
+      <w:proofErr w:type="spellStart"/>
+      <w:r>
+        <w:rPr>
+          <w:rFonts w:ascii="Times New Roman" w:hAnsi="Times New Roman" w:cs="Times New Roman"/>
+          <w:lang w:val="tr-TR"/>
+        </w:rPr>
+        <w:t>action</w:t>
+      </w:r>
+      <w:proofErr w:type="spellEnd"/>
+      <w:r>
+        <w:rPr>
+          <w:rFonts w:ascii="Times New Roman" w:hAnsi="Times New Roman" w:cs="Times New Roman"/>
+          <w:lang w:val="tr-TR"/>
+        </w:rPr>
+        <w:t xml:space="preserve"> </w:t>
+      </w:r>
+      <w:proofErr w:type="spellStart"/>
+      <w:r>
+        <w:rPr>
+          <w:rFonts w:ascii="Times New Roman" w:hAnsi="Times New Roman" w:cs="Times New Roman"/>
+          <w:lang w:val="tr-TR"/>
+        </w:rPr>
+        <w:t>probabilities</w:t>
+      </w:r>
+      <w:proofErr w:type="spellEnd"/>
+      <w:r>
+        <w:rPr>
+          <w:rFonts w:ascii="Times New Roman" w:hAnsi="Times New Roman" w:cs="Times New Roman"/>
+          <w:lang w:val="tr-TR"/>
+        </w:rPr>
+        <w:t xml:space="preserve">, </w:t>
+      </w:r>
+      <w:proofErr w:type="spellStart"/>
+      <w:r>
+        <w:rPr>
+          <w:rFonts w:ascii="Times New Roman" w:hAnsi="Times New Roman" w:cs="Times New Roman"/>
+          <w:lang w:val="tr-TR"/>
+        </w:rPr>
+        <w:t>and</w:t>
+      </w:r>
+      <w:proofErr w:type="spellEnd"/>
+      <w:r>
+        <w:rPr>
+          <w:rFonts w:ascii="Times New Roman" w:hAnsi="Times New Roman" w:cs="Times New Roman"/>
+          <w:lang w:val="tr-TR"/>
+        </w:rPr>
+        <w:t xml:space="preserve"> a </w:t>
+      </w:r>
+      <w:proofErr w:type="spellStart"/>
+      <w:r>
+        <w:rPr>
+          <w:rFonts w:ascii="Times New Roman" w:hAnsi="Times New Roman" w:cs="Times New Roman"/>
+          <w:lang w:val="tr-TR"/>
+        </w:rPr>
+        <w:t>Critic</w:t>
+      </w:r>
+      <w:proofErr w:type="spellEnd"/>
+      <w:r>
+        <w:rPr>
+          <w:rFonts w:ascii="Times New Roman" w:hAnsi="Times New Roman" w:cs="Times New Roman"/>
+          <w:lang w:val="tr-TR"/>
+        </w:rPr>
+        <w:t xml:space="preserve"> network, </w:t>
+      </w:r>
+      <w:proofErr w:type="spellStart"/>
+      <w:r>
+        <w:rPr>
+          <w:rFonts w:ascii="Times New Roman" w:hAnsi="Times New Roman" w:cs="Times New Roman"/>
+          <w:lang w:val="tr-TR"/>
+        </w:rPr>
+        <w:t>which</w:t>
+      </w:r>
+      <w:proofErr w:type="spellEnd"/>
+      <w:r>
+        <w:rPr>
+          <w:rFonts w:ascii="Times New Roman" w:hAnsi="Times New Roman" w:cs="Times New Roman"/>
+          <w:lang w:val="tr-TR"/>
+        </w:rPr>
+        <w:t xml:space="preserve"> </w:t>
+      </w:r>
+      <w:proofErr w:type="spellStart"/>
+      <w:r>
+        <w:rPr>
+          <w:rFonts w:ascii="Times New Roman" w:hAnsi="Times New Roman" w:cs="Times New Roman"/>
+          <w:lang w:val="tr-TR"/>
+        </w:rPr>
+        <w:t>estimates</w:t>
+      </w:r>
+      <w:proofErr w:type="spellEnd"/>
+      <w:r>
+        <w:rPr>
+          <w:rFonts w:ascii="Times New Roman" w:hAnsi="Times New Roman" w:cs="Times New Roman"/>
+          <w:lang w:val="tr-TR"/>
+        </w:rPr>
+        <w:t xml:space="preserve"> the </w:t>
+      </w:r>
+      <w:proofErr w:type="spellStart"/>
+      <w:r>
+        <w:rPr>
+          <w:rFonts w:ascii="Times New Roman" w:hAnsi="Times New Roman" w:cs="Times New Roman"/>
+          <w:lang w:val="tr-TR"/>
+        </w:rPr>
+        <w:t>expected</w:t>
+      </w:r>
+      <w:proofErr w:type="spellEnd"/>
+      <w:r>
+        <w:rPr>
+          <w:rFonts w:ascii="Times New Roman" w:hAnsi="Times New Roman" w:cs="Times New Roman"/>
+          <w:lang w:val="tr-TR"/>
+        </w:rPr>
+        <w:t xml:space="preserve"> </w:t>
+      </w:r>
+      <w:proofErr w:type="spellStart"/>
+      <w:r>
+        <w:rPr>
+          <w:rFonts w:ascii="Times New Roman" w:hAnsi="Times New Roman" w:cs="Times New Roman"/>
+          <w:lang w:val="tr-TR"/>
+        </w:rPr>
+        <w:t>discounted</w:t>
+      </w:r>
+      <w:proofErr w:type="spellEnd"/>
+      <w:r>
+        <w:rPr>
+          <w:rFonts w:ascii="Times New Roman" w:hAnsi="Times New Roman" w:cs="Times New Roman"/>
+          <w:lang w:val="tr-TR"/>
+        </w:rPr>
+        <w:t xml:space="preserve"> </w:t>
+      </w:r>
+      <w:proofErr w:type="spellStart"/>
+      <w:r>
+        <w:rPr>
+          <w:rFonts w:ascii="Times New Roman" w:hAnsi="Times New Roman" w:cs="Times New Roman"/>
+          <w:lang w:val="tr-TR"/>
+        </w:rPr>
+        <w:t>return</w:t>
+      </w:r>
+      <w:proofErr w:type="spellEnd"/>
+      <w:r>
+        <w:rPr>
+          <w:rFonts w:ascii="Times New Roman" w:hAnsi="Times New Roman" w:cs="Times New Roman"/>
+          <w:lang w:val="tr-TR"/>
+        </w:rPr>
+        <w:t xml:space="preserve"> of the </w:t>
+      </w:r>
+      <w:proofErr w:type="spellStart"/>
+      <w:r>
+        <w:rPr>
+          <w:rFonts w:ascii="Times New Roman" w:hAnsi="Times New Roman" w:cs="Times New Roman"/>
+          <w:lang w:val="tr-TR"/>
+        </w:rPr>
+        <w:t>current</w:t>
+      </w:r>
+      <w:proofErr w:type="spellEnd"/>
+      <w:r>
+        <w:rPr>
+          <w:rFonts w:ascii="Times New Roman" w:hAnsi="Times New Roman" w:cs="Times New Roman"/>
+          <w:lang w:val="tr-TR"/>
+        </w:rPr>
+        <w:t xml:space="preserve"> </w:t>
+      </w:r>
+      <w:proofErr w:type="spellStart"/>
+      <w:r>
+        <w:rPr>
+          <w:rFonts w:ascii="Times New Roman" w:hAnsi="Times New Roman" w:cs="Times New Roman"/>
+          <w:lang w:val="tr-TR"/>
+        </w:rPr>
+        <w:t>state</w:t>
+      </w:r>
+      <w:proofErr w:type="spellEnd"/>
+      <w:r>
+        <w:rPr>
+          <w:rFonts w:ascii="Times New Roman" w:hAnsi="Times New Roman" w:cs="Times New Roman"/>
+          <w:lang w:val="tr-TR"/>
+        </w:rPr>
+        <w:t xml:space="preserve">. </w:t>
+      </w:r>
+      <w:proofErr w:type="spellStart"/>
+      <w:r>
+        <w:rPr>
+          <w:rFonts w:ascii="Times New Roman" w:hAnsi="Times New Roman" w:cs="Times New Roman"/>
+          <w:lang w:val="tr-TR"/>
+        </w:rPr>
+        <w:t>This</w:t>
+      </w:r>
+      <w:proofErr w:type="spellEnd"/>
+      <w:r>
+        <w:rPr>
+          <w:rFonts w:ascii="Times New Roman" w:hAnsi="Times New Roman" w:cs="Times New Roman"/>
+          <w:lang w:val="tr-TR"/>
+        </w:rPr>
+        <w:t xml:space="preserve"> </w:t>
+      </w:r>
+      <w:proofErr w:type="spellStart"/>
+      <w:r>
+        <w:rPr>
+          <w:rFonts w:ascii="Times New Roman" w:hAnsi="Times New Roman" w:cs="Times New Roman"/>
+          <w:lang w:val="tr-TR"/>
+        </w:rPr>
+        <w:t>dual-head</w:t>
+      </w:r>
+      <w:proofErr w:type="spellEnd"/>
+      <w:r>
+        <w:rPr>
+          <w:rFonts w:ascii="Times New Roman" w:hAnsi="Times New Roman" w:cs="Times New Roman"/>
+          <w:lang w:val="tr-TR"/>
+        </w:rPr>
+        <w:t xml:space="preserve"> </w:t>
+      </w:r>
+      <w:proofErr w:type="spellStart"/>
+      <w:r>
+        <w:rPr>
+          <w:rFonts w:ascii="Times New Roman" w:hAnsi="Times New Roman" w:cs="Times New Roman"/>
+          <w:lang w:val="tr-TR"/>
+        </w:rPr>
+        <w:t>architecture</w:t>
+      </w:r>
+      <w:proofErr w:type="spellEnd"/>
+      <w:r>
+        <w:rPr>
+          <w:rFonts w:ascii="Times New Roman" w:hAnsi="Times New Roman" w:cs="Times New Roman"/>
+          <w:lang w:val="tr-TR"/>
+        </w:rPr>
+        <w:t xml:space="preserve"> </w:t>
+      </w:r>
+      <w:proofErr w:type="spellStart"/>
+      <w:r>
+        <w:rPr>
+          <w:rFonts w:ascii="Times New Roman" w:hAnsi="Times New Roman" w:cs="Times New Roman"/>
+          <w:lang w:val="tr-TR"/>
+        </w:rPr>
+        <w:t>enables</w:t>
+      </w:r>
+      <w:proofErr w:type="spellEnd"/>
+      <w:r>
+        <w:rPr>
+          <w:rFonts w:ascii="Times New Roman" w:hAnsi="Times New Roman" w:cs="Times New Roman"/>
+          <w:lang w:val="tr-TR"/>
+        </w:rPr>
+        <w:t xml:space="preserve"> </w:t>
+      </w:r>
+      <w:proofErr w:type="spellStart"/>
+      <w:r>
+        <w:rPr>
+          <w:rFonts w:ascii="Times New Roman" w:hAnsi="Times New Roman" w:cs="Times New Roman"/>
+          <w:lang w:val="tr-TR"/>
+        </w:rPr>
+        <w:t>simultaneous</w:t>
+      </w:r>
+      <w:proofErr w:type="spellEnd"/>
+      <w:r>
+        <w:rPr>
+          <w:rFonts w:ascii="Times New Roman" w:hAnsi="Times New Roman" w:cs="Times New Roman"/>
+          <w:lang w:val="tr-TR"/>
+        </w:rPr>
+        <w:t xml:space="preserve"> </w:t>
+      </w:r>
+      <w:proofErr w:type="spellStart"/>
+      <w:r>
+        <w:rPr>
+          <w:rFonts w:ascii="Times New Roman" w:hAnsi="Times New Roman" w:cs="Times New Roman"/>
+          <w:lang w:val="tr-TR"/>
+        </w:rPr>
+        <w:t>policy</w:t>
+      </w:r>
+      <w:proofErr w:type="spellEnd"/>
+      <w:r>
+        <w:rPr>
+          <w:rFonts w:ascii="Times New Roman" w:hAnsi="Times New Roman" w:cs="Times New Roman"/>
+          <w:lang w:val="tr-TR"/>
+        </w:rPr>
+        <w:t xml:space="preserve"> </w:t>
+      </w:r>
+      <w:proofErr w:type="spellStart"/>
+      <w:r>
+        <w:rPr>
+          <w:rFonts w:ascii="Times New Roman" w:hAnsi="Times New Roman" w:cs="Times New Roman"/>
+          <w:lang w:val="tr-TR"/>
+        </w:rPr>
+        <w:t>optimization</w:t>
+      </w:r>
+      <w:proofErr w:type="spellEnd"/>
+      <w:r>
+        <w:rPr>
+          <w:rFonts w:ascii="Times New Roman" w:hAnsi="Times New Roman" w:cs="Times New Roman"/>
+          <w:lang w:val="tr-TR"/>
+        </w:rPr>
+        <w:t xml:space="preserve"> </w:t>
+      </w:r>
+      <w:proofErr w:type="spellStart"/>
+      <w:r>
+        <w:rPr>
+          <w:rFonts w:ascii="Times New Roman" w:hAnsi="Times New Roman" w:cs="Times New Roman"/>
+          <w:lang w:val="tr-TR"/>
+        </w:rPr>
+        <w:t>and</w:t>
+      </w:r>
+      <w:proofErr w:type="spellEnd"/>
+      <w:r>
+        <w:rPr>
+          <w:rFonts w:ascii="Times New Roman" w:hAnsi="Times New Roman" w:cs="Times New Roman"/>
+          <w:lang w:val="tr-TR"/>
+        </w:rPr>
+        <w:t xml:space="preserve"> </w:t>
+      </w:r>
+      <w:proofErr w:type="spellStart"/>
+      <w:r>
+        <w:rPr>
+          <w:rFonts w:ascii="Times New Roman" w:hAnsi="Times New Roman" w:cs="Times New Roman"/>
+          <w:lang w:val="tr-TR"/>
+        </w:rPr>
+        <w:t>value</w:t>
+      </w:r>
+      <w:proofErr w:type="spellEnd"/>
+      <w:r>
+        <w:rPr>
+          <w:rFonts w:ascii="Times New Roman" w:hAnsi="Times New Roman" w:cs="Times New Roman"/>
+          <w:lang w:val="tr-TR"/>
+        </w:rPr>
+        <w:t xml:space="preserve"> </w:t>
+      </w:r>
+      <w:proofErr w:type="spellStart"/>
+      <w:r>
+        <w:rPr>
+          <w:rFonts w:ascii="Times New Roman" w:hAnsi="Times New Roman" w:cs="Times New Roman"/>
+          <w:lang w:val="tr-TR"/>
+        </w:rPr>
+        <w:t>estimation</w:t>
+      </w:r>
+      <w:proofErr w:type="spellEnd"/>
+      <w:r>
+        <w:rPr>
+          <w:rFonts w:ascii="Times New Roman" w:hAnsi="Times New Roman" w:cs="Times New Roman"/>
+          <w:lang w:val="tr-TR"/>
+        </w:rPr>
+        <w:t>.</w:t>
+      </w:r>
+    </w:p>
+    <w:p>
+      <w:pPr>
+        <w:rPr>
+          <w:rFonts w:ascii="Times New Roman" w:hAnsi="Times New Roman" w:cs="Times New Roman"/>
+          <w:b/>
+          <w:bCs/>
+          <w:lang w:val="tr-TR"/>
+        </w:rPr>
+      </w:pPr>
+      <w:r>
+        <w:rPr>
+          <w:rFonts w:ascii="Times New Roman" w:hAnsi="Times New Roman" w:cs="Times New Roman"/>
+          <w:b/>
+          <w:bCs/>
+          <w:lang w:val="tr-TR"/>
+        </w:rPr>
+        <w:t xml:space="preserve">Action </w:t>
+      </w:r>
+      <w:proofErr w:type="spellStart"/>
+      <w:r>
+        <w:rPr>
+          <w:rFonts w:ascii="Times New Roman" w:hAnsi="Times New Roman" w:cs="Times New Roman"/>
+          <w:b/>
+          <w:bCs/>
+          <w:lang w:val="tr-TR"/>
+        </w:rPr>
+        <w:t>Masking</w:t>
+      </w:r>
+      <w:proofErr w:type="spellEnd"/>
+    </w:p>
+    <w:p>
+      <w:pPr>
+        <w:rPr>
+          <w:rFonts w:ascii="Times New Roman" w:hAnsi="Times New Roman" w:cs="Times New Roman"/>
+        </w:rPr>
+      </w:pPr>
+      <w:r>
+        <w:rPr>
+          <w:rFonts w:ascii="Times New Roman" w:hAnsi="Times New Roman" w:cs="Times New Roman"/>
+        </w:rPr>
+        <w:t xml:space="preserve">Since only a subset of the 169 available actions </w:t>
+      </w:r>
+      <w:proofErr w:type="gramStart"/>
+      <w:r>
+        <w:rPr>
+          <w:rFonts w:ascii="Times New Roman" w:hAnsi="Times New Roman" w:cs="Times New Roman"/>
+        </w:rPr>
+        <w:t>is</w:t>
+      </w:r>
+      <w:proofErr w:type="gramEnd"/>
+      <w:r>
+        <w:rPr>
+          <w:rFonts w:ascii="Times New Roman" w:hAnsi="Times New Roman" w:cs="Times New Roman"/>
+        </w:rPr>
+        <w:t xml:space="preserve"> valid at each decision step, invalid actions were masked before sampling from the policy distribution. Illegal actions received extremely negative logits, ensuring that the policy never selected infeasible drone-order assignments. This significantly improved training stability by restricting exploration to valid actions.</w:t>
+      </w:r>
+    </w:p>
+    <w:p>
+      <w:pPr>
+        <w:rPr>
+          <w:rFonts w:ascii="Times New Roman" w:hAnsi="Times New Roman" w:cs="Times New Roman"/>
+          <w:b/>
+          <w:bCs/>
+          <w:lang w:val="tr-TR"/>
+        </w:rPr>
+      </w:pPr>
+      <w:proofErr w:type="spellStart"/>
+      <w:r>
+        <w:rPr>
+          <w:rFonts w:ascii="Times New Roman" w:hAnsi="Times New Roman" w:cs="Times New Roman"/>
+          <w:b/>
+          <w:bCs/>
+          <w:lang w:val="tr-TR"/>
+        </w:rPr>
+        <w:t>Hyperparameter</w:t>
+      </w:r>
+      <w:proofErr w:type="spellEnd"/>
+      <w:r>
+        <w:rPr>
+          <w:rFonts w:ascii="Times New Roman" w:hAnsi="Times New Roman" w:cs="Times New Roman"/>
+          <w:b/>
+          <w:bCs/>
+          <w:lang w:val="tr-TR"/>
+        </w:rPr>
+        <w:t xml:space="preserve"> </w:t>
+      </w:r>
+      <w:proofErr w:type="spellStart"/>
+      <w:r>
+        <w:rPr>
+          <w:rFonts w:ascii="Times New Roman" w:hAnsi="Times New Roman" w:cs="Times New Roman"/>
+          <w:b/>
+          <w:bCs/>
+          <w:lang w:val="tr-TR"/>
+        </w:rPr>
+        <w:t>Optimization</w:t>
+      </w:r>
+      <w:proofErr w:type="spellEnd"/>
+    </w:p>
+    <w:p>
+      <w:pPr>
+        <w:rPr>
+          <w:rFonts w:ascii="Times New Roman" w:hAnsi="Times New Roman" w:cs="Times New Roman"/>
+        </w:rPr>
+      </w:pPr>
+      <w:r>
+        <w:rPr>
+          <w:rFonts w:ascii="Times New Roman" w:hAnsi="Times New Roman" w:cs="Times New Roman"/>
+        </w:rPr>
+        <w:t xml:space="preserve">To improve learning stability, the original episodic update strategy was replaced with a 20-step bootstrapping approach. Additional experiments investigated different learning rates and entropy coefficients. A learning rate of 3×10⁻⁴ provided the best convergence </w:t>
+      </w:r>
+      <w:proofErr w:type="spellStart"/>
+      <w:r>
+        <w:rPr>
+          <w:rFonts w:ascii="Times New Roman" w:hAnsi="Times New Roman" w:cs="Times New Roman"/>
+        </w:rPr>
+        <w:t>behaviour</w:t>
+      </w:r>
+      <w:proofErr w:type="spellEnd"/>
+      <w:r>
+        <w:rPr>
+          <w:rFonts w:ascii="Times New Roman" w:hAnsi="Times New Roman" w:cs="Times New Roman"/>
+        </w:rPr>
+        <w:t>, whereas increasing the entropy coefficient from 0.01 to 0.05 introduced excessive exploration and substantially degraded performance.</w:t>
+      </w:r>
+    </w:p>
+    <w:p>
+      <w:pPr>
+        <w:rPr>
+          <w:rFonts w:ascii="Times New Roman" w:hAnsi="Times New Roman" w:cs="Times New Roman"/>
+          <w:lang w:val="tr-TR"/>
+        </w:rPr>
+      </w:pPr>
+      <w:proofErr w:type="spellStart"/>
+      <w:r>
+        <w:rPr>
+          <w:rFonts w:ascii="Times New Roman" w:hAnsi="Times New Roman" w:cs="Times New Roman"/>
+          <w:lang w:val="tr-TR"/>
+        </w:rPr>
+        <w:t>Experimental</w:t>
+      </w:r>
+      <w:proofErr w:type="spellEnd"/>
+      <w:r>
+        <w:rPr>
+          <w:rFonts w:ascii="Times New Roman" w:hAnsi="Times New Roman" w:cs="Times New Roman"/>
+          <w:lang w:val="tr-TR"/>
+        </w:rPr>
+        <w:t xml:space="preserve"> </w:t>
+      </w:r>
+      <w:proofErr w:type="spellStart"/>
+      <w:r>
+        <w:rPr>
+          <w:rFonts w:ascii="Times New Roman" w:hAnsi="Times New Roman" w:cs="Times New Roman"/>
+          <w:lang w:val="tr-TR"/>
+        </w:rPr>
+        <w:t>Results</w:t>
+      </w:r>
+      <w:proofErr w:type="spellEnd"/>
+    </w:p>
+    <w:tbl>
+      <w:tblPr>
+        <w:tblW w:w="0" w:type="auto"/>
+        <w:tblCellSpacing w:w="15" w:type="dxa"/>
+        <w:tblCellMar>
+          <w:top w:w="15" w:type="dxa"/>
+          <w:left w:w="15" w:type="dxa"/>
+          <w:bottom w:w="15" w:type="dxa"/>
+          <w:right w:w="15" w:type="dxa"/>
+        </w:tblCellMar>
+        <w:tblLook w:val="04A0" w:firstRow="1" w:lastRow="0" w:firstColumn="1" w:lastColumn="0" w:noHBand="0" w:noVBand="1"/>
+      </w:tblPr>
+      <w:tblGrid>
+        <w:gridCol w:w="1458"/>
+        <w:gridCol w:w="1858"/>
+      </w:tblGrid>
+      <w:tr>
+        <w:trPr>
+          <w:tblHeader/>
+          <w:tblCellSpacing w:w="15" w:type="dxa"/>
+        </w:trPr>
+        <w:tc>
+          <w:tcPr>
+            <w:tcW w:w="0" w:type="auto"/>
+            <w:vAlign w:val="center"/>
+            <w:hideMark/>
+          </w:tcPr>
+          <w:p>
+            <w:pPr>
+              <w:rPr>
+                <w:rFonts w:ascii="Times New Roman" w:hAnsi="Times New Roman" w:cs="Times New Roman"/>
+                <w:b/>
+                <w:bCs/>
+                <w:lang w:val="tr-TR"/>
+              </w:rPr>
+            </w:pPr>
+            <w:proofErr w:type="spellStart"/>
+            <w:r>
+              <w:rPr>
+                <w:rFonts w:ascii="Times New Roman" w:hAnsi="Times New Roman" w:cs="Times New Roman"/>
+                <w:b/>
+                <w:bCs/>
+                <w:lang w:val="tr-TR"/>
+              </w:rPr>
+              <w:t>Metric</w:t>
+            </w:r>
+            <w:proofErr w:type="spellEnd"/>
+          </w:p>
+        </w:tc>
+        <w:tc>
+          <w:tcPr>
+            <w:tcW w:w="0" w:type="auto"/>
+            <w:vAlign w:val="center"/>
+            <w:hideMark/>
+          </w:tcPr>
+          <w:p>
+            <w:pPr>
+              <w:rPr>
+                <w:rFonts w:ascii="Times New Roman" w:hAnsi="Times New Roman" w:cs="Times New Roman"/>
+                <w:b/>
+                <w:bCs/>
+                <w:lang w:val="tr-TR"/>
+              </w:rPr>
+            </w:pPr>
+            <w:proofErr w:type="spellStart"/>
+            <w:r>
+              <w:rPr>
+                <w:rFonts w:ascii="Times New Roman" w:hAnsi="Times New Roman" w:cs="Times New Roman"/>
+                <w:b/>
+                <w:bCs/>
+                <w:lang w:val="tr-TR"/>
+              </w:rPr>
+              <w:t>Masked</w:t>
+            </w:r>
+            <w:proofErr w:type="spellEnd"/>
+            <w:r>
+              <w:rPr>
+                <w:rFonts w:ascii="Times New Roman" w:hAnsi="Times New Roman" w:cs="Times New Roman"/>
+                <w:b/>
+                <w:bCs/>
+                <w:lang w:val="tr-TR"/>
+              </w:rPr>
+              <w:t xml:space="preserve"> </w:t>
+            </w:r>
+            <w:proofErr w:type="spellStart"/>
+            <w:r>
+              <w:rPr>
+                <w:rFonts w:ascii="Times New Roman" w:hAnsi="Times New Roman" w:cs="Times New Roman"/>
+                <w:b/>
+                <w:bCs/>
+                <w:lang w:val="tr-TR"/>
+              </w:rPr>
+              <w:t>Actor-Critic</w:t>
+            </w:r>
+            <w:proofErr w:type="spellEnd"/>
+          </w:p>
+        </w:tc>
+      </w:tr>
+      <w:tr>
+        <w:trPr>
+          <w:tblCellSpacing w:w="15" w:type="dxa"/>
+        </w:trPr>
+        <w:tc>
+          <w:tcPr>
+            <w:tcW w:w="0" w:type="auto"/>
+            <w:vAlign w:val="center"/>
+            <w:hideMark/>
+          </w:tcPr>
+          <w:p>
+            <w:pPr>
+              <w:rPr>
+                <w:rFonts w:ascii="Times New Roman" w:hAnsi="Times New Roman" w:cs="Times New Roman"/>
+                <w:lang w:val="tr-TR"/>
+              </w:rPr>
+            </w:pPr>
+            <w:proofErr w:type="spellStart"/>
+            <w:r>
+              <w:rPr>
+                <w:rFonts w:ascii="Times New Roman" w:hAnsi="Times New Roman" w:cs="Times New Roman"/>
+                <w:lang w:val="tr-TR"/>
+              </w:rPr>
+              <w:t>Cost</w:t>
+            </w:r>
+            <w:proofErr w:type="spellEnd"/>
+            <w:r>
+              <w:rPr>
+                <w:rFonts w:ascii="Times New Roman" w:hAnsi="Times New Roman" w:cs="Times New Roman"/>
+                <w:lang w:val="tr-TR"/>
+              </w:rPr>
+              <w:t xml:space="preserve"> </w:t>
+            </w:r>
+            <w:proofErr w:type="spellStart"/>
+            <w:r>
+              <w:rPr>
+                <w:rFonts w:ascii="Times New Roman" w:hAnsi="Times New Roman" w:cs="Times New Roman"/>
+                <w:lang w:val="tr-TR"/>
+              </w:rPr>
+              <w:t>per</w:t>
+            </w:r>
+            <w:proofErr w:type="spellEnd"/>
+            <w:r>
+              <w:rPr>
+                <w:rFonts w:ascii="Times New Roman" w:hAnsi="Times New Roman" w:cs="Times New Roman"/>
+                <w:lang w:val="tr-TR"/>
+              </w:rPr>
+              <w:t xml:space="preserve"> </w:t>
+            </w:r>
+            <w:proofErr w:type="spellStart"/>
+            <w:r>
+              <w:rPr>
+                <w:rFonts w:ascii="Times New Roman" w:hAnsi="Times New Roman" w:cs="Times New Roman"/>
+                <w:lang w:val="tr-TR"/>
+              </w:rPr>
+              <w:t>Order</w:t>
+            </w:r>
+            <w:proofErr w:type="spellEnd"/>
+          </w:p>
+        </w:tc>
+        <w:tc>
+          <w:tcPr>
+            <w:tcW w:w="0" w:type="auto"/>
+            <w:vAlign w:val="center"/>
+            <w:hideMark/>
+          </w:tcPr>
+          <w:p>
+            <w:pPr>
+              <w:rPr>
+                <w:rFonts w:ascii="Times New Roman" w:hAnsi="Times New Roman" w:cs="Times New Roman"/>
+                <w:lang w:val="tr-TR"/>
+              </w:rPr>
+            </w:pPr>
+            <w:r>
+              <w:rPr>
+                <w:rFonts w:ascii="Times New Roman" w:hAnsi="Times New Roman" w:cs="Times New Roman"/>
+                <w:lang w:val="tr-TR"/>
+              </w:rPr>
+              <w:t xml:space="preserve">         </w:t>
+            </w:r>
+            <w:r>
+              <w:rPr>
+                <w:rFonts w:ascii="Times New Roman" w:hAnsi="Times New Roman" w:cs="Times New Roman"/>
+                <w:lang w:val="tr-TR"/>
+              </w:rPr>
+              <w:t>18.34</w:t>
+            </w:r>
+          </w:p>
+        </w:tc>
+      </w:tr>
+      <w:tr>
+        <w:trPr>
+          <w:tblCellSpacing w:w="15" w:type="dxa"/>
+        </w:trPr>
+        <w:tc>
+          <w:tcPr>
+            <w:tcW w:w="0" w:type="auto"/>
+            <w:vAlign w:val="center"/>
+            <w:hideMark/>
+          </w:tcPr>
+          <w:p>
+            <w:pPr>
+              <w:rPr>
+                <w:rFonts w:ascii="Times New Roman" w:hAnsi="Times New Roman" w:cs="Times New Roman"/>
+                <w:lang w:val="tr-TR"/>
+              </w:rPr>
+            </w:pPr>
+            <w:proofErr w:type="spellStart"/>
+            <w:r>
+              <w:rPr>
+                <w:rFonts w:ascii="Times New Roman" w:hAnsi="Times New Roman" w:cs="Times New Roman"/>
+                <w:lang w:val="tr-TR"/>
+              </w:rPr>
+              <w:t>Success</w:t>
+            </w:r>
+            <w:proofErr w:type="spellEnd"/>
+            <w:r>
+              <w:rPr>
+                <w:rFonts w:ascii="Times New Roman" w:hAnsi="Times New Roman" w:cs="Times New Roman"/>
+                <w:lang w:val="tr-TR"/>
+              </w:rPr>
+              <w:t xml:space="preserve"> Rate</w:t>
+            </w:r>
+            <w:r>
+              <w:rPr>
+                <w:rFonts w:ascii="Times New Roman" w:hAnsi="Times New Roman" w:cs="Times New Roman"/>
+                <w:lang w:val="tr-TR"/>
+              </w:rPr>
+              <w:t xml:space="preserve">               </w:t>
+            </w:r>
+          </w:p>
+        </w:tc>
+        <w:tc>
+          <w:tcPr>
+            <w:tcW w:w="0" w:type="auto"/>
+            <w:vAlign w:val="center"/>
+            <w:hideMark/>
+          </w:tcPr>
+          <w:p>
+            <w:pPr>
+              <w:rPr>
+                <w:rFonts w:ascii="Times New Roman" w:hAnsi="Times New Roman" w:cs="Times New Roman"/>
+                <w:lang w:val="tr-TR"/>
+              </w:rPr>
+            </w:pPr>
+            <w:r>
+              <w:rPr>
+                <w:rFonts w:ascii="Times New Roman" w:hAnsi="Times New Roman" w:cs="Times New Roman"/>
+                <w:lang w:val="tr-TR"/>
+              </w:rPr>
+              <w:t xml:space="preserve">        </w:t>
+            </w:r>
+            <w:r>
+              <w:rPr>
+                <w:rFonts w:ascii="Times New Roman" w:hAnsi="Times New Roman" w:cs="Times New Roman"/>
+                <w:lang w:val="tr-TR"/>
+              </w:rPr>
+              <w:t>67.87%</w:t>
+            </w:r>
+          </w:p>
+        </w:tc>
+      </w:tr>
+      <w:tr>
+        <w:trPr>
+          <w:tblCellSpacing w:w="15" w:type="dxa"/>
+        </w:trPr>
+        <w:tc>
+          <w:tcPr>
+            <w:tcW w:w="0" w:type="auto"/>
+            <w:vAlign w:val="center"/>
+            <w:hideMark/>
+          </w:tcPr>
+          <w:p>
+            <w:pPr>
+              <w:rPr>
+                <w:rFonts w:ascii="Times New Roman" w:hAnsi="Times New Roman" w:cs="Times New Roman"/>
+                <w:lang w:val="tr-TR"/>
+              </w:rPr>
+            </w:pPr>
+            <w:proofErr w:type="spellStart"/>
+            <w:r>
+              <w:rPr>
+                <w:rFonts w:ascii="Times New Roman" w:hAnsi="Times New Roman" w:cs="Times New Roman"/>
+                <w:lang w:val="tr-TR"/>
+              </w:rPr>
+              <w:t>Delivered</w:t>
+            </w:r>
+            <w:proofErr w:type="spellEnd"/>
+            <w:r>
+              <w:rPr>
+                <w:rFonts w:ascii="Times New Roman" w:hAnsi="Times New Roman" w:cs="Times New Roman"/>
+                <w:lang w:val="tr-TR"/>
+              </w:rPr>
+              <w:t xml:space="preserve"> </w:t>
+            </w:r>
+            <w:proofErr w:type="spellStart"/>
+            <w:r>
+              <w:rPr>
+                <w:rFonts w:ascii="Times New Roman" w:hAnsi="Times New Roman" w:cs="Times New Roman"/>
+                <w:lang w:val="tr-TR"/>
+              </w:rPr>
+              <w:t>Orders</w:t>
+            </w:r>
+            <w:proofErr w:type="spellEnd"/>
+          </w:p>
+        </w:tc>
+        <w:tc>
+          <w:tcPr>
+            <w:tcW w:w="0" w:type="auto"/>
+            <w:vAlign w:val="center"/>
+            <w:hideMark/>
+          </w:tcPr>
+          <w:p>
+            <w:pPr>
+              <w:rPr>
+                <w:rFonts w:ascii="Times New Roman" w:hAnsi="Times New Roman" w:cs="Times New Roman"/>
+                <w:lang w:val="tr-TR"/>
+              </w:rPr>
+            </w:pPr>
+            <w:r>
+              <w:rPr>
+                <w:rFonts w:ascii="Times New Roman" w:hAnsi="Times New Roman" w:cs="Times New Roman"/>
+                <w:lang w:val="tr-TR"/>
+              </w:rPr>
+              <w:t xml:space="preserve">        </w:t>
+            </w:r>
+            <w:r>
+              <w:rPr>
+                <w:rFonts w:ascii="Times New Roman" w:hAnsi="Times New Roman" w:cs="Times New Roman"/>
+                <w:lang w:val="tr-TR"/>
+              </w:rPr>
+              <w:t>38.00</w:t>
+            </w:r>
+          </w:p>
+        </w:tc>
+      </w:tr>
+      <w:tr>
+        <w:trPr>
+          <w:tblCellSpacing w:w="15" w:type="dxa"/>
+        </w:trPr>
+        <w:tc>
+          <w:tcPr>
+            <w:tcW w:w="0" w:type="auto"/>
+            <w:vAlign w:val="center"/>
+            <w:hideMark/>
+          </w:tcPr>
+          <w:p>
+            <w:pPr>
+              <w:rPr>
+                <w:rFonts w:ascii="Times New Roman" w:hAnsi="Times New Roman" w:cs="Times New Roman"/>
+                <w:lang w:val="tr-TR"/>
+              </w:rPr>
+            </w:pPr>
+            <w:proofErr w:type="spellStart"/>
+            <w:r>
+              <w:rPr>
+                <w:rFonts w:ascii="Times New Roman" w:hAnsi="Times New Roman" w:cs="Times New Roman"/>
+                <w:lang w:val="tr-TR"/>
+              </w:rPr>
+              <w:t>Dropped</w:t>
+            </w:r>
+            <w:proofErr w:type="spellEnd"/>
+            <w:r>
+              <w:rPr>
+                <w:rFonts w:ascii="Times New Roman" w:hAnsi="Times New Roman" w:cs="Times New Roman"/>
+                <w:lang w:val="tr-TR"/>
+              </w:rPr>
+              <w:t xml:space="preserve"> </w:t>
+            </w:r>
+            <w:proofErr w:type="spellStart"/>
+            <w:r>
+              <w:rPr>
+                <w:rFonts w:ascii="Times New Roman" w:hAnsi="Times New Roman" w:cs="Times New Roman"/>
+                <w:lang w:val="tr-TR"/>
+              </w:rPr>
+              <w:t>Orders</w:t>
+            </w:r>
+            <w:proofErr w:type="spellEnd"/>
+          </w:p>
+        </w:tc>
+        <w:tc>
+          <w:tcPr>
+            <w:tcW w:w="0" w:type="auto"/>
+            <w:vAlign w:val="center"/>
+            <w:hideMark/>
+          </w:tcPr>
+          <w:p>
+            <w:pPr>
+              <w:rPr>
+                <w:rFonts w:ascii="Times New Roman" w:hAnsi="Times New Roman" w:cs="Times New Roman"/>
+                <w:lang w:val="tr-TR"/>
+              </w:rPr>
+            </w:pPr>
+            <w:r>
+              <w:rPr>
+                <w:rFonts w:ascii="Times New Roman" w:hAnsi="Times New Roman" w:cs="Times New Roman"/>
+                <w:lang w:val="tr-TR"/>
+              </w:rPr>
+              <w:t xml:space="preserve">        </w:t>
+            </w:r>
+            <w:r>
+              <w:rPr>
+                <w:rFonts w:ascii="Times New Roman" w:hAnsi="Times New Roman" w:cs="Times New Roman"/>
+                <w:lang w:val="tr-TR"/>
+              </w:rPr>
+              <w:t>18.33</w:t>
+            </w:r>
+          </w:p>
+        </w:tc>
+      </w:tr>
+      <w:tr>
+        <w:trPr>
+          <w:tblCellSpacing w:w="15" w:type="dxa"/>
+        </w:trPr>
+        <w:tc>
+          <w:tcPr>
+            <w:tcW w:w="0" w:type="auto"/>
+            <w:vAlign w:val="center"/>
+            <w:hideMark/>
+          </w:tcPr>
+          <w:p>
+            <w:pPr>
+              <w:rPr>
+                <w:rFonts w:ascii="Times New Roman" w:hAnsi="Times New Roman" w:cs="Times New Roman"/>
+                <w:lang w:val="tr-TR"/>
+              </w:rPr>
+            </w:pPr>
+            <w:proofErr w:type="spellStart"/>
+            <w:r>
+              <w:rPr>
+                <w:rFonts w:ascii="Times New Roman" w:hAnsi="Times New Roman" w:cs="Times New Roman"/>
+                <w:lang w:val="tr-TR"/>
+              </w:rPr>
+              <w:t>Episode</w:t>
+            </w:r>
+            <w:proofErr w:type="spellEnd"/>
+            <w:r>
+              <w:rPr>
+                <w:rFonts w:ascii="Times New Roman" w:hAnsi="Times New Roman" w:cs="Times New Roman"/>
+                <w:lang w:val="tr-TR"/>
+              </w:rPr>
+              <w:t xml:space="preserve"> Return</w:t>
+            </w:r>
+          </w:p>
+        </w:tc>
+        <w:tc>
+          <w:tcPr>
+            <w:tcW w:w="0" w:type="auto"/>
+            <w:vAlign w:val="center"/>
+            <w:hideMark/>
+          </w:tcPr>
+          <w:p>
+            <w:pPr>
+              <w:rPr>
+                <w:rFonts w:ascii="Times New Roman" w:hAnsi="Times New Roman" w:cs="Times New Roman"/>
+                <w:lang w:val="tr-TR"/>
+              </w:rPr>
+            </w:pPr>
+            <w:r>
+              <w:rPr>
+                <w:rFonts w:ascii="Times New Roman" w:hAnsi="Times New Roman" w:cs="Times New Roman"/>
+                <w:lang w:val="tr-TR"/>
+              </w:rPr>
+              <w:t xml:space="preserve">       </w:t>
+            </w:r>
+            <w:r>
+              <w:rPr>
+                <w:rFonts w:ascii="Times New Roman" w:hAnsi="Times New Roman" w:cs="Times New Roman"/>
+                <w:lang w:val="tr-TR"/>
+              </w:rPr>
+              <w:t>-131.93</w:t>
+            </w:r>
+          </w:p>
+        </w:tc>
+      </w:tr>
+    </w:tbl>
+    <w:p>
+      <w:pPr>
+        <w:rPr>
+          <w:rFonts w:ascii="Times New Roman" w:hAnsi="Times New Roman" w:cs="Times New Roman"/>
+        </w:rPr>
+      </w:pPr>
+      <w:r>
+        <w:rPr>
+          <w:rFonts w:ascii="Times New Roman" w:hAnsi="Times New Roman" w:cs="Times New Roman"/>
+        </w:rPr>
+        <w:t>Although the actor-critic approach did not outperform the improved greedy or behavioral cloning methods, it demonstrates a complete implementation of a masked policy-gradient reinforcement learning framework for constrained drone dispatch problems.</w:t>
+      </w:r>
+    </w:p>
+    <w:p>
+      <w:pPr>
+        <w:rPr>
+          <w:rFonts w:ascii="Times New Roman" w:hAnsi="Times New Roman" w:cs="Times New Roman"/>
+          <w:b/>
+          <w:bCs/>
+          <w:lang w:val="tr-TR"/>
+        </w:rPr>
+      </w:pPr>
+      <w:proofErr w:type="spellStart"/>
+      <w:r>
+        <w:rPr>
+          <w:rFonts w:ascii="Times New Roman" w:hAnsi="Times New Roman" w:cs="Times New Roman"/>
+          <w:b/>
+          <w:bCs/>
+          <w:lang w:val="tr-TR"/>
+        </w:rPr>
+        <w:t>Discussion</w:t>
+      </w:r>
+      <w:proofErr w:type="spellEnd"/>
+    </w:p>
+    <w:p>
+      <w:pPr>
+        <w:rPr>
+          <w:rFonts w:ascii="Times New Roman" w:hAnsi="Times New Roman" w:cs="Times New Roman"/>
+          <w:lang w:val="tr-TR"/>
+        </w:rPr>
+      </w:pPr>
+      <w:r>
+        <w:rPr>
+          <w:rFonts w:ascii="Times New Roman" w:hAnsi="Times New Roman" w:cs="Times New Roman"/>
+        </w:rPr>
+        <w:t>Compared with the initial implementation, introducing 20-step bootstrapping reduced the cost per order from 22.92 to 18.34, demonstrating the benefit of shorter temporal credit assignment. Nevertheless, policy-gradient methods remained less sample-efficient than value-based methods because of the large discrete action space and strict action constraints. The implemented framework provides a solid basis for future extensions such as PPO or other advanced actor-critic algorithms.</w:t>
+      </w:r>
+    </w:p>
+    <w:p>
+      <w:pPr>
+        <w:spacing w:after="80"/>
+        <w:rPr>
+          <w:rFonts w:ascii="Times New Roman" w:hAnsi="Times New Roman" w:cs="Times New Roman"/>
+        </w:rPr>
+      </w:pPr>
+    </w:p>
+    <w:p>
+      <w:pPr>
         <w:pStyle w:val="Balk1"/>
       </w:pPr>
       <w:bookmarkStart w:id="26" w:name="_Toc232764919"/>
       <w:bookmarkStart w:id="27" w:name="_Toc232766578"/>
+    </w:p>
+    <w:p>
+      <w:pPr>
+        <w:pStyle w:val="Balk1"/>
+      </w:pPr>
       <w:r>
         <w:t xml:space="preserve">10. </w:t>
       </w:r>
@@ -10019,7 +11443,6 @@
                 <w:b/>
                 <w:sz w:val="18"/>
               </w:rPr>
-              <w:lastRenderedPageBreak/>
               <w:t>Random</w:t>
             </w:r>
           </w:p>
@@ -11136,6 +12559,7 @@
         <w:rPr>
           <w:rFonts w:ascii="Times New Roman" w:hAnsi="Times New Roman" w:cs="Times New Roman"/>
         </w:rPr>
+        <w:lastRenderedPageBreak/>
         <w:t>Understanding the simulator structure and project requirements.</w:t>
       </w:r>
     </w:p>
@@ -11245,7 +12669,6 @@
         <w:rPr>
           <w:rFonts w:ascii="Times New Roman" w:hAnsi="Times New Roman" w:cs="Times New Roman"/>
         </w:rPr>
-        <w:lastRenderedPageBreak/>
         <w:t xml:space="preserve">All </w:t>
       </w:r>
       <w:proofErr w:type="gramStart"/>
@@ -12875,7 +14298,6 @@
   <w:style w:type="character" w:default="1" w:styleId="VarsaylanParagrafYazTipi">
     <w:name w:val="Default Paragraph Font"/>
     <w:uiPriority w:val="1"/>
-    <w:semiHidden/>
     <w:unhideWhenUsed/>
   </w:style>
   <w:style w:type="table" w:default="1" w:styleId="NormalTablo">

</xml_diff>